<commit_message>
add tasks workspace and marketing updates
</commit_message>
<xml_diff>
--- a/docs/todo-app-strategie-tender-flow.docx
+++ b/docs/todo-app-strategie-tender-flow.docx
@@ -7,7 +7,7 @@
         <w:pStyle w:val="Title"/>
       </w:pPr>
       <w:r>
-        <w:t>Todo aplikace a Tender-Flow</w:t>
+        <w:t>TODO modul v Tender-Flow</w:t>
       </w:r>
     </w:p>
     <w:p>
@@ -15,7 +15,7 @@
         <w:pStyle w:val="Subtitle"/>
       </w:pPr>
       <w:r>
-        <w:t>Mapa nápadu, variant a doporučené cesty k samostatnému todo klientu propojenému s Tender-Flow</w:t>
+        <w:t>Produktová a technická mapa pro personal TODO modul v sidebaru, inspirovaný Todoist a Microsoft To Do</w:t>
       </w:r>
     </w:p>
     <w:p>
@@ -27,7 +27,7 @@
           <w:color w:val="595959"/>
           <w:sz w:val="20"/>
         </w:rPr>
-        <w:t>Verze: pracovní návrh | Datum: 17. 5. 2026 | Určení: produktové a technické rozhodnutí</w:t>
+        <w:t>Verze: aktualizovaný pracovní návrh | Datum: 17. 5. 2026 | Určení: produktové a technické rozhodnutí</w:t>
       </w:r>
     </w:p>
     <w:tbl>
@@ -65,9 +65,8 @@
               <w:rPr>
                 <w:b/>
                 <w:color w:val="205F3C"/>
-                <w:sz w:val="22"/>
               </w:rPr>
-              <w:t>Krátké doporučení</w:t>
+              <w:t>Aktualizované rozhodnutí</w:t>
             </w:r>
           </w:p>
           <w:p>
@@ -75,7 +74,7 @@
               <w:spacing w:after="0" w:line="264" w:lineRule="auto"/>
             </w:pPr>
             <w:r>
-              <w:t>Nezačínat izolovanou Todo aplikací bez společného základu. Tender-Flow už má lehkou task vrstvu, Supabase tabulku tasks, RLS per-user model, UI v Command Center a sync metadata připravená pro externí providery. Nejrozumnější cesta je udělat z toho stabilní task core a nad ním postupně postavit samostatný mobilní/PWA klient.</w:t>
+              <w:t>TODO bude samostatný modul v Tender-Flow sidebaru, podobně jako Správa staveb. Scope je personal: úkol patří konkrétnímu uživateli a není týmově sdílený. Úkoly včetně podúkolů se budou propisovat do Command Center jako osobní akční fronta. Návrh UX má být inspirovaný rychlostí Todoist a jednoduchostí Microsoft To Do.</w:t>
             </w:r>
           </w:p>
         </w:tc>
@@ -87,12 +86,12 @@
         <w:pStyle w:val="Heading1"/>
       </w:pPr>
       <w:r>
-        <w:t>1. Výchozí otázka</w:t>
+        <w:t>1. Produktový záměr</w:t>
       </w:r>
     </w:p>
     <w:p>
       <w:r>
-        <w:t>Cíl není jen vytvořit další seznam úkolů. Cíl je mít osobní a pracovní úkoly dostupné v telefonu, na desktopu i uvnitř Tender-Flow tak, aby se uživatel nemusel rozhodovat, ve které aplikaci úkol vznikl. Zároveň musí být jasné, kde leží zdroj pravdy, jak se řeší synchronizace a jak se zabrání míchání osobních dat s firemními daty.</w:t>
+        <w:t>Cíl je vytvořit plnohodnotný personal TODO modul uvnitř Tender-Flow, ne pouze pomocný quick-add v Command Center. Modul má být samostatně dostupný v hlavním sidebaru, používatelný každý den a současně přirozeně propojený s existujícím pracovním kontextem Tender-Flow.</w:t>
       </w:r>
     </w:p>
     <w:p>
@@ -101,7 +100,7 @@
         <w:spacing w:after="160" w:line="280" w:lineRule="auto"/>
       </w:pPr>
       <w:r>
-        <w:t>Osobní potřeba: rychle zachytit úkol kdykoli, hlavně z telefonu.</w:t>
+        <w:t>Personal scope: každý úkol a podúkol patří konkrétnímu uživateli přes created_by.</w:t>
       </w:r>
     </w:p>
     <w:p>
@@ -110,7 +109,7 @@
         <w:spacing w:after="160" w:line="280" w:lineRule="auto"/>
       </w:pPr>
       <w:r>
-        <w:t>Tender-Flow potřeba: navázat úkoly na projekty, nabídky, dokumenty, smlouvy a Command Center.</w:t>
+        <w:t>Sidebar modul: TODO bude navigační položka na stejné úrovni jako moduly typu Správa staveb.</w:t>
       </w:r>
     </w:p>
     <w:p>
@@ -119,7 +118,7 @@
         <w:spacing w:after="160" w:line="280" w:lineRule="auto"/>
       </w:pPr>
       <w:r>
-        <w:t>Produktová potřeba: nevytvořit dvě aplikace se dvěma rozdílnými modely, které se později budou špatně slučovat.</w:t>
+        <w:t>Command Center: úkoly se propíšou do akční fronty, ale Command Center nebude hlavní místo správy TODO.</w:t>
       </w:r>
     </w:p>
     <w:p>
@@ -128,7 +127,16 @@
         <w:spacing w:after="160" w:line="280" w:lineRule="auto"/>
       </w:pPr>
       <w:r>
-        <w:t>Bezpečnostní potřeba: oddělit osobní a organizační rozsah, vynutit RLS, hlídat tenant isolation a neukládat integrační tokeny do klienta.</w:t>
+        <w:t>Podúkoly: každý úkol může být rozpadnutý na menší kroky, které lze samostatně dokončovat a řadit.</w:t>
+      </w:r>
+    </w:p>
+    <w:p>
+      <w:pPr>
+        <w:pStyle w:val="ListBullet"/>
+        <w:spacing w:after="160" w:line="280" w:lineRule="auto"/>
+      </w:pPr>
+      <w:r>
+        <w:t>UX inspirace: Todoist pro rychlé pořizování, priority a filtry; Microsoft To Do pro přehled Dnes, jednoduchost a plánování.</w:t>
       </w:r>
     </w:p>
     <w:p>
@@ -141,7 +149,7 @@
     </w:p>
     <w:p>
       <w:r>
-        <w:t>V repozitáři už existuje základ, na kterém se dá stavět. To zásadně mění rozhodnutí: nejde o čistě zelenou louku, ale o rozšíření existující doménové vrstvy.</w:t>
+        <w:t>V repozitáři už existuje základ, na kterém se dá stavět. To mění rozhodnutí z čisté zelené louky na rozšíření existující doménové vrstvy.</w:t>
       </w:r>
     </w:p>
     <w:tbl>
@@ -232,7 +240,7 @@
                 <w:b/>
                 <w:color w:val="1F4D78"/>
               </w:rPr>
-              <w:t>Dopad na rozhodnutí</w:t>
+              <w:t>Dopad na návrh</w:t>
             </w:r>
           </w:p>
         </w:tc>
@@ -297,7 +305,7 @@
               <w:jc w:val="left"/>
             </w:pPr>
             <w:r>
-              <w:t>Model je vhodný jako V1 jádro, ale bude potřebovat scope/workspace rozšíření před samostatnou aplikací.</w:t>
+              <w:t>Použít jako V1 personal základ. Doplnit parent/subtask strukturu, sort_order a případně depth guard.</w:t>
             </w:r>
           </w:p>
         </w:tc>
@@ -362,7 +370,7 @@
               <w:jc w:val="left"/>
             </w:pPr>
             <w:r>
-              <w:t>Dobré pro osobní úkoly, ale před team/org režimem musí být jasně navržené organizace a oprávnění.</w:t>
+              <w:t>To odpovídá rozhodnutí personal scope. MVP nemá zavádět týmové/org sdílení úkolů.</w:t>
             </w:r>
           </w:p>
         </w:tc>
@@ -427,7 +435,7 @@
               <w:jc w:val="left"/>
             </w:pPr>
             <w:r>
-              <w:t>Integrace do Tender-Flow už začala. Není nutné vyvíjet úplně separátní UI základ.</w:t>
+              <w:t>Zachovat jako doménový základ, ale doplnit plnohodnotný TODO modul v routingu a sidebaru.</w:t>
             </w:r>
           </w:p>
         </w:tc>
@@ -450,7 +458,7 @@
               <w:jc w:val="center"/>
             </w:pPr>
             <w:r>
-              <w:t>Synchronizace</w:t>
+              <w:t>Command Center</w:t>
             </w:r>
           </w:p>
         </w:tc>
@@ -471,7 +479,7 @@
               <w:jc w:val="left"/>
             </w:pPr>
             <w:r>
-              <w:t>Ve schématu jsou external_id, external_provider, external_url, last_synced_at, sync_status, sync_error.</w:t>
+              <w:t>Action queue už umí kombinovat derivované akce a uživatelské tasky.</w:t>
             </w:r>
           </w:p>
         </w:tc>
@@ -492,7 +500,7 @@
               <w:jc w:val="left"/>
             </w:pPr>
             <w:r>
-              <w:t>Datový model počítá s V2 integrací, ale chybí sync engine, konflikty a token handling.</w:t>
+              <w:t>Command Center bude konzument osobních úkolů a jejich prioritizace, ne primární editor.</w:t>
             </w:r>
           </w:p>
         </w:tc>
@@ -504,16 +512,14 @@
         <w:pStyle w:val="Heading1"/>
       </w:pPr>
       <w:r>
-        <w:t>3. Varianty řešení</w:t>
+        <w:t>3. Rozhodnuté produktové principy</w:t>
       </w:r>
     </w:p>
     <w:tbl>
       <w:tblGrid>
-        <w:gridCol w:w="900"/>
-        <w:gridCol w:w="2450"/>
-        <w:gridCol w:w="2050"/>
-        <w:gridCol w:w="2300"/>
-        <w:gridCol w:w="1660"/>
+        <w:gridCol w:w="1600"/>
+        <w:gridCol w:w="2600"/>
+        <w:gridCol w:w="5160"/>
       </w:tblGrid>
       <w:tblPr>
         <w:tblStyle w:val="TableGrid"/>
@@ -528,7 +534,7 @@
         </w:trPr>
         <w:tc>
           <w:tcPr>
-            <w:tcW w:type="dxa" w:w="900"/>
+            <w:tcW w:type="dxa" w:w="1600"/>
             <w:tcMar>
               <w:top w:w="80" w:type="dxa"/>
               <w:start w:w="120" w:type="dxa"/>
@@ -547,13 +553,13 @@
                 <w:b/>
                 <w:color w:val="1F4D78"/>
               </w:rPr>
-              <w:t>Varianta</w:t>
+              <w:t>Princip</w:t>
             </w:r>
           </w:p>
         </w:tc>
         <w:tc>
           <w:tcPr>
-            <w:tcW w:type="dxa" w:w="2450"/>
+            <w:tcW w:type="dxa" w:w="2600"/>
             <w:tcMar>
               <w:top w:w="80" w:type="dxa"/>
               <w:start w:w="120" w:type="dxa"/>
@@ -572,13 +578,13 @@
                 <w:b/>
                 <w:color w:val="1F4D78"/>
               </w:rPr>
-              <w:t>Popis</w:t>
+              <w:t>Rozhodnutí</w:t>
             </w:r>
           </w:p>
         </w:tc>
         <w:tc>
           <w:tcPr>
-            <w:tcW w:type="dxa" w:w="2050"/>
+            <w:tcW w:type="dxa" w:w="5160"/>
             <w:tcMar>
               <w:top w:w="80" w:type="dxa"/>
               <w:start w:w="120" w:type="dxa"/>
@@ -597,57 +603,7 @@
                 <w:b/>
                 <w:color w:val="1F4D78"/>
               </w:rPr>
-              <w:t>Výhody</w:t>
-            </w:r>
-          </w:p>
-        </w:tc>
-        <w:tc>
-          <w:tcPr>
-            <w:tcW w:type="dxa" w:w="2300"/>
-            <w:tcMar>
-              <w:top w:w="80" w:type="dxa"/>
-              <w:start w:w="120" w:type="dxa"/>
-              <w:bottom w:w="80" w:type="dxa"/>
-              <w:end w:w="120" w:type="dxa"/>
-            </w:tcMar>
-            <w:vAlign w:val="center"/>
-            <w:shd w:fill="F2F4F7"/>
-          </w:tcPr>
-          <w:p>
-            <w:pPr>
-              <w:jc w:val="left"/>
-            </w:pPr>
-            <w:r>
-              <w:rPr>
-                <w:b/>
-                <w:color w:val="1F4D78"/>
-              </w:rPr>
-              <w:t>Rizika</w:t>
-            </w:r>
-          </w:p>
-        </w:tc>
-        <w:tc>
-          <w:tcPr>
-            <w:tcW w:type="dxa" w:w="1660"/>
-            <w:tcMar>
-              <w:top w:w="80" w:type="dxa"/>
-              <w:start w:w="120" w:type="dxa"/>
-              <w:bottom w:w="80" w:type="dxa"/>
-              <w:end w:w="120" w:type="dxa"/>
-            </w:tcMar>
-            <w:vAlign w:val="center"/>
-            <w:shd w:fill="F2F4F7"/>
-          </w:tcPr>
-          <w:p>
-            <w:pPr>
-              <w:jc w:val="center"/>
-            </w:pPr>
-            <w:r>
-              <w:rPr>
-                <w:b/>
-                <w:color w:val="1F4D78"/>
-              </w:rPr>
-              <w:t>Verdikt</w:t>
+              <w:t>Důvod</w:t>
             </w:r>
           </w:p>
         </w:tc>
@@ -655,7 +611,7 @@
       <w:tr>
         <w:tc>
           <w:tcPr>
-            <w:tcW w:type="dxa" w:w="900"/>
+            <w:tcW w:type="dxa" w:w="1600"/>
             <w:tcMar>
               <w:top w:w="80" w:type="dxa"/>
               <w:start w:w="120" w:type="dxa"/>
@@ -670,13 +626,13 @@
               <w:jc w:val="center"/>
             </w:pPr>
             <w:r>
-              <w:t>A</w:t>
+              <w:t>Samostatný modul</w:t>
             </w:r>
           </w:p>
         </w:tc>
         <w:tc>
           <w:tcPr>
-            <w:tcW w:type="dxa" w:w="2450"/>
+            <w:tcW w:type="dxa" w:w="2600"/>
             <w:tcMar>
               <w:top w:w="80" w:type="dxa"/>
               <w:start w:w="120" w:type="dxa"/>
@@ -691,13 +647,13 @@
               <w:jc w:val="left"/>
             </w:pPr>
             <w:r>
-              <w:t>Jen rozšířit Tender-Flow o lepší task modul.</w:t>
+              <w:t>TODO bude vlastní feature modul v sidebaru.</w:t>
             </w:r>
           </w:p>
         </w:tc>
         <w:tc>
           <w:tcPr>
-            <w:tcW w:type="dxa" w:w="2050"/>
+            <w:tcW w:type="dxa" w:w="5160"/>
             <w:tcMar>
               <w:top w:w="80" w:type="dxa"/>
               <w:start w:w="120" w:type="dxa"/>
@@ -712,13 +668,36 @@
               <w:jc w:val="left"/>
             </w:pPr>
             <w:r>
-              <w:t>Nejrychlejší, navazuje na existující kód, minimum sync komplexity.</w:t>
+              <w:t>Uživatel potřebuje plnou správu, pohledy, filtry, detail a podúkoly.</w:t>
+            </w:r>
+          </w:p>
+        </w:tc>
+      </w:tr>
+      <w:tr>
+        <w:tc>
+          <w:tcPr>
+            <w:tcW w:type="dxa" w:w="1600"/>
+            <w:tcMar>
+              <w:top w:w="80" w:type="dxa"/>
+              <w:start w:w="120" w:type="dxa"/>
+              <w:bottom w:w="80" w:type="dxa"/>
+              <w:end w:w="120" w:type="dxa"/>
+            </w:tcMar>
+            <w:vAlign w:val="center"/>
+          </w:tcPr>
+          <w:p>
+            <w:pPr>
+              <w:spacing w:after="0" w:line="264" w:lineRule="auto"/>
+              <w:jc w:val="center"/>
+            </w:pPr>
+            <w:r>
+              <w:t>Personal scope</w:t>
             </w:r>
           </w:p>
         </w:tc>
         <w:tc>
           <w:tcPr>
-            <w:tcW w:type="dxa" w:w="2300"/>
+            <w:tcW w:type="dxa" w:w="2600"/>
             <w:tcMar>
               <w:top w:w="80" w:type="dxa"/>
               <w:start w:w="120" w:type="dxa"/>
@@ -733,13 +712,36 @@
               <w:jc w:val="left"/>
             </w:pPr>
             <w:r>
-              <w:t>Telefonní použití může být slabé, pokud zůstane jen web/desktop workflow.</w:t>
+              <w:t>Úkoly nejsou týmové ani organizační.</w:t>
             </w:r>
           </w:p>
         </w:tc>
         <w:tc>
           <w:tcPr>
-            <w:tcW w:type="dxa" w:w="1660"/>
+            <w:tcW w:type="dxa" w:w="5160"/>
+            <w:tcMar>
+              <w:top w:w="80" w:type="dxa"/>
+              <w:start w:w="120" w:type="dxa"/>
+              <w:bottom w:w="80" w:type="dxa"/>
+              <w:end w:w="120" w:type="dxa"/>
+            </w:tcMar>
+            <w:vAlign w:val="center"/>
+          </w:tcPr>
+          <w:p>
+            <w:pPr>
+              <w:spacing w:after="0" w:line="264" w:lineRule="auto"/>
+              <w:jc w:val="left"/>
+            </w:pPr>
+            <w:r>
+              <w:t>Snižuje bezpečnostní riziko a odpovídá osobnímu způsobu práce.</w:t>
+            </w:r>
+          </w:p>
+        </w:tc>
+      </w:tr>
+      <w:tr>
+        <w:tc>
+          <w:tcPr>
+            <w:tcW w:type="dxa" w:w="1600"/>
             <w:tcMar>
               <w:top w:w="80" w:type="dxa"/>
               <w:start w:w="120" w:type="dxa"/>
@@ -754,7 +756,49 @@
               <w:jc w:val="center"/>
             </w:pPr>
             <w:r>
-              <w:t>Dobré jako první krok.</w:t>
+              <w:t>Command Center props</w:t>
+            </w:r>
+          </w:p>
+        </w:tc>
+        <w:tc>
+          <w:tcPr>
+            <w:tcW w:type="dxa" w:w="2600"/>
+            <w:tcMar>
+              <w:top w:w="80" w:type="dxa"/>
+              <w:start w:w="120" w:type="dxa"/>
+              <w:bottom w:w="80" w:type="dxa"/>
+              <w:end w:w="120" w:type="dxa"/>
+            </w:tcMar>
+            <w:vAlign w:val="center"/>
+          </w:tcPr>
+          <w:p>
+            <w:pPr>
+              <w:spacing w:after="0" w:line="264" w:lineRule="auto"/>
+              <w:jc w:val="left"/>
+            </w:pPr>
+            <w:r>
+              <w:t>Otevřené relevantní úkoly se zobrazí v Command Center.</w:t>
+            </w:r>
+          </w:p>
+        </w:tc>
+        <w:tc>
+          <w:tcPr>
+            <w:tcW w:type="dxa" w:w="5160"/>
+            <w:tcMar>
+              <w:top w:w="80" w:type="dxa"/>
+              <w:start w:w="120" w:type="dxa"/>
+              <w:bottom w:w="80" w:type="dxa"/>
+              <w:end w:w="120" w:type="dxa"/>
+            </w:tcMar>
+            <w:vAlign w:val="center"/>
+          </w:tcPr>
+          <w:p>
+            <w:pPr>
+              <w:spacing w:after="0" w:line="264" w:lineRule="auto"/>
+              <w:jc w:val="left"/>
+            </w:pPr>
+            <w:r>
+              <w:t>Command Center má agregovat, co dnes vyžaduje akci.</w:t>
             </w:r>
           </w:p>
         </w:tc>
@@ -762,7 +806,7 @@
       <w:tr>
         <w:tc>
           <w:tcPr>
-            <w:tcW w:type="dxa" w:w="900"/>
+            <w:tcW w:type="dxa" w:w="1600"/>
             <w:tcMar>
               <w:top w:w="80" w:type="dxa"/>
               <w:start w:w="120" w:type="dxa"/>
@@ -777,13 +821,13 @@
               <w:jc w:val="center"/>
             </w:pPr>
             <w:r>
-              <w:t>B</w:t>
+              <w:t>Podúkoly</w:t>
             </w:r>
           </w:p>
         </w:tc>
         <w:tc>
           <w:tcPr>
-            <w:tcW w:type="dxa" w:w="2450"/>
+            <w:tcW w:type="dxa" w:w="2600"/>
             <w:tcMar>
               <w:top w:w="80" w:type="dxa"/>
               <w:start w:w="120" w:type="dxa"/>
@@ -798,13 +842,13 @@
               <w:jc w:val="left"/>
             </w:pPr>
             <w:r>
-              <w:t>Samostatná Todo aplikace nad stejným task core.</w:t>
+              <w:t>Podúkoly jsou součást modelu MVP, ne budoucí nice-to-have.</w:t>
             </w:r>
           </w:p>
         </w:tc>
         <w:tc>
           <w:tcPr>
-            <w:tcW w:type="dxa" w:w="2050"/>
+            <w:tcW w:type="dxa" w:w="5160"/>
             <w:tcMar>
               <w:top w:w="80" w:type="dxa"/>
               <w:start w:w="120" w:type="dxa"/>
@@ -819,13 +863,36 @@
               <w:jc w:val="left"/>
             </w:pPr>
             <w:r>
-              <w:t>Jedno backendové jádro, různé klienty, čistá cesta k mobilu.</w:t>
+              <w:t>Bez podúkolů modul nebude dostatečně silný pro reálné pracovní úkoly.</w:t>
+            </w:r>
+          </w:p>
+        </w:tc>
+      </w:tr>
+      <w:tr>
+        <w:tc>
+          <w:tcPr>
+            <w:tcW w:type="dxa" w:w="1600"/>
+            <w:tcMar>
+              <w:top w:w="80" w:type="dxa"/>
+              <w:start w:w="120" w:type="dxa"/>
+              <w:bottom w:w="80" w:type="dxa"/>
+              <w:end w:w="120" w:type="dxa"/>
+            </w:tcMar>
+            <w:vAlign w:val="center"/>
+          </w:tcPr>
+          <w:p>
+            <w:pPr>
+              <w:spacing w:after="0" w:line="264" w:lineRule="auto"/>
+              <w:jc w:val="center"/>
+            </w:pPr>
+            <w:r>
+              <w:t>Inspirace, ne kopie</w:t>
             </w:r>
           </w:p>
         </w:tc>
         <w:tc>
           <w:tcPr>
-            <w:tcW w:type="dxa" w:w="2300"/>
+            <w:tcW w:type="dxa" w:w="2600"/>
             <w:tcMar>
               <w:top w:w="80" w:type="dxa"/>
               <w:start w:w="120" w:type="dxa"/>
@@ -840,57 +907,13 @@
               <w:jc w:val="left"/>
             </w:pPr>
             <w:r>
-              <w:t>Vyžaduje pečlivý scope model, auth a sync kontrakty.</w:t>
+              <w:t>UX bere vzory z Todoist/Microsoft To Do, ale drží Tender-Flow kontext.</w:t>
             </w:r>
           </w:p>
         </w:tc>
         <w:tc>
           <w:tcPr>
-            <w:tcW w:type="dxa" w:w="1660"/>
-            <w:tcMar>
-              <w:top w:w="80" w:type="dxa"/>
-              <w:start w:w="120" w:type="dxa"/>
-              <w:bottom w:w="80" w:type="dxa"/>
-              <w:end w:w="120" w:type="dxa"/>
-            </w:tcMar>
-            <w:vAlign w:val="center"/>
-          </w:tcPr>
-          <w:p>
-            <w:pPr>
-              <w:spacing w:after="0" w:line="264" w:lineRule="auto"/>
-              <w:jc w:val="center"/>
-            </w:pPr>
-            <w:r>
-              <w:t>Doporučená hlavní cesta.</w:t>
-            </w:r>
-          </w:p>
-        </w:tc>
-      </w:tr>
-      <w:tr>
-        <w:tc>
-          <w:tcPr>
-            <w:tcW w:type="dxa" w:w="900"/>
-            <w:tcMar>
-              <w:top w:w="80" w:type="dxa"/>
-              <w:start w:w="120" w:type="dxa"/>
-              <w:bottom w:w="80" w:type="dxa"/>
-              <w:end w:w="120" w:type="dxa"/>
-            </w:tcMar>
-            <w:vAlign w:val="center"/>
-          </w:tcPr>
-          <w:p>
-            <w:pPr>
-              <w:spacing w:after="0" w:line="264" w:lineRule="auto"/>
-              <w:jc w:val="center"/>
-            </w:pPr>
-            <w:r>
-              <w:t>C</w:t>
-            </w:r>
-          </w:p>
-        </w:tc>
-        <w:tc>
-          <w:tcPr>
-            <w:tcW w:type="dxa" w:w="2450"/>
+            <w:tcW w:type="dxa" w:w="5160"/>
             <w:tcMar>
               <w:top w:w="80" w:type="dxa"/>
               <w:start w:w="120" w:type="dxa"/>
@@ -905,177 +928,7 @@
               <w:jc w:val="left"/>
             </w:pPr>
             <w:r>
-              <w:t>Napojit Tender-Flow jen na externí Todoist/Microsoft To Do/Apple Reminders.</w:t>
-            </w:r>
-          </w:p>
-        </w:tc>
-        <w:tc>
-          <w:tcPr>
-            <w:tcW w:type="dxa" w:w="2050"/>
-            <w:tcMar>
-              <w:top w:w="80" w:type="dxa"/>
-              <w:start w:w="120" w:type="dxa"/>
-              <w:bottom w:w="80" w:type="dxa"/>
-              <w:end w:w="120" w:type="dxa"/>
-            </w:tcMar>
-            <w:vAlign w:val="center"/>
-          </w:tcPr>
-          <w:p>
-            <w:pPr>
-              <w:spacing w:after="0" w:line="264" w:lineRule="auto"/>
-              <w:jc w:val="left"/>
-            </w:pPr>
-            <w:r>
-              <w:t>Rychlá adopce existujících návyků uživatele.</w:t>
-            </w:r>
-          </w:p>
-        </w:tc>
-        <w:tc>
-          <w:tcPr>
-            <w:tcW w:type="dxa" w:w="2300"/>
-            <w:tcMar>
-              <w:top w:w="80" w:type="dxa"/>
-              <w:start w:w="120" w:type="dxa"/>
-              <w:bottom w:w="80" w:type="dxa"/>
-              <w:end w:w="120" w:type="dxa"/>
-            </w:tcMar>
-            <w:vAlign w:val="center"/>
-          </w:tcPr>
-          <w:p>
-            <w:pPr>
-              <w:spacing w:after="0" w:line="264" w:lineRule="auto"/>
-              <w:jc w:val="left"/>
-            </w:pPr>
-            <w:r>
-              <w:t>Vendor lock-in, OAuth/token bezpečnost, konflikty a limity API.</w:t>
-            </w:r>
-          </w:p>
-        </w:tc>
-        <w:tc>
-          <w:tcPr>
-            <w:tcW w:type="dxa" w:w="1660"/>
-            <w:tcMar>
-              <w:top w:w="80" w:type="dxa"/>
-              <w:start w:w="120" w:type="dxa"/>
-              <w:bottom w:w="80" w:type="dxa"/>
-              <w:end w:w="120" w:type="dxa"/>
-            </w:tcMar>
-            <w:vAlign w:val="center"/>
-          </w:tcPr>
-          <w:p>
-            <w:pPr>
-              <w:spacing w:after="0" w:line="264" w:lineRule="auto"/>
-              <w:jc w:val="center"/>
-            </w:pPr>
-            <w:r>
-              <w:t>Až jako konektorová vrstva V2/V3.</w:t>
-            </w:r>
-          </w:p>
-        </w:tc>
-      </w:tr>
-      <w:tr>
-        <w:tc>
-          <w:tcPr>
-            <w:tcW w:type="dxa" w:w="900"/>
-            <w:tcMar>
-              <w:top w:w="80" w:type="dxa"/>
-              <w:start w:w="120" w:type="dxa"/>
-              <w:bottom w:w="80" w:type="dxa"/>
-              <w:end w:w="120" w:type="dxa"/>
-            </w:tcMar>
-            <w:vAlign w:val="center"/>
-          </w:tcPr>
-          <w:p>
-            <w:pPr>
-              <w:spacing w:after="0" w:line="264" w:lineRule="auto"/>
-              <w:jc w:val="center"/>
-            </w:pPr>
-            <w:r>
-              <w:t>D</w:t>
-            </w:r>
-          </w:p>
-        </w:tc>
-        <w:tc>
-          <w:tcPr>
-            <w:tcW w:type="dxa" w:w="2450"/>
-            <w:tcMar>
-              <w:top w:w="80" w:type="dxa"/>
-              <w:start w:w="120" w:type="dxa"/>
-              <w:bottom w:w="80" w:type="dxa"/>
-              <w:end w:w="120" w:type="dxa"/>
-            </w:tcMar>
-            <w:vAlign w:val="center"/>
-          </w:tcPr>
-          <w:p>
-            <w:pPr>
-              <w:spacing w:after="0" w:line="264" w:lineRule="auto"/>
-              <w:jc w:val="left"/>
-            </w:pPr>
-            <w:r>
-              <w:t>Úplně nová nativní mobilní aplikace od nuly.</w:t>
-            </w:r>
-          </w:p>
-        </w:tc>
-        <w:tc>
-          <w:tcPr>
-            <w:tcW w:type="dxa" w:w="2050"/>
-            <w:tcMar>
-              <w:top w:w="80" w:type="dxa"/>
-              <w:start w:w="120" w:type="dxa"/>
-              <w:bottom w:w="80" w:type="dxa"/>
-              <w:end w:w="120" w:type="dxa"/>
-            </w:tcMar>
-            <w:vAlign w:val="center"/>
-          </w:tcPr>
-          <w:p>
-            <w:pPr>
-              <w:spacing w:after="0" w:line="264" w:lineRule="auto"/>
-              <w:jc w:val="left"/>
-            </w:pPr>
-            <w:r>
-              <w:t>Nejlepší UX v telefonu.</w:t>
-            </w:r>
-          </w:p>
-        </w:tc>
-        <w:tc>
-          <w:tcPr>
-            <w:tcW w:type="dxa" w:w="2300"/>
-            <w:tcMar>
-              <w:top w:w="80" w:type="dxa"/>
-              <w:start w:w="120" w:type="dxa"/>
-              <w:bottom w:w="80" w:type="dxa"/>
-              <w:end w:w="120" w:type="dxa"/>
-            </w:tcMar>
-            <w:vAlign w:val="center"/>
-          </w:tcPr>
-          <w:p>
-            <w:pPr>
-              <w:spacing w:after="0" w:line="264" w:lineRule="auto"/>
-              <w:jc w:val="left"/>
-            </w:pPr>
-            <w:r>
-              <w:t>Nejvyšší cena, duplicita domény, riziko odtržení od Tender-Flow.</w:t>
-            </w:r>
-          </w:p>
-        </w:tc>
-        <w:tc>
-          <w:tcPr>
-            <w:tcW w:type="dxa" w:w="1660"/>
-            <w:tcMar>
-              <w:top w:w="80" w:type="dxa"/>
-              <w:start w:w="120" w:type="dxa"/>
-              <w:bottom w:w="80" w:type="dxa"/>
-              <w:end w:w="120" w:type="dxa"/>
-            </w:tcMar>
-            <w:vAlign w:val="center"/>
-          </w:tcPr>
-          <w:p>
-            <w:pPr>
-              <w:spacing w:after="0" w:line="264" w:lineRule="auto"/>
-              <w:jc w:val="center"/>
-            </w:pPr>
-            <w:r>
-              <w:t>Až po ověření PWA/standalone klienta.</w:t>
+              <w:t>Cílem je známý mentální model bez vendor lock-inu.</w:t>
             </w:r>
           </w:p>
         </w:tc>
@@ -1117,9 +970,8 @@
               <w:rPr>
                 <w:b/>
                 <w:color w:val="205F3C"/>
-                <w:sz w:val="22"/>
               </w:rPr>
-              <w:t>Rozhodnutí</w:t>
+              <w:t>Doporučení</w:t>
             </w:r>
           </w:p>
           <w:p>
@@ -1127,7 +979,7 @@
               <w:spacing w:after="0" w:line="264" w:lineRule="auto"/>
             </w:pPr>
             <w:r>
-              <w:t>Vybrat variantu B jako cílovou architekturu, ale začít variantou A: nejdřív zpevnit task modul v Tender-Flow, potom z něj udělat sdílený task core a až následně vytvořit samostatný klient optimalizovaný pro telefon.</w:t>
+              <w:t>První implementační slice má být: sidebar položka TODO, Inbox, Dnes, Nadcházející, detail úkolu, podúkoly a props otevřených úkolů do Command Center. Externí synchronizace a samostatná mobilní aplikace patří až do dalších fází.</w:t>
             </w:r>
           </w:p>
         </w:tc>
@@ -1139,7 +991,7 @@
         <w:pStyle w:val="Heading1"/>
       </w:pPr>
       <w:r>
-        <w:t>4. Doporučená produktová koncepce</w:t>
+        <w:t>4. UX koncept modulu</w:t>
       </w:r>
     </w:p>
     <w:p>
@@ -1147,61 +999,7 @@
         <w:pStyle w:val="Heading2"/>
       </w:pPr>
       <w:r>
-        <w:t>4.1 Jeden task core, více klientů</w:t>
-      </w:r>
-    </w:p>
-    <w:p>
-      <w:r>
-        <w:t>Základ má být společná doména úkolů. Tender-Flow, samostatná Todo aplikace, desktop a případné externí konektory nemají mít vlastní nezávislé modely. Mají používat jeden kontrakt pro task, jednu API vrstvu a jeden bezpečnostní model.</w:t>
-      </w:r>
-    </w:p>
-    <w:p>
-      <w:pPr>
-        <w:pStyle w:val="ListNumber"/>
-        <w:spacing w:after="160" w:line="280" w:lineRule="auto"/>
-      </w:pPr>
-      <w:r>
-        <w:t>Task core v Tender-Flow: správa dat, typy, validace, RLS, query/mutation hooks, základní UI.</w:t>
-      </w:r>
-    </w:p>
-    <w:p>
-      <w:pPr>
-        <w:pStyle w:val="ListNumber"/>
-        <w:spacing w:after="160" w:line="280" w:lineRule="auto"/>
-      </w:pPr>
-      <w:r>
-        <w:t>Tender-Flow klient: úkoly svázané s projektem, nabídkou, dokumentem, smlouvou a Command Center.</w:t>
-      </w:r>
-    </w:p>
-    <w:p>
-      <w:pPr>
-        <w:pStyle w:val="ListNumber"/>
-        <w:spacing w:after="160" w:line="280" w:lineRule="auto"/>
-      </w:pPr>
-      <w:r>
-        <w:t>Solo Todo klient: rychlý inbox, dnes, plán, priority, offline-first použití v telefonu.</w:t>
-      </w:r>
-    </w:p>
-    <w:p>
-      <w:pPr>
-        <w:pStyle w:val="ListNumber"/>
-        <w:spacing w:after="160" w:line="280" w:lineRule="auto"/>
-      </w:pPr>
-      <w:r>
-        <w:t>Sync/konektory: externí providery až po stabilizaci vlastního jádra.</w:t>
-      </w:r>
-    </w:p>
-    <w:p>
-      <w:pPr>
-        <w:pStyle w:val="Heading2"/>
-      </w:pPr>
-      <w:r>
-        <w:t>4.2 Osobní versus pracovní režim</w:t>
-      </w:r>
-    </w:p>
-    <w:p>
-      <w:r>
-        <w:t>Klíčové produktové pravidlo: osobní úkol a firemní úkol nesmí být jen rozdíl v UI. Musí být rozdíl v datovém rozsahu, oprávnění a auditovatelnosti.</w:t>
+        <w:t>4.1 Navigace a pohledy</w:t>
       </w:r>
     </w:p>
     <w:p>
@@ -1210,7 +1008,7 @@
         <w:spacing w:after="160" w:line="280" w:lineRule="auto"/>
       </w:pPr>
       <w:r>
-        <w:t>Personal scope: úkol patří konkrétnímu uživateli, typicky bez organization_id.</w:t>
+        <w:t>Inbox: rychlý záchyt úkolů bez termínu a bez vazby na projekt.</w:t>
       </w:r>
     </w:p>
     <w:p>
@@ -1219,7 +1017,7 @@
         <w:spacing w:after="160" w:line="280" w:lineRule="auto"/>
       </w:pPr>
       <w:r>
-        <w:t>Workspace/organization scope: úkol patří organizaci, může být přiřazen uživateli a viditelný podle role.</w:t>
+        <w:t>Dnes: úkoly s dnešním termínem a ručně připnuté úkoly pro dnešní práci.</w:t>
       </w:r>
     </w:p>
     <w:p>
@@ -1228,7 +1026,7 @@
         <w:spacing w:after="160" w:line="280" w:lineRule="auto"/>
       </w:pPr>
       <w:r>
-        <w:t>Tender context: volitelný odkaz na project_id a related_entity, aby se úkol zobrazil v kontextu tendru.</w:t>
+        <w:t>Nadcházející: časová osa podle due_at, podobně jako plán v Todoist/Microsoft To Do.</w:t>
       </w:r>
     </w:p>
     <w:p>
@@ -1237,7 +1035,69 @@
         <w:spacing w:after="160" w:line="280" w:lineRule="auto"/>
       </w:pPr>
       <w:r>
-        <w:t>Inbox: rychlý záchyt bez kontextu, později lze přiřadit projekt, termín, prioritu nebo organizaci.</w:t>
+        <w:t>Důležité: prioritní úkoly, hvězdička nebo priorita P1/P2.</w:t>
+      </w:r>
+    </w:p>
+    <w:p>
+      <w:pPr>
+        <w:pStyle w:val="ListBullet"/>
+        <w:spacing w:after="160" w:line="280" w:lineRule="auto"/>
+      </w:pPr>
+      <w:r>
+        <w:t>Hotovo: dokončené úkoly s možností znovuotevření.</w:t>
+      </w:r>
+    </w:p>
+    <w:p>
+      <w:pPr>
+        <w:pStyle w:val="ListBullet"/>
+        <w:spacing w:after="160" w:line="280" w:lineRule="auto"/>
+      </w:pPr>
+      <w:r>
+        <w:t>Kontext Tender-Flow: filtr podle project_id a related_entity, aniž by se změnilo personal vlastnictví.</w:t>
+      </w:r>
+    </w:p>
+    <w:p>
+      <w:pPr>
+        <w:pStyle w:val="Heading2"/>
+      </w:pPr>
+      <w:r>
+        <w:t>4.2 Detail úkolu</w:t>
+      </w:r>
+    </w:p>
+    <w:p>
+      <w:pPr>
+        <w:pStyle w:val="ListBullet"/>
+        <w:spacing w:after="160" w:line="280" w:lineRule="auto"/>
+      </w:pPr>
+      <w:r>
+        <w:t>Název, poznámka, termín, priorita, stav dokončení.</w:t>
+      </w:r>
+    </w:p>
+    <w:p>
+      <w:pPr>
+        <w:pStyle w:val="ListBullet"/>
+        <w:spacing w:after="160" w:line="280" w:lineRule="auto"/>
+      </w:pPr>
+      <w:r>
+        <w:t>Podúkoly jako checklist s možností přidat, přejmenovat, dokončit, smazat a změnit pořadí.</w:t>
+      </w:r>
+    </w:p>
+    <w:p>
+      <w:pPr>
+        <w:pStyle w:val="ListBullet"/>
+        <w:spacing w:after="160" w:line="280" w:lineRule="auto"/>
+      </w:pPr>
+      <w:r>
+        <w:t>Vazba na stavbu/projekt/dokument/smlouvu jako volitelný kontext.</w:t>
+      </w:r>
+    </w:p>
+    <w:p>
+      <w:pPr>
+        <w:pStyle w:val="ListBullet"/>
+        <w:spacing w:after="160" w:line="280" w:lineRule="auto"/>
+      </w:pPr>
+      <w:r>
+        <w:t>Auditové údaje pouze tam, kde pomáhají debugovat nebo řešit sync; běžný uživatel je nemá mít v hlavním UI.</w:t>
       </w:r>
     </w:p>
     <w:p>
@@ -1245,7 +1105,462 @@
         <w:pStyle w:val="Heading1"/>
       </w:pPr>
       <w:r>
-        <w:t>5. Cílová architektura</w:t>
+        <w:t>5. Datový model pro podúkoly</w:t>
+      </w:r>
+    </w:p>
+    <w:p>
+      <w:r>
+        <w:t>Podúkoly lze modelovat dvěma způsoby. Pro Tender-Flow dává největší smysl ponechat jeden typ Task a doplnit hierarchii přes parent_task_id. Tím se sjednotí dokončování, priorita, termíny, RLS i budoucí sync.</w:t>
+      </w:r>
+    </w:p>
+    <w:tbl>
+      <w:tblGrid>
+        <w:gridCol w:w="2200"/>
+        <w:gridCol w:w="7160"/>
+      </w:tblGrid>
+      <w:tblPr>
+        <w:tblStyle w:val="TableGrid"/>
+        <w:tblW w:type="dxa" w:w="9360"/>
+        <w:jc w:val="left"/>
+        <w:tblLook w:firstColumn="1" w:firstRow="1" w:lastColumn="0" w:lastRow="0" w:noHBand="0" w:noVBand="1" w:val="04A0"/>
+        <w:tblInd w:w="120" w:type="dxa"/>
+      </w:tblPr>
+      <w:tr>
+        <w:trPr>
+          <w:tblHeader w:val="true"/>
+        </w:trPr>
+        <w:tc>
+          <w:tcPr>
+            <w:tcW w:type="dxa" w:w="2200"/>
+            <w:tcMar>
+              <w:top w:w="80" w:type="dxa"/>
+              <w:start w:w="120" w:type="dxa"/>
+              <w:bottom w:w="80" w:type="dxa"/>
+              <w:end w:w="120" w:type="dxa"/>
+            </w:tcMar>
+            <w:vAlign w:val="center"/>
+            <w:shd w:fill="F2F4F7"/>
+          </w:tcPr>
+          <w:p>
+            <w:pPr>
+              <w:jc w:val="left"/>
+            </w:pPr>
+            <w:r>
+              <w:rPr>
+                <w:b/>
+                <w:color w:val="1F4D78"/>
+              </w:rPr>
+              <w:t>Pole / koncept</w:t>
+            </w:r>
+          </w:p>
+        </w:tc>
+        <w:tc>
+          <w:tcPr>
+            <w:tcW w:type="dxa" w:w="7160"/>
+            <w:tcMar>
+              <w:top w:w="80" w:type="dxa"/>
+              <w:start w:w="120" w:type="dxa"/>
+              <w:bottom w:w="80" w:type="dxa"/>
+              <w:end w:w="120" w:type="dxa"/>
+            </w:tcMar>
+            <w:vAlign w:val="center"/>
+            <w:shd w:fill="F2F4F7"/>
+          </w:tcPr>
+          <w:p>
+            <w:pPr>
+              <w:jc w:val="left"/>
+            </w:pPr>
+            <w:r>
+              <w:rPr>
+                <w:b/>
+                <w:color w:val="1F4D78"/>
+              </w:rPr>
+              <w:t>Doporučení</w:t>
+            </w:r>
+          </w:p>
+        </w:tc>
+      </w:tr>
+      <w:tr>
+        <w:tc>
+          <w:tcPr>
+            <w:tcW w:type="dxa" w:w="2200"/>
+            <w:tcMar>
+              <w:top w:w="80" w:type="dxa"/>
+              <w:start w:w="120" w:type="dxa"/>
+              <w:bottom w:w="80" w:type="dxa"/>
+              <w:end w:w="120" w:type="dxa"/>
+            </w:tcMar>
+            <w:vAlign w:val="center"/>
+          </w:tcPr>
+          <w:p>
+            <w:pPr>
+              <w:spacing w:after="0" w:line="264" w:lineRule="auto"/>
+              <w:jc w:val="left"/>
+            </w:pPr>
+            <w:r>
+              <w:t>parent_task_id</w:t>
+            </w:r>
+          </w:p>
+        </w:tc>
+        <w:tc>
+          <w:tcPr>
+            <w:tcW w:type="dxa" w:w="7160"/>
+            <w:tcMar>
+              <w:top w:w="80" w:type="dxa"/>
+              <w:start w:w="120" w:type="dxa"/>
+              <w:bottom w:w="80" w:type="dxa"/>
+              <w:end w:w="120" w:type="dxa"/>
+            </w:tcMar>
+            <w:vAlign w:val="center"/>
+          </w:tcPr>
+          <w:p>
+            <w:pPr>
+              <w:spacing w:after="0" w:line="264" w:lineRule="auto"/>
+              <w:jc w:val="left"/>
+            </w:pPr>
+            <w:r>
+              <w:t>Nullable FK na tasks.id. Root úkol má NULL, podúkol odkazuje na rodiče.</w:t>
+            </w:r>
+          </w:p>
+        </w:tc>
+      </w:tr>
+      <w:tr>
+        <w:tc>
+          <w:tcPr>
+            <w:tcW w:type="dxa" w:w="2200"/>
+            <w:tcMar>
+              <w:top w:w="80" w:type="dxa"/>
+              <w:start w:w="120" w:type="dxa"/>
+              <w:bottom w:w="80" w:type="dxa"/>
+              <w:end w:w="120" w:type="dxa"/>
+            </w:tcMar>
+            <w:vAlign w:val="center"/>
+          </w:tcPr>
+          <w:p>
+            <w:pPr>
+              <w:spacing w:after="0" w:line="264" w:lineRule="auto"/>
+              <w:jc w:val="left"/>
+            </w:pPr>
+            <w:r>
+              <w:t>sort_order</w:t>
+            </w:r>
+          </w:p>
+        </w:tc>
+        <w:tc>
+          <w:tcPr>
+            <w:tcW w:type="dxa" w:w="7160"/>
+            <w:tcMar>
+              <w:top w:w="80" w:type="dxa"/>
+              <w:start w:w="120" w:type="dxa"/>
+              <w:bottom w:w="80" w:type="dxa"/>
+              <w:end w:w="120" w:type="dxa"/>
+            </w:tcMar>
+            <w:vAlign w:val="center"/>
+          </w:tcPr>
+          <w:p>
+            <w:pPr>
+              <w:spacing w:after="0" w:line="264" w:lineRule="auto"/>
+              <w:jc w:val="left"/>
+            </w:pPr>
+            <w:r>
+              <w:t>Číselné pořadí podúkolů v rámci stejného rodiče. UI nesmí spoléhat jen na created_at.</w:t>
+            </w:r>
+          </w:p>
+        </w:tc>
+      </w:tr>
+      <w:tr>
+        <w:tc>
+          <w:tcPr>
+            <w:tcW w:type="dxa" w:w="2200"/>
+            <w:tcMar>
+              <w:top w:w="80" w:type="dxa"/>
+              <w:start w:w="120" w:type="dxa"/>
+              <w:bottom w:w="80" w:type="dxa"/>
+              <w:end w:w="120" w:type="dxa"/>
+            </w:tcMar>
+            <w:vAlign w:val="center"/>
+          </w:tcPr>
+          <w:p>
+            <w:pPr>
+              <w:spacing w:after="0" w:line="264" w:lineRule="auto"/>
+              <w:jc w:val="left"/>
+            </w:pPr>
+            <w:r>
+              <w:t>depth guard</w:t>
+            </w:r>
+          </w:p>
+        </w:tc>
+        <w:tc>
+          <w:tcPr>
+            <w:tcW w:type="dxa" w:w="7160"/>
+            <w:tcMar>
+              <w:top w:w="80" w:type="dxa"/>
+              <w:start w:w="120" w:type="dxa"/>
+              <w:bottom w:w="80" w:type="dxa"/>
+              <w:end w:w="120" w:type="dxa"/>
+            </w:tcMar>
+            <w:vAlign w:val="center"/>
+          </w:tcPr>
+          <w:p>
+            <w:pPr>
+              <w:spacing w:after="0" w:line="264" w:lineRule="auto"/>
+              <w:jc w:val="left"/>
+            </w:pPr>
+            <w:r>
+              <w:t>MVP doporučení: povolit jednu úroveň podúkolů. Víceúrovňový strom odložit, dokud nebude jasná potřeba.</w:t>
+            </w:r>
+          </w:p>
+        </w:tc>
+      </w:tr>
+      <w:tr>
+        <w:tc>
+          <w:tcPr>
+            <w:tcW w:type="dxa" w:w="2200"/>
+            <w:tcMar>
+              <w:top w:w="80" w:type="dxa"/>
+              <w:start w:w="120" w:type="dxa"/>
+              <w:bottom w:w="80" w:type="dxa"/>
+              <w:end w:w="120" w:type="dxa"/>
+            </w:tcMar>
+            <w:vAlign w:val="center"/>
+          </w:tcPr>
+          <w:p>
+            <w:pPr>
+              <w:spacing w:after="0" w:line="264" w:lineRule="auto"/>
+              <w:jc w:val="left"/>
+            </w:pPr>
+            <w:r>
+              <w:t>completion rollup</w:t>
+            </w:r>
+          </w:p>
+        </w:tc>
+        <w:tc>
+          <w:tcPr>
+            <w:tcW w:type="dxa" w:w="7160"/>
+            <w:tcMar>
+              <w:top w:w="80" w:type="dxa"/>
+              <w:start w:w="120" w:type="dxa"/>
+              <w:bottom w:w="80" w:type="dxa"/>
+              <w:end w:w="120" w:type="dxa"/>
+            </w:tcMar>
+            <w:vAlign w:val="center"/>
+          </w:tcPr>
+          <w:p>
+            <w:pPr>
+              <w:spacing w:after="0" w:line="264" w:lineRule="auto"/>
+              <w:jc w:val="left"/>
+            </w:pPr>
+            <w:r>
+              <w:t>Dokončení rodiče nemá automaticky mazat ani přepisovat podúkoly. UI může nabídnout dokončit vše.</w:t>
+            </w:r>
+          </w:p>
+        </w:tc>
+      </w:tr>
+      <w:tr>
+        <w:tc>
+          <w:tcPr>
+            <w:tcW w:type="dxa" w:w="2200"/>
+            <w:tcMar>
+              <w:top w:w="80" w:type="dxa"/>
+              <w:start w:w="120" w:type="dxa"/>
+              <w:bottom w:w="80" w:type="dxa"/>
+              <w:end w:w="120" w:type="dxa"/>
+            </w:tcMar>
+            <w:vAlign w:val="center"/>
+          </w:tcPr>
+          <w:p>
+            <w:pPr>
+              <w:spacing w:after="0" w:line="264" w:lineRule="auto"/>
+              <w:jc w:val="left"/>
+            </w:pPr>
+            <w:r>
+              <w:t>RLS</w:t>
+            </w:r>
+          </w:p>
+        </w:tc>
+        <w:tc>
+          <w:tcPr>
+            <w:tcW w:type="dxa" w:w="7160"/>
+            <w:tcMar>
+              <w:top w:w="80" w:type="dxa"/>
+              <w:start w:w="120" w:type="dxa"/>
+              <w:bottom w:w="80" w:type="dxa"/>
+              <w:end w:w="120" w:type="dxa"/>
+            </w:tcMar>
+            <w:vAlign w:val="center"/>
+          </w:tcPr>
+          <w:p>
+            <w:pPr>
+              <w:spacing w:after="0" w:line="264" w:lineRule="auto"/>
+              <w:jc w:val="left"/>
+            </w:pPr>
+            <w:r>
+              <w:t>Podúkol dědí bezpečnost přes created_by. Politika musí vynutit, že rodič i dítě patří stejnému uživateli.</w:t>
+            </w:r>
+          </w:p>
+        </w:tc>
+      </w:tr>
+      <w:tr>
+        <w:tc>
+          <w:tcPr>
+            <w:tcW w:type="dxa" w:w="2200"/>
+            <w:tcMar>
+              <w:top w:w="80" w:type="dxa"/>
+              <w:start w:w="120" w:type="dxa"/>
+              <w:bottom w:w="80" w:type="dxa"/>
+              <w:end w:w="120" w:type="dxa"/>
+            </w:tcMar>
+            <w:vAlign w:val="center"/>
+          </w:tcPr>
+          <w:p>
+            <w:pPr>
+              <w:spacing w:after="0" w:line="264" w:lineRule="auto"/>
+              <w:jc w:val="left"/>
+            </w:pPr>
+            <w:r>
+              <w:t>Indexy</w:t>
+            </w:r>
+          </w:p>
+        </w:tc>
+        <w:tc>
+          <w:tcPr>
+            <w:tcW w:type="dxa" w:w="7160"/>
+            <w:tcMar>
+              <w:top w:w="80" w:type="dxa"/>
+              <w:start w:w="120" w:type="dxa"/>
+              <w:bottom w:w="80" w:type="dxa"/>
+              <w:end w:w="120" w:type="dxa"/>
+            </w:tcMar>
+            <w:vAlign w:val="center"/>
+          </w:tcPr>
+          <w:p>
+            <w:pPr>
+              <w:spacing w:after="0" w:line="264" w:lineRule="auto"/>
+              <w:jc w:val="left"/>
+            </w:pPr>
+            <w:r>
+              <w:t>Index na created_by, parent_task_id, completed a due_at pro rychlé osobní pohledy a Command Center.</w:t>
+            </w:r>
+          </w:p>
+        </w:tc>
+      </w:tr>
+    </w:tbl>
+    <w:p/>
+    <w:tbl>
+      <w:tblGrid>
+        <w:gridCol w:w="9360"/>
+      </w:tblGrid>
+      <w:tblPr>
+        <w:tblStyle w:val="TableGrid"/>
+        <w:tblW w:type="dxa" w:w="9360"/>
+        <w:jc w:val="left"/>
+        <w:tblLook w:firstColumn="1" w:firstRow="1" w:lastColumn="0" w:lastRow="0" w:noHBand="0" w:noVBand="1" w:val="04A0"/>
+        <w:tblInd w:w="120" w:type="dxa"/>
+      </w:tblPr>
+      <w:tr>
+        <w:trPr>
+          <w:tblHeader w:val="true"/>
+        </w:trPr>
+        <w:tc>
+          <w:tcPr>
+            <w:tcW w:type="dxa" w:w="9360"/>
+            <w:tcMar>
+              <w:top w:w="80" w:type="dxa"/>
+              <w:start w:w="120" w:type="dxa"/>
+              <w:bottom w:w="80" w:type="dxa"/>
+              <w:end w:w="120" w:type="dxa"/>
+            </w:tcMar>
+            <w:vAlign w:val="center"/>
+            <w:shd w:fill="F4F6F9"/>
+          </w:tcPr>
+          <w:p>
+            <w:pPr>
+              <w:spacing w:after="60"/>
+            </w:pPr>
+            <w:r>
+              <w:rPr>
+                <w:b/>
+                <w:color w:val="962323"/>
+              </w:rPr>
+              <w:t>Bezpečný model podúkolů</w:t>
+            </w:r>
+          </w:p>
+          <w:p>
+            <w:pPr>
+              <w:spacing w:after="0" w:line="264" w:lineRule="auto"/>
+            </w:pPr>
+            <w:r>
+              <w:t>Nejdůležitější pravidlo: uživatel nesmí vytvořit podúkol pod cizím úkolem. Databáze i aplikační vrstva musí kontrolovat shodu created_by mezi parent_task_id a novým podúkolem.</w:t>
+            </w:r>
+          </w:p>
+        </w:tc>
+      </w:tr>
+    </w:tbl>
+    <w:p/>
+    <w:p>
+      <w:pPr>
+        <w:pStyle w:val="Heading1"/>
+      </w:pPr>
+      <w:r>
+        <w:t>6. Props do Command Center</w:t>
+      </w:r>
+    </w:p>
+    <w:p>
+      <w:r>
+        <w:t>Command Center má zobrazovat relevantní osobní úkoly ve stejné akční frontě jako derivované akce. TODO modul ale zůstává místem, kde uživatel úkoly kompletně spravuje.</w:t>
+      </w:r>
+    </w:p>
+    <w:p>
+      <w:pPr>
+        <w:pStyle w:val="ListBullet"/>
+        <w:spacing w:after="160" w:line="280" w:lineRule="auto"/>
+      </w:pPr>
+      <w:r>
+        <w:t>Root úkoly se v action queue zobrazí podle due_at, priority a stavu completed.</w:t>
+      </w:r>
+    </w:p>
+    <w:p>
+      <w:pPr>
+        <w:pStyle w:val="ListBullet"/>
+        <w:spacing w:after="160" w:line="280" w:lineRule="auto"/>
+      </w:pPr>
+      <w:r>
+        <w:t>Podúkoly se v Command Center standardně nezobrazují jako samostatné položky, aby fronta nebyla zahlcená.</w:t>
+      </w:r>
+    </w:p>
+    <w:p>
+      <w:pPr>
+        <w:pStyle w:val="ListBullet"/>
+        <w:spacing w:after="160" w:line="280" w:lineRule="auto"/>
+      </w:pPr>
+      <w:r>
+        <w:t>Výjimka: podúkol s vlastním due_at nebo P1 prioritou se může zobrazit jako samostatný signál pod rodičem.</w:t>
+      </w:r>
+    </w:p>
+    <w:p>
+      <w:pPr>
+        <w:pStyle w:val="ListBullet"/>
+        <w:spacing w:after="160" w:line="280" w:lineRule="auto"/>
+      </w:pPr>
+      <w:r>
+        <w:t>U každého úkolu v Command Center má být jasné, že jde o personal TODO položku, ne systémově derivovanou akci.</w:t>
+      </w:r>
+    </w:p>
+    <w:p>
+      <w:pPr>
+        <w:pStyle w:val="ListBullet"/>
+        <w:spacing w:after="160" w:line="280" w:lineRule="auto"/>
+      </w:pPr>
+      <w:r>
+        <w:t>Kliknutí z Command Center otevře detail úkolu v TODO modulu nebo modal, podle existujícího routing patternu.</w:t>
+      </w:r>
+    </w:p>
+    <w:p>
+      <w:pPr>
+        <w:pStyle w:val="Heading1"/>
+      </w:pPr>
+      <w:r>
+        <w:t>7. Cílová architektura</w:t>
       </w:r>
     </w:p>
     <w:tbl>
@@ -1359,7 +1674,7 @@
               <w:jc w:val="center"/>
             </w:pPr>
             <w:r>
-              <w:t>Data</w:t>
+              <w:t>Feature modul</w:t>
             </w:r>
           </w:p>
         </w:tc>
@@ -1380,7 +1695,7 @@
               <w:jc w:val="left"/>
             </w:pPr>
             <w:r>
-              <w:t>Supabase Postgres jako zdroj pravdy pro vlastní úkoly.</w:t>
+              <w:t>features/tasks jako doménový modul pro TODO.</w:t>
             </w:r>
           </w:p>
         </w:tc>
@@ -1401,7 +1716,7 @@
               <w:jc w:val="left"/>
             </w:pPr>
             <w:r>
-              <w:t>Rozšířit tasks o scope/workspace, assignee, source_app, revision/version a sync fields.</w:t>
+              <w:t>Doplnit routy, sidebar manifest, UI pohledy a detail. Nepřidávat nové soubory do legacy roots bez nutnosti.</w:t>
             </w:r>
           </w:p>
         </w:tc>
@@ -1424,7 +1739,7 @@
               <w:jc w:val="center"/>
             </w:pPr>
             <w:r>
-              <w:t>API/domain</w:t>
+              <w:t>Data/API</w:t>
             </w:r>
           </w:p>
         </w:tc>
@@ -1445,7 +1760,7 @@
               <w:jc w:val="left"/>
             </w:pPr>
             <w:r>
-              <w:t>Sdílené task služby a typy.</w:t>
+              <w:t>Supabase tasks jako zdroj pravdy.</w:t>
             </w:r>
           </w:p>
         </w:tc>
@@ -1466,7 +1781,7 @@
               <w:jc w:val="left"/>
             </w:pPr>
             <w:r>
-              <w:t>Udržet v features/tasks a infra provider vrstvě; nepřenášet server-only logiku do web UI.</w:t>
+              <w:t>Rozšířit migrací o parent_task_id a sort_order. Zachovat personal RLS.</w:t>
             </w:r>
           </w:p>
         </w:tc>
@@ -1489,7 +1804,7 @@
               <w:jc w:val="center"/>
             </w:pPr>
             <w:r>
-              <w:t>Tender-Flow UI</w:t>
+              <w:t>UI</w:t>
             </w:r>
           </w:p>
         </w:tc>
@@ -1510,7 +1825,7 @@
               <w:jc w:val="left"/>
             </w:pPr>
             <w:r>
-              <w:t>Kontextové úkoly, Command Center, Calendar.</w:t>
+              <w:t>Samostatná stránka TODO s pohledy Inbox/Dnes/Nadcházející/Hotovo.</w:t>
             </w:r>
           </w:p>
         </w:tc>
@@ -1531,7 +1846,7 @@
               <w:jc w:val="left"/>
             </w:pPr>
             <w:r>
-              <w:t>Zachovat existující integrace a postupně doplnit filtry, Inbox a Today.</w:t>
+              <w:t>Inspirovat se Todoist/Microsoft To Do: rychlé pořizování, klávesnice, čistý seznam, detail panel.</w:t>
             </w:r>
           </w:p>
         </w:tc>
@@ -1554,7 +1869,7 @@
               <w:jc w:val="center"/>
             </w:pPr>
             <w:r>
-              <w:t>Solo klient</w:t>
+              <w:t>Command Center</w:t>
             </w:r>
           </w:p>
         </w:tc>
@@ -1575,7 +1890,7 @@
               <w:jc w:val="left"/>
             </w:pPr>
             <w:r>
-              <w:t>Telefonní rychlý klient nad stejným API.</w:t>
+              <w:t>Konzument otevřených osobních úkolů.</w:t>
             </w:r>
           </w:p>
         </w:tc>
@@ -1596,7 +1911,7 @@
               <w:jc w:val="left"/>
             </w:pPr>
             <w:r>
-              <w:t>Začít jako PWA/responzivní web; nativní app až po ověření návyků.</w:t>
+              <w:t>Napojení přes existující actionQueueMerge a useCalendarData, bez přímého vlastnictví TODO logiky.</w:t>
             </w:r>
           </w:p>
         </w:tc>
@@ -1619,7 +1934,7 @@
               <w:jc w:val="center"/>
             </w:pPr>
             <w:r>
-              <w:t>Sync engine</w:t>
+              <w:t>Budoucí sync</w:t>
             </w:r>
           </w:p>
         </w:tc>
@@ -1640,7 +1955,7 @@
               <w:jc w:val="left"/>
             </w:pPr>
             <w:r>
-              <w:t>Idempotentní synchronizace mezi klienty a později externími providery.</w:t>
+              <w:t>Externí providery až po stabilizaci interního modulu.</w:t>
             </w:r>
           </w:p>
         </w:tc>
@@ -1661,7 +1976,7 @@
               <w:jc w:val="left"/>
             </w:pPr>
             <w:r>
-              <w:t>Použít server-side job/Edge Function pro externí OAuth a webhooks; klient nesmí držet provider tokeny.</w:t>
+              <w:t>OAuth tokeny pouze server-side; žádné refresh tokeny v browseru ani desktop rendereru.</w:t>
             </w:r>
           </w:p>
         </w:tc>
@@ -1679,7 +1994,7 @@
         <w:spacing w:after="160" w:line="280" w:lineRule="auto"/>
       </w:pPr>
       <w:r>
-        <w:t>Uživatel vytvoří úkol v telefonu, Tender-Flow nebo desktopu.</w:t>
+        <w:t>Uživatel vytvoří úkol v TODO modulu nebo quick-add vstupu.</w:t>
       </w:r>
     </w:p>
     <w:p>
@@ -1688,7 +2003,7 @@
         <w:spacing w:after="160" w:line="280" w:lineRule="auto"/>
       </w:pPr>
       <w:r>
-        <w:t>Klient zapíše změnu přes jednotnou mutation vrstvu do Supabase.</w:t>
+        <w:t>Pokud jde o podúkol, klient pošle parent_task_id a sort_order.</w:t>
       </w:r>
     </w:p>
     <w:p>
@@ -1697,7 +2012,7 @@
         <w:spacing w:after="160" w:line="280" w:lineRule="auto"/>
       </w:pPr>
       <w:r>
-        <w:t>RLS rozhodne, zda uživatel smí číst nebo měnit konkrétní úkol.</w:t>
+        <w:t>Supabase RLS a DB validace ověří, že úkol i rodič patří stejnému uživateli.</w:t>
       </w:r>
     </w:p>
     <w:p>
@@ -1706,7 +2021,7 @@
         <w:spacing w:after="160" w:line="280" w:lineRule="auto"/>
       </w:pPr>
       <w:r>
-        <w:t>React Query / realtime / pull refresh obnoví ostatní klienty.</w:t>
+        <w:t>React Query invaliduje osobní task query a Command Center signály.</w:t>
       </w:r>
     </w:p>
     <w:p>
@@ -1715,7 +2030,7 @@
         <w:spacing w:after="160" w:line="280" w:lineRule="auto"/>
       </w:pPr>
       <w:r>
-        <w:t>Pokud je úkol napojený na externí provider, sync engine provede idempotentní export/import a uloží sync_status.</w:t>
+        <w:t>Command Center přepočítá akční frontu a zobrazí otevřené relevantní úkoly.</w:t>
       </w:r>
     </w:p>
     <w:p>
@@ -1723,322 +2038,7 @@
         <w:pStyle w:val="Heading1"/>
       </w:pPr>
       <w:r>
-        <w:t>6. Synchronizace</w:t>
-      </w:r>
-    </w:p>
-    <w:p>
-      <w:pPr>
-        <w:pStyle w:val="Heading2"/>
-      </w:pPr>
-      <w:r>
-        <w:t>6.1 Vlastní klienty</w:t>
-      </w:r>
-    </w:p>
-    <w:p>
-      <w:r>
-        <w:t>Pro vlastní web, desktop a mobil/PWA klienty by neměla existovat složitá peer-to-peer synchronizace. Zdrojem pravdy má být Supabase. Klienti synchronizují přes pull/realtime a řeší offline frontu lokálně jen jako optimalizaci.</w:t>
-      </w:r>
-    </w:p>
-    <w:p>
-      <w:pPr>
-        <w:pStyle w:val="ListBullet"/>
-        <w:spacing w:after="160" w:line="280" w:lineRule="auto"/>
-      </w:pPr>
-      <w:r>
-        <w:t>Každá mutace musí být idempotentní nebo bezpečně opakovatelná.</w:t>
-      </w:r>
-    </w:p>
-    <w:p>
-      <w:pPr>
-        <w:pStyle w:val="ListBullet"/>
-        <w:spacing w:after="160" w:line="280" w:lineRule="auto"/>
-      </w:pPr>
-      <w:r>
-        <w:t>Task má mít updated_at a ideálně revision/version pro detekci konfliktů.</w:t>
-      </w:r>
-    </w:p>
-    <w:p>
-      <w:pPr>
-        <w:pStyle w:val="ListBullet"/>
-        <w:spacing w:after="160" w:line="280" w:lineRule="auto"/>
-      </w:pPr>
-      <w:r>
-        <w:t>Offline změny se ukládají do lokální fronty a po připojení se posílají v pořadí.</w:t>
-      </w:r>
-    </w:p>
-    <w:p>
-      <w:pPr>
-        <w:pStyle w:val="ListBullet"/>
-        <w:spacing w:after="160" w:line="280" w:lineRule="auto"/>
-      </w:pPr>
-      <w:r>
-        <w:t>Konflikt se řeší pravidlem: dokončení úkolu je silnější než změna poznámky, novější textová změna vyžaduje merge nebo explicitní volbu.</w:t>
-      </w:r>
-    </w:p>
-    <w:p>
-      <w:pPr>
-        <w:pStyle w:val="Heading2"/>
-      </w:pPr>
-      <w:r>
-        <w:t>6.2 Externí task managery</w:t>
-      </w:r>
-    </w:p>
-    <w:p>
-      <w:r>
-        <w:t>Externí integrace mají být druhá fáze. Existující sloupce external_provider a external_id jsou dobrý základ, ale samy o sobě neřeší OAuth, konflikty, webhooky ani mazání.</w:t>
-      </w:r>
-    </w:p>
-    <w:tbl>
-      <w:tblGrid>
-        <w:gridCol w:w="2200"/>
-        <w:gridCol w:w="7160"/>
-      </w:tblGrid>
-      <w:tblPr>
-        <w:tblStyle w:val="TableGrid"/>
-        <w:tblW w:type="dxa" w:w="9360"/>
-        <w:jc w:val="left"/>
-        <w:tblLook w:firstColumn="1" w:firstRow="1" w:lastColumn="0" w:lastRow="0" w:noHBand="0" w:noVBand="1" w:val="04A0"/>
-        <w:tblInd w:w="120" w:type="dxa"/>
-      </w:tblPr>
-      <w:tr>
-        <w:trPr>
-          <w:tblHeader w:val="true"/>
-        </w:trPr>
-        <w:tc>
-          <w:tcPr>
-            <w:tcW w:type="dxa" w:w="2200"/>
-            <w:tcMar>
-              <w:top w:w="80" w:type="dxa"/>
-              <w:start w:w="120" w:type="dxa"/>
-              <w:bottom w:w="80" w:type="dxa"/>
-              <w:end w:w="120" w:type="dxa"/>
-            </w:tcMar>
-            <w:vAlign w:val="center"/>
-            <w:shd w:fill="F2F4F7"/>
-          </w:tcPr>
-          <w:p>
-            <w:pPr>
-              <w:jc w:val="left"/>
-            </w:pPr>
-            <w:r>
-              <w:rPr>
-                <w:b/>
-                <w:color w:val="1F4D78"/>
-              </w:rPr>
-              <w:t>Téma</w:t>
-            </w:r>
-          </w:p>
-        </w:tc>
-        <w:tc>
-          <w:tcPr>
-            <w:tcW w:type="dxa" w:w="7160"/>
-            <w:tcMar>
-              <w:top w:w="80" w:type="dxa"/>
-              <w:start w:w="120" w:type="dxa"/>
-              <w:bottom w:w="80" w:type="dxa"/>
-              <w:end w:w="120" w:type="dxa"/>
-            </w:tcMar>
-            <w:vAlign w:val="center"/>
-            <w:shd w:fill="F2F4F7"/>
-          </w:tcPr>
-          <w:p>
-            <w:pPr>
-              <w:jc w:val="left"/>
-            </w:pPr>
-            <w:r>
-              <w:rPr>
-                <w:b/>
-                <w:color w:val="1F4D78"/>
-              </w:rPr>
-              <w:t>Doporučení</w:t>
-            </w:r>
-          </w:p>
-        </w:tc>
-      </w:tr>
-      <w:tr>
-        <w:tc>
-          <w:tcPr>
-            <w:tcW w:type="dxa" w:w="2200"/>
-            <w:tcMar>
-              <w:top w:w="80" w:type="dxa"/>
-              <w:start w:w="120" w:type="dxa"/>
-              <w:bottom w:w="80" w:type="dxa"/>
-              <w:end w:w="120" w:type="dxa"/>
-            </w:tcMar>
-            <w:vAlign w:val="center"/>
-          </w:tcPr>
-          <w:p>
-            <w:pPr>
-              <w:spacing w:after="0" w:line="264" w:lineRule="auto"/>
-              <w:jc w:val="left"/>
-            </w:pPr>
-            <w:r>
-              <w:t>OAuth tokeny</w:t>
-            </w:r>
-          </w:p>
-        </w:tc>
-        <w:tc>
-          <w:tcPr>
-            <w:tcW w:type="dxa" w:w="7160"/>
-            <w:tcMar>
-              <w:top w:w="80" w:type="dxa"/>
-              <w:start w:w="120" w:type="dxa"/>
-              <w:bottom w:w="80" w:type="dxa"/>
-              <w:end w:w="120" w:type="dxa"/>
-            </w:tcMar>
-            <w:vAlign w:val="center"/>
-          </w:tcPr>
-          <w:p>
-            <w:pPr>
-              <w:spacing w:after="0" w:line="264" w:lineRule="auto"/>
-              <w:jc w:val="left"/>
-            </w:pPr>
-            <w:r>
-              <w:t>Ukládat server-side, šifrovat, nikdy neposílat refresh token do browseru ani desktop rendereru.</w:t>
-            </w:r>
-          </w:p>
-        </w:tc>
-      </w:tr>
-      <w:tr>
-        <w:tc>
-          <w:tcPr>
-            <w:tcW w:type="dxa" w:w="2200"/>
-            <w:tcMar>
-              <w:top w:w="80" w:type="dxa"/>
-              <w:start w:w="120" w:type="dxa"/>
-              <w:bottom w:w="80" w:type="dxa"/>
-              <w:end w:w="120" w:type="dxa"/>
-            </w:tcMar>
-            <w:vAlign w:val="center"/>
-          </w:tcPr>
-          <w:p>
-            <w:pPr>
-              <w:spacing w:after="0" w:line="264" w:lineRule="auto"/>
-              <w:jc w:val="left"/>
-            </w:pPr>
-            <w:r>
-              <w:t>Směr synchronizace</w:t>
-            </w:r>
-          </w:p>
-        </w:tc>
-        <w:tc>
-          <w:tcPr>
-            <w:tcW w:type="dxa" w:w="7160"/>
-            <w:tcMar>
-              <w:top w:w="80" w:type="dxa"/>
-              <w:start w:w="120" w:type="dxa"/>
-              <w:bottom w:w="80" w:type="dxa"/>
-              <w:end w:w="120" w:type="dxa"/>
-            </w:tcMar>
-            <w:vAlign w:val="center"/>
-          </w:tcPr>
-          <w:p>
-            <w:pPr>
-              <w:spacing w:after="0" w:line="264" w:lineRule="auto"/>
-              <w:jc w:val="left"/>
-            </w:pPr>
-            <w:r>
-              <w:t>Nejdřív jednosměrný export z Tender-Flow do provideru; obousměrný sync až po metrikách a testech.</w:t>
-            </w:r>
-          </w:p>
-        </w:tc>
-      </w:tr>
-      <w:tr>
-        <w:tc>
-          <w:tcPr>
-            <w:tcW w:type="dxa" w:w="2200"/>
-            <w:tcMar>
-              <w:top w:w="80" w:type="dxa"/>
-              <w:start w:w="120" w:type="dxa"/>
-              <w:bottom w:w="80" w:type="dxa"/>
-              <w:end w:w="120" w:type="dxa"/>
-            </w:tcMar>
-            <w:vAlign w:val="center"/>
-          </w:tcPr>
-          <w:p>
-            <w:pPr>
-              <w:spacing w:after="0" w:line="264" w:lineRule="auto"/>
-              <w:jc w:val="left"/>
-            </w:pPr>
-            <w:r>
-              <w:t>Konflikty</w:t>
-            </w:r>
-          </w:p>
-        </w:tc>
-        <w:tc>
-          <w:tcPr>
-            <w:tcW w:type="dxa" w:w="7160"/>
-            <w:tcMar>
-              <w:top w:w="80" w:type="dxa"/>
-              <w:start w:w="120" w:type="dxa"/>
-              <w:bottom w:w="80" w:type="dxa"/>
-              <w:end w:w="120" w:type="dxa"/>
-            </w:tcMar>
-            <w:vAlign w:val="center"/>
-          </w:tcPr>
-          <w:p>
-            <w:pPr>
-              <w:spacing w:after="0" w:line="264" w:lineRule="auto"/>
-              <w:jc w:val="left"/>
-            </w:pPr>
-            <w:r>
-              <w:t>Udržovat provider etag/revision, last_synced_at a sync_error. Konflikt musí být viditelný v UI.</w:t>
-            </w:r>
-          </w:p>
-        </w:tc>
-      </w:tr>
-      <w:tr>
-        <w:tc>
-          <w:tcPr>
-            <w:tcW w:type="dxa" w:w="2200"/>
-            <w:tcMar>
-              <w:top w:w="80" w:type="dxa"/>
-              <w:start w:w="120" w:type="dxa"/>
-              <w:bottom w:w="80" w:type="dxa"/>
-              <w:end w:w="120" w:type="dxa"/>
-            </w:tcMar>
-            <w:vAlign w:val="center"/>
-          </w:tcPr>
-          <w:p>
-            <w:pPr>
-              <w:spacing w:after="0" w:line="264" w:lineRule="auto"/>
-              <w:jc w:val="left"/>
-            </w:pPr>
-            <w:r>
-              <w:t>Mazání</w:t>
-            </w:r>
-          </w:p>
-        </w:tc>
-        <w:tc>
-          <w:tcPr>
-            <w:tcW w:type="dxa" w:w="7160"/>
-            <w:tcMar>
-              <w:top w:w="80" w:type="dxa"/>
-              <w:start w:w="120" w:type="dxa"/>
-              <w:bottom w:w="80" w:type="dxa"/>
-              <w:end w:w="120" w:type="dxa"/>
-            </w:tcMar>
-            <w:vAlign w:val="center"/>
-          </w:tcPr>
-          <w:p>
-            <w:pPr>
-              <w:spacing w:after="0" w:line="264" w:lineRule="auto"/>
-              <w:jc w:val="left"/>
-            </w:pPr>
-            <w:r>
-              <w:t>Preferovat soft-delete/tombstone, aby se mazání dalo bezpečně propagovat a auditovat.</w:t>
-            </w:r>
-          </w:p>
-        </w:tc>
-      </w:tr>
-    </w:tbl>
-    <w:p/>
-    <w:p>
-      <w:pPr>
-        <w:pStyle w:val="Heading1"/>
-      </w:pPr>
-      <w:r>
-        <w:t>7. Bezpečnostní návrh</w:t>
+        <w:t>8. Bezpečnostní návrh</w:t>
       </w:r>
     </w:p>
     <w:tbl>
@@ -2076,9 +2076,8 @@
               <w:rPr>
                 <w:b/>
                 <w:color w:val="962323"/>
-                <w:sz w:val="22"/>
               </w:rPr>
-              <w:t>Bezpečnostní minimum před samostatnou aplikací</w:t>
+              <w:t>Bezpečnostní minimum</w:t>
             </w:r>
           </w:p>
           <w:p>
@@ -2086,7 +2085,7 @@
               <w:spacing w:after="0" w:line="264" w:lineRule="auto"/>
             </w:pPr>
             <w:r>
-              <w:t>Před tím, než se task core otevře samostatnému klientovi, musí být jasně uzavřené RLS politiky pro personal a organization scope, validace vstupů, rate limiting a způsob ukládání integračních tokenů. Jinak hrozí cross-tenant úniky a neoprávněné čtení pracovních úkolů mimo Tender-Flow.</w:t>
+              <w:t>Protože TODO je personal scope, bezpečnostní návrh musí být přísný a jednoduchý: žádné implicitní sdílení, žádné org-wide čtení, žádné podúkoly pod cizím rodičem a žádné obcházení RLS přes klientské filtry.</w:t>
             </w:r>
           </w:p>
         </w:tc>
@@ -2099,7 +2098,7 @@
         <w:spacing w:after="160" w:line="280" w:lineRule="auto"/>
       </w:pPr>
       <w:r>
-        <w:t>Tenant isolation: každý dotaz na tasks musí být chráněn RLS a testem, že uživatel nevidí cizí osobní ani organizační úkoly.</w:t>
+        <w:t>RLS: created_by = auth.uid() pro select/insert/update/delete root úkolů i podúkolů.</w:t>
       </w:r>
     </w:p>
     <w:p>
@@ -2108,7 +2107,7 @@
         <w:spacing w:after="160" w:line="280" w:lineRule="auto"/>
       </w:pPr>
       <w:r>
-        <w:t>Least privilege: samostatná Todo aplikace nemá dostat více oprávnění než potřebuje; citlivé Tender entity čte jen přes explicitní oprávnění.</w:t>
+        <w:t>Parent consistency: DB trigger nebo constraint-helper musí ověřit, že parent_task_id patří stejnému created_by.</w:t>
       </w:r>
     </w:p>
     <w:p>
@@ -2117,7 +2116,7 @@
         <w:spacing w:after="160" w:line="280" w:lineRule="auto"/>
       </w:pPr>
       <w:r>
-        <w:t>Token security: OAuth refresh tokeny pouze server-side, šifrovaně, s rotací a možností odpojení providera.</w:t>
+        <w:t>Tender context není oprávnění: project_id/related_entity je jen vazba, nikoli sdílení úkolu s projektem nebo organizací.</w:t>
       </w:r>
     </w:p>
     <w:p>
@@ -2126,7 +2125,7 @@
         <w:spacing w:after="160" w:line="280" w:lineRule="auto"/>
       </w:pPr>
       <w:r>
-        <w:t>Input validation: title/note délky už existují v DB; doplnit aplikační validace a ochranu proti nečekaným related_entity hodnotám.</w:t>
+        <w:t>Command Center musí používat stejné personal dotazy; nesmí mít širší service role přístup v rendereru.</w:t>
       </w:r>
     </w:p>
     <w:p>
@@ -2135,7 +2134,7 @@
         <w:spacing w:after="160" w:line="280" w:lineRule="auto"/>
       </w:pPr>
       <w:r>
-        <w:t>Auditability: u organization úkolů evidovat actor, assignee, scope změny a externí sync chyby.</w:t>
+        <w:t>Externí sync tokeny nepatří do klienta; budoucí integrace musí být server-side a auditovatelná.</w:t>
       </w:r>
     </w:p>
     <w:p>
@@ -2144,7 +2143,7 @@
         <w:spacing w:after="160" w:line="280" w:lineRule="auto"/>
       </w:pPr>
       <w:r>
-        <w:t>Privacy by design: osobní inbox nesmí automaticky zobrazovat firemním uživatelům nic, co uživatel nevložil do workspace scope.</w:t>
+        <w:t>Mazání podúkolů má být bezpečné: buď kaskáda jen v rámci stejného vlastníka, nebo soft-delete podle budoucího audit požadavku.</w:t>
       </w:r>
     </w:p>
     <w:p>
@@ -2152,7 +2151,7 @@
         <w:pStyle w:val="Heading1"/>
       </w:pPr>
       <w:r>
-        <w:t>8. Roadmapa</w:t>
+        <w:t>9. Roadmapa</w:t>
       </w:r>
     </w:p>
     <w:tbl>
@@ -2292,7 +2291,7 @@
               <w:jc w:val="center"/>
             </w:pPr>
             <w:r>
-              <w:t>0: Rozhodnutí</w:t>
+              <w:t>0: Upřesnění scope</w:t>
             </w:r>
           </w:p>
         </w:tc>
@@ -2313,7 +2312,7 @@
               <w:jc w:val="left"/>
             </w:pPr>
             <w:r>
-              <w:t>Potvrdit product stance a scope model.</w:t>
+              <w:t>Uzavřít personal TODO modul jako MVP.</w:t>
             </w:r>
           </w:p>
         </w:tc>
@@ -2334,7 +2333,7 @@
               <w:jc w:val="left"/>
             </w:pPr>
             <w:r>
-              <w:t>Tento dokument + seznam otevřených rozhodnutí.</w:t>
+              <w:t>Tento aktualizovaný dokument a seznam user stories.</w:t>
             </w:r>
           </w:p>
         </w:tc>
@@ -2355,7 +2354,7 @@
               <w:jc w:val="left"/>
             </w:pPr>
             <w:r>
-              <w:t>Shoda, že zdroj pravdy je shared task core.</w:t>
+              <w:t>Shoda: sidebar modul, personal scope, podúkoly, Command Center props.</w:t>
             </w:r>
           </w:p>
         </w:tc>
@@ -2378,7 +2377,7 @@
               <w:jc w:val="center"/>
             </w:pPr>
             <w:r>
-              <w:t>1: Zpevnit V1</w:t>
+              <w:t>1: Datový model</w:t>
             </w:r>
           </w:p>
         </w:tc>
@@ -2399,7 +2398,7 @@
               <w:jc w:val="left"/>
             </w:pPr>
             <w:r>
-              <w:t>Dokončit task UX v Tender-Flow.</w:t>
+              <w:t>Doplnit podúkoly do tasks.</w:t>
             </w:r>
           </w:p>
         </w:tc>
@@ -2420,7 +2419,7 @@
               <w:jc w:val="left"/>
             </w:pPr>
             <w:r>
-              <w:t>Inbox, Today, filtry, editace, dokončení, základní notifikace.</w:t>
+              <w:t>Migrace parent_task_id, sort_order, indexy, RLS/trigger validace.</w:t>
             </w:r>
           </w:p>
         </w:tc>
@@ -2441,7 +2440,7 @@
               <w:jc w:val="left"/>
             </w:pPr>
             <w:r>
-              <w:t>Unit testy, boundary checks, plný test run.</w:t>
+              <w:t>Negativní test: nejde vytvořit podúkol pod cizím úkolem.</w:t>
             </w:r>
           </w:p>
         </w:tc>
@@ -2464,7 +2463,7 @@
               <w:jc w:val="center"/>
             </w:pPr>
             <w:r>
-              <w:t>2: Scope model</w:t>
+              <w:t>2: TODO modul UI</w:t>
             </w:r>
           </w:p>
         </w:tc>
@@ -2485,7 +2484,7 @@
               <w:jc w:val="left"/>
             </w:pPr>
             <w:r>
-              <w:t>Oddělit personal/workspace/org tasky.</w:t>
+              <w:t>Postavit plnohodnotný sidebar modul.</w:t>
             </w:r>
           </w:p>
         </w:tc>
@@ -2506,7 +2505,7 @@
               <w:jc w:val="left"/>
             </w:pPr>
             <w:r>
-              <w:t>Migrace DB, RLS policy testy, typy a API kontrakt.</w:t>
+              <w:t>Inbox, Dnes, Nadcházející, Důležité, Hotovo, detail úkolu.</w:t>
             </w:r>
           </w:p>
         </w:tc>
@@ -2527,7 +2526,7 @@
               <w:jc w:val="left"/>
             </w:pPr>
             <w:r>
-              <w:t>Negativní RLS testy pro cross-user/cross-org přístup.</w:t>
+              <w:t>Component/integration testy a mobile viewport kontrola.</w:t>
             </w:r>
           </w:p>
         </w:tc>
@@ -2550,7 +2549,7 @@
               <w:jc w:val="center"/>
             </w:pPr>
             <w:r>
-              <w:t>3: Solo PWA</w:t>
+              <w:t>3: Podúkoly UX</w:t>
             </w:r>
           </w:p>
         </w:tc>
@@ -2571,7 +2570,7 @@
               <w:jc w:val="left"/>
             </w:pPr>
             <w:r>
-              <w:t>Telefonní klient bez nativní složitosti.</w:t>
+              <w:t>Dodat checklist workflow.</w:t>
             </w:r>
           </w:p>
         </w:tc>
@@ -2592,7 +2591,7 @@
               <w:jc w:val="left"/>
             </w:pPr>
             <w:r>
-              <w:t>Responzivní PWA s quick capture, offline frontou a loginem.</w:t>
+              <w:t>Přidání, editace, dokončení, reorder podúkolů.</w:t>
             </w:r>
           </w:p>
         </w:tc>
@@ -2613,7 +2612,7 @@
               <w:jc w:val="left"/>
             </w:pPr>
             <w:r>
-              <w:t>E2E testy mobile viewport + offline queue testy.</w:t>
+              <w:t>Unit testy modelu + UI test dokončení podúkolu.</w:t>
             </w:r>
           </w:p>
         </w:tc>
@@ -2636,7 +2635,7 @@
               <w:jc w:val="center"/>
             </w:pPr>
             <w:r>
-              <w:t>4: Sync engine</w:t>
+              <w:t>4: Command Center</w:t>
             </w:r>
           </w:p>
         </w:tc>
@@ -2657,7 +2656,7 @@
               <w:jc w:val="left"/>
             </w:pPr>
             <w:r>
-              <w:t>Externí providery jako volitelná vrstva.</w:t>
+              <w:t>Propis osobních úkolů do akční fronty.</w:t>
             </w:r>
           </w:p>
         </w:tc>
@@ -2678,7 +2677,7 @@
               <w:jc w:val="left"/>
             </w:pPr>
             <w:r>
-              <w:t>Server-side sync job, OAuth vault, sync_status UI.</w:t>
+              <w:t>Řazení podle due_at/priority, odkaz do detailu.</w:t>
             </w:r>
           </w:p>
         </w:tc>
@@ -2699,7 +2698,7 @@
               <w:jc w:val="left"/>
             </w:pPr>
             <w:r>
-              <w:t>Security review OAuth toku + konfliktové testy.</w:t>
+              <w:t>Action queue merge testy a regresní test kalendáře.</w:t>
             </w:r>
           </w:p>
         </w:tc>
@@ -2722,7 +2721,7 @@
               <w:jc w:val="center"/>
             </w:pPr>
             <w:r>
-              <w:t>5: Nativní app</w:t>
+              <w:t>5: Budoucí rozšíření</w:t>
             </w:r>
           </w:p>
         </w:tc>
@@ -2743,7 +2742,7 @@
               <w:jc w:val="left"/>
             </w:pPr>
             <w:r>
-              <w:t>Rozhodnout, zda PWA nestačí.</w:t>
+              <w:t>Vyhodnotit PWA nebo externí sync.</w:t>
             </w:r>
           </w:p>
         </w:tc>
@@ -2764,7 +2763,7 @@
               <w:jc w:val="left"/>
             </w:pPr>
             <w:r>
-              <w:t>Capacitor/React Native/Swift podle reálného využití.</w:t>
+              <w:t>Rozhodnutí podle reálného používání modulu.</w:t>
             </w:r>
           </w:p>
         </w:tc>
@@ -2785,7 +2784,7 @@
               <w:jc w:val="left"/>
             </w:pPr>
             <w:r>
-              <w:t>Produktová metrika: pravidelné používání v telefonu.</w:t>
+              <w:t>Bezpečnostní review OAuth/sync toku před implementací.</w:t>
             </w:r>
           </w:p>
         </w:tc>
@@ -2797,7 +2796,7 @@
         <w:pStyle w:val="Heading1"/>
       </w:pPr>
       <w:r>
-        <w:t>9. MVP rozsah</w:t>
+        <w:t>10. MVP rozsah</w:t>
       </w:r>
     </w:p>
     <w:p>
@@ -2805,7 +2804,7 @@
         <w:pStyle w:val="Heading2"/>
       </w:pPr>
       <w:r>
-        <w:t>9.1 MVP v Tender-Flow</w:t>
+        <w:t>10.1 Must-have</w:t>
       </w:r>
     </w:p>
     <w:p>
@@ -2814,7 +2813,7 @@
         <w:spacing w:after="160" w:line="280" w:lineRule="auto"/>
       </w:pPr>
       <w:r>
-        <w:t>Inbox pro rychlé úkoly bez projektu.</w:t>
+        <w:t>Sidebar položka TODO a routa/pohled modulu.</w:t>
       </w:r>
     </w:p>
     <w:p>
@@ -2823,7 +2822,7 @@
         <w:spacing w:after="160" w:line="280" w:lineRule="auto"/>
       </w:pPr>
       <w:r>
-        <w:t>Today/Upcoming pohled nad due_at.</w:t>
+        <w:t>Inbox, Dnes, Nadcházející, Důležité, Hotovo.</w:t>
       </w:r>
     </w:p>
     <w:p>
@@ -2832,7 +2831,7 @@
         <w:spacing w:after="160" w:line="280" w:lineRule="auto"/>
       </w:pPr>
       <w:r>
-        <w:t>Přiřazení tasku ke kontextu: project, bid, contract, document.</w:t>
+        <w:t>Rychlé přidání úkolu, editace detailu, dokončení, znovuotevření, smazání.</w:t>
       </w:r>
     </w:p>
     <w:p>
@@ -2841,7 +2840,7 @@
         <w:spacing w:after="160" w:line="280" w:lineRule="auto"/>
       </w:pPr>
       <w:r>
-        <w:t>Priorita 1-4, dokončení, znovuotevření, editace poznámky.</w:t>
+        <w:t>Podúkoly: přidat, přejmenovat, dokončit, smazat, změnit pořadí v rámci rodiče.</w:t>
       </w:r>
     </w:p>
     <w:p>
@@ -2850,15 +2849,7 @@
         <w:spacing w:after="160" w:line="280" w:lineRule="auto"/>
       </w:pPr>
       <w:r>
-        <w:t>Zobrazení tasků v Command Center a Calendaru bez duplicit.</w:t>
-      </w:r>
-    </w:p>
-    <w:p>
-      <w:pPr>
-        <w:pStyle w:val="Heading2"/>
-      </w:pPr>
-      <w:r>
-        <w:t>9.2 MVP samostatné Todo aplikace</w:t>
+        <w:t>Volitelná vazba na Tender-Flow kontext: project_id a related_entity.</w:t>
       </w:r>
     </w:p>
     <w:p>
@@ -2867,7 +2858,15 @@
         <w:spacing w:after="160" w:line="280" w:lineRule="auto"/>
       </w:pPr>
       <w:r>
-        <w:t>Rychlé přidání úkolu na telefonu do Inboxu.</w:t>
+        <w:t>Props otevřených osobních úkolů do Command Center a Calendar signálů.</w:t>
+      </w:r>
+    </w:p>
+    <w:p>
+      <w:pPr>
+        <w:pStyle w:val="Heading2"/>
+      </w:pPr>
+      <w:r>
+        <w:t>10.2 Explicitně mimo MVP</w:t>
       </w:r>
     </w:p>
     <w:p>
@@ -2876,7 +2875,7 @@
         <w:spacing w:after="160" w:line="280" w:lineRule="auto"/>
       </w:pPr>
       <w:r>
-        <w:t>Dnes, Nadcházející, Hotovo, Bez termínu.</w:t>
+        <w:t>Týmové nebo organizační sdílení úkolů.</w:t>
       </w:r>
     </w:p>
     <w:p>
@@ -2885,7 +2884,7 @@
         <w:spacing w:after="160" w:line="280" w:lineRule="auto"/>
       </w:pPr>
       <w:r>
-        <w:t>Offline fronta vytvoření/dokončení/editace.</w:t>
+        <w:t>Víceúrovňový strom podúkolů bez limitu.</w:t>
       </w:r>
     </w:p>
     <w:p>
@@ -2894,7 +2893,7 @@
         <w:spacing w:after="160" w:line="280" w:lineRule="auto"/>
       </w:pPr>
       <w:r>
-        <w:t>Jasný přepínač Personal / Tender-Flow workspace, pokud je uživatel v organizaci.</w:t>
+        <w:t>Externí obousměrný sync s Todoist/Microsoft To Do/Apple Reminders.</w:t>
       </w:r>
     </w:p>
     <w:p>
@@ -2903,7 +2902,16 @@
         <w:spacing w:after="160" w:line="280" w:lineRule="auto"/>
       </w:pPr>
       <w:r>
-        <w:t>Sdílené přihlášení přes stejný Supabase auth model.</w:t>
+        <w:t>Samostatná nativní mobilní aplikace.</w:t>
+      </w:r>
+    </w:p>
+    <w:p>
+      <w:pPr>
+        <w:pStyle w:val="ListBullet"/>
+        <w:spacing w:after="160" w:line="280" w:lineRule="auto"/>
+      </w:pPr>
+      <w:r>
+        <w:t>Automatické vytváření úkolů z každé systémové akce bez ruční kontroly.</w:t>
       </w:r>
     </w:p>
     <w:p>
@@ -2911,7 +2919,7 @@
         <w:pStyle w:val="Heading1"/>
       </w:pPr>
       <w:r>
-        <w:t>10. Testovací a kvalitativní plán</w:t>
+        <w:t>11. Testovací a kvalitativní plán</w:t>
       </w:r>
     </w:p>
     <w:tbl>
@@ -3020,7 +3028,7 @@
               <w:jc w:val="left"/>
             </w:pPr>
             <w:r>
-              <w:t>Mapování TaskRow -&gt; Task, validace vstupu, řazení action queue, konfliktové helpery.</w:t>
+              <w:t>Mapování TaskRow -&gt; Task, parent/subtask helpery, řazení podúkolů, action queue priorita.</w:t>
             </w:r>
           </w:p>
         </w:tc>
@@ -3064,7 +3072,7 @@
               <w:jc w:val="left"/>
             </w:pPr>
             <w:r>
-              <w:t>create/update/delete/list proti mockované Supabase vrstvě a React Query invalidace.</w:t>
+              <w:t>create/update/delete/list pro root úkoly i podúkoly proti mockované Supabase vrstvě.</w:t>
             </w:r>
           </w:p>
         </w:tc>
@@ -3108,7 +3116,7 @@
               <w:jc w:val="left"/>
             </w:pPr>
             <w:r>
-              <w:t>Uživatel A nečte ani nemění úkol uživatele B; organization role neuvidí mimo scope.</w:t>
+              <w:t>Uživatel A nečte, nemění a ani nepřidá podúkol pod úkol uživatele B.</w:t>
             </w:r>
           </w:p>
         </w:tc>
@@ -3131,7 +3139,7 @@
               <w:jc w:val="left"/>
             </w:pPr>
             <w:r>
-              <w:t>Sync</w:t>
+              <w:t>UI</w:t>
             </w:r>
           </w:p>
         </w:tc>
@@ -3152,7 +3160,7 @@
               <w:jc w:val="left"/>
             </w:pPr>
             <w:r>
-              <w:t>Idempotentní opakování mutací, external_id uniqueness, pending/error retry a konflikt.</w:t>
+              <w:t>Inbox/Dnes/Nadcházející/Hotovo, detail úkolu, checklist podúkolů, loading/disabled/error stavy.</w:t>
             </w:r>
           </w:p>
         </w:tc>
@@ -3175,7 +3183,7 @@
               <w:jc w:val="left"/>
             </w:pPr>
             <w:r>
-              <w:t>E2E</w:t>
+              <w:t>Command Center</w:t>
             </w:r>
           </w:p>
         </w:tc>
@@ -3196,7 +3204,7 @@
               <w:jc w:val="left"/>
             </w:pPr>
             <w:r>
-              <w:t>Mobile quick-add, offline vytvoření, návrat online, zobrazení v Tender-Flow Command Center.</w:t>
+              <w:t>Root úkoly se zobrazí správně, podúkoly nezahltí frontu, P1/due podúkol má jasné chování.</w:t>
             </w:r>
           </w:p>
         </w:tc>
@@ -3240,7 +3248,7 @@
               <w:jc w:val="left"/>
             </w:pPr>
             <w:r>
-              <w:t>npm run check:boundaries, npm run check:legacy-structure, npm run test:run a build.</w:t>
+              <w:t>npm run check:boundaries, npm run check:legacy-structure, npm run test:run a npm run build.</w:t>
             </w:r>
           </w:p>
         </w:tc>
@@ -3252,7 +3260,7 @@
         <w:pStyle w:val="Heading1"/>
       </w:pPr>
       <w:r>
-        <w:t>11. Otevřená rozhodnutí</w:t>
+        <w:t>12. Otevřená rozhodnutí</w:t>
       </w:r>
     </w:p>
     <w:p>
@@ -3261,7 +3269,7 @@
         <w:spacing w:after="160" w:line="280" w:lineRule="auto"/>
       </w:pPr>
       <w:r>
-        <w:t>Má být osobní Todo aplikace součást stejné Supabase instance, nebo oddělený projekt s federací? Doporučení: stejná instance, ale jasný scope model.</w:t>
+        <w:t>Má MVP povolit pouze jednu úroveň podúkolů? Doporučení: ano, kvůli jednoduchosti UI, RLS a Command Center props.</w:t>
       </w:r>
     </w:p>
     <w:p>
@@ -3270,7 +3278,7 @@
         <w:spacing w:after="160" w:line="280" w:lineRule="auto"/>
       </w:pPr>
       <w:r>
-        <w:t>Má organizace vidět osobní úkoly uživatele? Doporučení: nikdy implicitně; pouze explicitně převedené nebo vytvořené ve workspace scope.</w:t>
+        <w:t>Má dokončení všech podúkolů automaticky dokončit rodiče? Doporučení: ne automaticky; nabídnout akci nebo indikátor progressu.</w:t>
       </w:r>
     </w:p>
     <w:p>
@@ -3279,7 +3287,7 @@
         <w:spacing w:after="160" w:line="280" w:lineRule="auto"/>
       </w:pPr>
       <w:r>
-        <w:t>Má být první mobilní varianta PWA, nebo nativní app? Doporučení: PWA, dokud nejsou potvrzené každodenní mobilní workflow návyky.</w:t>
+        <w:t>Mají se podúkoly s vlastním termínem zobrazit v Dnes a Command Center? Doporučení: ano, ale vizuálně pod rodičem.</w:t>
       </w:r>
     </w:p>
     <w:p>
@@ -3288,7 +3296,7 @@
         <w:spacing w:after="160" w:line="280" w:lineRule="auto"/>
       </w:pPr>
       <w:r>
-        <w:t>Který externí provider jako první? Doporučení: žádný v MVP; později vybrat podle osobního reálného používání, ne podle technické atraktivity.</w:t>
+        <w:t>Má mít TODO vlastní štítky/labels jako Todoist? Doporučení: až po MVP, nejdřív priority a pohledy.</w:t>
       </w:r>
     </w:p>
     <w:p>
@@ -3297,7 +3305,7 @@
         <w:spacing w:after="160" w:line="280" w:lineRule="auto"/>
       </w:pPr>
       <w:r>
-        <w:t>Jak řešit notifikace? Doporučení: nejdřív interní reminders/due views, push až po stabilním používání.</w:t>
+        <w:t>Má být vazba na stavbu/projekt povinná? Doporučení: ne, personal Inbox musí fungovat bez kontextu.</w:t>
       </w:r>
     </w:p>
     <w:p>
@@ -3305,7 +3313,7 @@
         <w:pStyle w:val="Heading1"/>
       </w:pPr>
       <w:r>
-        <w:t>12. Praktický první krok</w:t>
+        <w:t>13. Praktický první krok</w:t>
       </w:r>
     </w:p>
     <w:tbl>
@@ -3343,7 +3351,6 @@
               <w:rPr>
                 <w:b/>
                 <w:color w:val="7A5A00"/>
-                <w:sz w:val="22"/>
               </w:rPr>
               <w:t>Nejbližší implementační krok</w:t>
             </w:r>
@@ -3353,7 +3360,7 @@
               <w:spacing w:after="0" w:line="264" w:lineRule="auto"/>
             </w:pPr>
             <w:r>
-              <w:t>Vytvořit malý produktový slice v Tender-Flow: Inbox + Today nad existující tasks tabulkou, doplnit testy pro API/hooky a ověřit, že uživateli stačí workflow pro každodenní zachytávání úkolů. Teprve po tom navrhnout solo PWA shell.</w:t>
+              <w:t>Začít datovým a UI slice: migrace pro podúkoly, personal RLS validace, sidebar registrace TODO modulu a první pohled Inbox + Dnes. Až poté napojit Command Center props, aby se nezamíchala doménová logika do agregátoru.</w:t>
             </w:r>
           </w:p>
         </w:tc>
@@ -3366,7 +3373,7 @@
         <w:spacing w:after="160" w:line="280" w:lineRule="auto"/>
       </w:pPr>
       <w:r>
-        <w:t>Sepsat konkrétní user stories pro Inbox, Today a task detail.</w:t>
+        <w:t>Sepsat user stories pro Inbox, Dnes, detail úkolu a podúkoly.</w:t>
       </w:r>
     </w:p>
     <w:p>
@@ -3375,7 +3382,7 @@
         <w:spacing w:after="160" w:line="280" w:lineRule="auto"/>
       </w:pPr>
       <w:r>
-        <w:t>Navrhnout DB rozšíření pro personal/workspace scope, ale nenasazovat ho bez RLS testů.</w:t>
+        <w:t>Navrhnout migraci parent_task_id, sort_order, indexy a bezpečnostní validaci rodiče.</w:t>
       </w:r>
     </w:p>
     <w:p>
@@ -3384,7 +3391,7 @@
         <w:spacing w:after="160" w:line="280" w:lineRule="auto"/>
       </w:pPr>
       <w:r>
-        <w:t>Doplnit testy existující tasks API a action queue merge.</w:t>
+        <w:t>Doplnit typy Task/TaskCreateInput/TaskUpdateInput o parentTaskId a sortOrder.</w:t>
       </w:r>
     </w:p>
     <w:p>
@@ -3393,7 +3400,7 @@
         <w:spacing w:after="160" w:line="280" w:lineRule="auto"/>
       </w:pPr>
       <w:r>
-        <w:t>Vyrobit první UI slice v souladu s feature boundary pravidly.</w:t>
+        <w:t>Postavit sidebar route a základní TODO modul podle feature boundary pravidel.</w:t>
       </w:r>
     </w:p>
     <w:p>
@@ -3402,7 +3409,7 @@
         <w:spacing w:after="160" w:line="280" w:lineRule="auto"/>
       </w:pPr>
       <w:r>
-        <w:t>Po používání 1-2 týdny rozhodnout, zda solo klient má být PWA nebo nativní aplikace.</w:t>
+        <w:t>Doplnit testy pro personal scope, podúkoly a props do Command Center.</w:t>
       </w:r>
     </w:p>
     <w:p>
@@ -3421,30 +3428,61 @@
     <w:p>
       <w:pPr>
         <w:pStyle w:val="ListBullet"/>
+        <w:spacing w:after="160" w:line="280" w:lineRule="auto"/>
       </w:pPr>
       <w:r>
-        <w:t>Je potvrzeno, že shared task core je zdroj pravdy.</w:t>
+        <w:t>Je potvrzeno, že TODO je personal scope, ne org/workspace modul.</w:t>
       </w:r>
     </w:p>
     <w:p>
       <w:pPr>
         <w:pStyle w:val="ListBullet"/>
+        <w:spacing w:after="160" w:line="280" w:lineRule="auto"/>
       </w:pPr>
       <w:r>
-        <w:t>Je rozhodnutý scope model: personal vs workspace vs organization.</w:t>
+        <w:t>Sidebar položka TODO je součástí návrhu navigace.</w:t>
       </w:r>
     </w:p>
     <w:p>
       <w:pPr>
         <w:pStyle w:val="ListBullet"/>
+        <w:spacing w:after="160" w:line="280" w:lineRule="auto"/>
       </w:pPr>
       <w:r>
-        <w:t>Existují RLS testy pro negativní scénáře.</w:t>
+        <w:t>Datový model má parent_task_id, sort_order a test bezpečné vazby rodič-dítě.</w:t>
       </w:r>
     </w:p>
     <w:p>
       <w:pPr>
         <w:pStyle w:val="ListBullet"/>
+        <w:spacing w:after="160" w:line="280" w:lineRule="auto"/>
+      </w:pPr>
+      <w:r>
+        <w:t>RLS brání vytvoření podúkolu pod cizím úkolem.</w:t>
+      </w:r>
+    </w:p>
+    <w:p>
+      <w:pPr>
+        <w:pStyle w:val="ListBullet"/>
+        <w:spacing w:after="160" w:line="280" w:lineRule="auto"/>
+      </w:pPr>
+      <w:r>
+        <w:t>Command Center je konzument úkolů, ne primární správce TODO modulu.</w:t>
+      </w:r>
+    </w:p>
+    <w:p>
+      <w:pPr>
+        <w:pStyle w:val="ListBullet"/>
+        <w:spacing w:after="160" w:line="280" w:lineRule="auto"/>
+      </w:pPr>
+      <w:r>
+        <w:t>Podúkoly mají jasné chování pro dokončení, řazení a zobrazení v Dnes.</w:t>
+      </w:r>
+    </w:p>
+    <w:p>
+      <w:pPr>
+        <w:pStyle w:val="ListBullet"/>
+        <w:spacing w:after="160" w:line="280" w:lineRule="auto"/>
       </w:pPr>
       <w:r>
         <w:t>UI nepřidává nové soubory do legacy freeze roots bez aktualizace snapshotu.</w:t>
@@ -3453,30 +3491,7 @@
     <w:p>
       <w:pPr>
         <w:pStyle w:val="ListBullet"/>
-      </w:pPr>
-      <w:r>
-        <w:t>Klient neukládá provider OAuth tokeny.</w:t>
-      </w:r>
-    </w:p>
-    <w:p>
-      <w:pPr>
-        <w:pStyle w:val="ListBullet"/>
-      </w:pPr>
-      <w:r>
-        <w:t>Každá nová task mutace invaliduje správné React Query klíče.</w:t>
-      </w:r>
-    </w:p>
-    <w:p>
-      <w:pPr>
-        <w:pStyle w:val="ListBullet"/>
-      </w:pPr>
-      <w:r>
-        <w:t>Mobile viewport má ověřené texty, tap targety a disabled/loading stavy.</w:t>
-      </w:r>
-    </w:p>
-    <w:p>
-      <w:pPr>
-        <w:pStyle w:val="ListBullet"/>
+        <w:spacing w:after="160" w:line="280" w:lineRule="auto"/>
       </w:pPr>
       <w:r>
         <w:t>Před PR projde test:run, check:boundaries, check:legacy-structure a build.</w:t>
@@ -3505,7 +3520,7 @@
         <w:color w:val="595959"/>
         <w:sz w:val="18"/>
       </w:rPr>
-      <w:t xml:space="preserve">Tender Flow | Todo strategie | strana </w:t>
+      <w:t xml:space="preserve">Tender Flow | TODO modul | strana </w:t>
     </w:r>
     <w:fldChar w:fldCharType="begin"/>
     <w:instrText xml:space="preserve">PAGE</w:instrText>
@@ -3878,7 +3893,7 @@
     <w:qFormat/>
     <w:rsid w:val="00FC693F"/>
     <w:pPr>
-      <w:spacing w:after="120" w:line="264" w:lineRule="auto"/>
+      <w:spacing w:before="0" w:after="120" w:line="264" w:lineRule="auto"/>
     </w:pPr>
     <w:rPr>
       <w:rFonts w:ascii="Calibri" w:hAnsi="Calibri" w:eastAsia="Calibri"/>
@@ -3941,7 +3956,7 @@
     <w:pPr>
       <w:keepNext/>
       <w:keepLines/>
-      <w:spacing w:before="320" w:after="160"/>
+      <w:spacing w:before="320" w:after="160" w:line="264" w:lineRule="auto"/>
       <w:outlineLvl w:val="0"/>
     </w:pPr>
     <w:rPr>
@@ -3965,7 +3980,7 @@
     <w:pPr>
       <w:keepNext/>
       <w:keepLines/>
-      <w:spacing w:before="240" w:after="120"/>
+      <w:spacing w:before="240" w:after="120" w:line="264" w:lineRule="auto"/>
       <w:outlineLvl w:val="1"/>
     </w:pPr>
     <w:rPr>
@@ -3989,7 +4004,7 @@
     <w:pPr>
       <w:keepNext/>
       <w:keepLines/>
-      <w:spacing w:before="160" w:after="80"/>
+      <w:spacing w:before="160" w:after="80" w:line="264" w:lineRule="auto"/>
       <w:outlineLvl w:val="2"/>
     </w:pPr>
     <w:rPr>
@@ -4231,7 +4246,7 @@
       <w:pBdr>
         <w:bottom w:val="single" w:sz="8" w:space="4" w:color="4F81BD" w:themeColor="accent1"/>
       </w:pBdr>
-      <w:spacing w:after="80" w:line="240" w:lineRule="auto"/>
+      <w:spacing w:after="80" w:line="264" w:lineRule="auto" w:before="0"/>
       <w:contextualSpacing/>
     </w:pPr>
     <w:rPr>
@@ -4270,7 +4285,7 @@
       <w:numPr>
         <w:ilvl w:val="1"/>
       </w:numPr>
-      <w:spacing w:after="320"/>
+      <w:spacing w:before="0" w:after="320" w:line="264" w:lineRule="auto"/>
     </w:pPr>
     <w:rPr>
       <w:rFonts w:asciiTheme="majorHAnsi" w:eastAsiaTheme="majorEastAsia" w:hAnsiTheme="majorHAnsi" w:cstheme="majorBidi" w:ascii="Calibri" w:hAnsi="Calibri" w:eastAsia="Calibri"/>

</xml_diff>

<commit_message>
add tasks workspace and marketing updates (#145)
</commit_message>
<xml_diff>
--- a/docs/todo-app-strategie-tender-flow.docx
+++ b/docs/todo-app-strategie-tender-flow.docx
@@ -7,7 +7,7 @@
         <w:pStyle w:val="Title"/>
       </w:pPr>
       <w:r>
-        <w:t>Todo aplikace a Tender-Flow</w:t>
+        <w:t>TODO modul v Tender-Flow</w:t>
       </w:r>
     </w:p>
     <w:p>
@@ -15,7 +15,7 @@
         <w:pStyle w:val="Subtitle"/>
       </w:pPr>
       <w:r>
-        <w:t>Mapa nápadu, variant a doporučené cesty k samostatnému todo klientu propojenému s Tender-Flow</w:t>
+        <w:t>Produktová a technická mapa pro personal TODO modul v sidebaru, inspirovaný Todoist a Microsoft To Do</w:t>
       </w:r>
     </w:p>
     <w:p>
@@ -27,7 +27,7 @@
           <w:color w:val="595959"/>
           <w:sz w:val="20"/>
         </w:rPr>
-        <w:t>Verze: pracovní návrh | Datum: 17. 5. 2026 | Určení: produktové a technické rozhodnutí</w:t>
+        <w:t>Verze: aktualizovaný pracovní návrh | Datum: 17. 5. 2026 | Určení: produktové a technické rozhodnutí</w:t>
       </w:r>
     </w:p>
     <w:tbl>
@@ -65,9 +65,8 @@
               <w:rPr>
                 <w:b/>
                 <w:color w:val="205F3C"/>
-                <w:sz w:val="22"/>
               </w:rPr>
-              <w:t>Krátké doporučení</w:t>
+              <w:t>Aktualizované rozhodnutí</w:t>
             </w:r>
           </w:p>
           <w:p>
@@ -75,7 +74,7 @@
               <w:spacing w:after="0" w:line="264" w:lineRule="auto"/>
             </w:pPr>
             <w:r>
-              <w:t>Nezačínat izolovanou Todo aplikací bez společného základu. Tender-Flow už má lehkou task vrstvu, Supabase tabulku tasks, RLS per-user model, UI v Command Center a sync metadata připravená pro externí providery. Nejrozumnější cesta je udělat z toho stabilní task core a nad ním postupně postavit samostatný mobilní/PWA klient.</w:t>
+              <w:t>TODO bude samostatný modul v Tender-Flow sidebaru, podobně jako Správa staveb. Scope je personal: úkol patří konkrétnímu uživateli a není týmově sdílený. Úkoly včetně podúkolů se budou propisovat do Command Center jako osobní akční fronta. Návrh UX má být inspirovaný rychlostí Todoist a jednoduchostí Microsoft To Do.</w:t>
             </w:r>
           </w:p>
         </w:tc>
@@ -87,12 +86,12 @@
         <w:pStyle w:val="Heading1"/>
       </w:pPr>
       <w:r>
-        <w:t>1. Výchozí otázka</w:t>
+        <w:t>1. Produktový záměr</w:t>
       </w:r>
     </w:p>
     <w:p>
       <w:r>
-        <w:t>Cíl není jen vytvořit další seznam úkolů. Cíl je mít osobní a pracovní úkoly dostupné v telefonu, na desktopu i uvnitř Tender-Flow tak, aby se uživatel nemusel rozhodovat, ve které aplikaci úkol vznikl. Zároveň musí být jasné, kde leží zdroj pravdy, jak se řeší synchronizace a jak se zabrání míchání osobních dat s firemními daty.</w:t>
+        <w:t>Cíl je vytvořit plnohodnotný personal TODO modul uvnitř Tender-Flow, ne pouze pomocný quick-add v Command Center. Modul má být samostatně dostupný v hlavním sidebaru, používatelný každý den a současně přirozeně propojený s existujícím pracovním kontextem Tender-Flow.</w:t>
       </w:r>
     </w:p>
     <w:p>
@@ -101,7 +100,7 @@
         <w:spacing w:after="160" w:line="280" w:lineRule="auto"/>
       </w:pPr>
       <w:r>
-        <w:t>Osobní potřeba: rychle zachytit úkol kdykoli, hlavně z telefonu.</w:t>
+        <w:t>Personal scope: každý úkol a podúkol patří konkrétnímu uživateli přes created_by.</w:t>
       </w:r>
     </w:p>
     <w:p>
@@ -110,7 +109,7 @@
         <w:spacing w:after="160" w:line="280" w:lineRule="auto"/>
       </w:pPr>
       <w:r>
-        <w:t>Tender-Flow potřeba: navázat úkoly na projekty, nabídky, dokumenty, smlouvy a Command Center.</w:t>
+        <w:t>Sidebar modul: TODO bude navigační položka na stejné úrovni jako moduly typu Správa staveb.</w:t>
       </w:r>
     </w:p>
     <w:p>
@@ -119,7 +118,7 @@
         <w:spacing w:after="160" w:line="280" w:lineRule="auto"/>
       </w:pPr>
       <w:r>
-        <w:t>Produktová potřeba: nevytvořit dvě aplikace se dvěma rozdílnými modely, které se později budou špatně slučovat.</w:t>
+        <w:t>Command Center: úkoly se propíšou do akční fronty, ale Command Center nebude hlavní místo správy TODO.</w:t>
       </w:r>
     </w:p>
     <w:p>
@@ -128,7 +127,16 @@
         <w:spacing w:after="160" w:line="280" w:lineRule="auto"/>
       </w:pPr>
       <w:r>
-        <w:t>Bezpečnostní potřeba: oddělit osobní a organizační rozsah, vynutit RLS, hlídat tenant isolation a neukládat integrační tokeny do klienta.</w:t>
+        <w:t>Podúkoly: každý úkol může být rozpadnutý na menší kroky, které lze samostatně dokončovat a řadit.</w:t>
+      </w:r>
+    </w:p>
+    <w:p>
+      <w:pPr>
+        <w:pStyle w:val="ListBullet"/>
+        <w:spacing w:after="160" w:line="280" w:lineRule="auto"/>
+      </w:pPr>
+      <w:r>
+        <w:t>UX inspirace: Todoist pro rychlé pořizování, priority a filtry; Microsoft To Do pro přehled Dnes, jednoduchost a plánování.</w:t>
       </w:r>
     </w:p>
     <w:p>
@@ -141,7 +149,7 @@
     </w:p>
     <w:p>
       <w:r>
-        <w:t>V repozitáři už existuje základ, na kterém se dá stavět. To zásadně mění rozhodnutí: nejde o čistě zelenou louku, ale o rozšíření existující doménové vrstvy.</w:t>
+        <w:t>V repozitáři už existuje základ, na kterém se dá stavět. To mění rozhodnutí z čisté zelené louky na rozšíření existující doménové vrstvy.</w:t>
       </w:r>
     </w:p>
     <w:tbl>
@@ -232,7 +240,7 @@
                 <w:b/>
                 <w:color w:val="1F4D78"/>
               </w:rPr>
-              <w:t>Dopad na rozhodnutí</w:t>
+              <w:t>Dopad na návrh</w:t>
             </w:r>
           </w:p>
         </w:tc>
@@ -297,7 +305,7 @@
               <w:jc w:val="left"/>
             </w:pPr>
             <w:r>
-              <w:t>Model je vhodný jako V1 jádro, ale bude potřebovat scope/workspace rozšíření před samostatnou aplikací.</w:t>
+              <w:t>Použít jako V1 personal základ. Doplnit parent/subtask strukturu, sort_order a případně depth guard.</w:t>
             </w:r>
           </w:p>
         </w:tc>
@@ -362,7 +370,7 @@
               <w:jc w:val="left"/>
             </w:pPr>
             <w:r>
-              <w:t>Dobré pro osobní úkoly, ale před team/org režimem musí být jasně navržené organizace a oprávnění.</w:t>
+              <w:t>To odpovídá rozhodnutí personal scope. MVP nemá zavádět týmové/org sdílení úkolů.</w:t>
             </w:r>
           </w:p>
         </w:tc>
@@ -427,7 +435,7 @@
               <w:jc w:val="left"/>
             </w:pPr>
             <w:r>
-              <w:t>Integrace do Tender-Flow už začala. Není nutné vyvíjet úplně separátní UI základ.</w:t>
+              <w:t>Zachovat jako doménový základ, ale doplnit plnohodnotný TODO modul v routingu a sidebaru.</w:t>
             </w:r>
           </w:p>
         </w:tc>
@@ -450,7 +458,7 @@
               <w:jc w:val="center"/>
             </w:pPr>
             <w:r>
-              <w:t>Synchronizace</w:t>
+              <w:t>Command Center</w:t>
             </w:r>
           </w:p>
         </w:tc>
@@ -471,7 +479,7 @@
               <w:jc w:val="left"/>
             </w:pPr>
             <w:r>
-              <w:t>Ve schématu jsou external_id, external_provider, external_url, last_synced_at, sync_status, sync_error.</w:t>
+              <w:t>Action queue už umí kombinovat derivované akce a uživatelské tasky.</w:t>
             </w:r>
           </w:p>
         </w:tc>
@@ -492,7 +500,7 @@
               <w:jc w:val="left"/>
             </w:pPr>
             <w:r>
-              <w:t>Datový model počítá s V2 integrací, ale chybí sync engine, konflikty a token handling.</w:t>
+              <w:t>Command Center bude konzument osobních úkolů a jejich prioritizace, ne primární editor.</w:t>
             </w:r>
           </w:p>
         </w:tc>
@@ -504,16 +512,14 @@
         <w:pStyle w:val="Heading1"/>
       </w:pPr>
       <w:r>
-        <w:t>3. Varianty řešení</w:t>
+        <w:t>3. Rozhodnuté produktové principy</w:t>
       </w:r>
     </w:p>
     <w:tbl>
       <w:tblGrid>
-        <w:gridCol w:w="900"/>
-        <w:gridCol w:w="2450"/>
-        <w:gridCol w:w="2050"/>
-        <w:gridCol w:w="2300"/>
-        <w:gridCol w:w="1660"/>
+        <w:gridCol w:w="1600"/>
+        <w:gridCol w:w="2600"/>
+        <w:gridCol w:w="5160"/>
       </w:tblGrid>
       <w:tblPr>
         <w:tblStyle w:val="TableGrid"/>
@@ -528,7 +534,7 @@
         </w:trPr>
         <w:tc>
           <w:tcPr>
-            <w:tcW w:type="dxa" w:w="900"/>
+            <w:tcW w:type="dxa" w:w="1600"/>
             <w:tcMar>
               <w:top w:w="80" w:type="dxa"/>
               <w:start w:w="120" w:type="dxa"/>
@@ -547,13 +553,13 @@
                 <w:b/>
                 <w:color w:val="1F4D78"/>
               </w:rPr>
-              <w:t>Varianta</w:t>
+              <w:t>Princip</w:t>
             </w:r>
           </w:p>
         </w:tc>
         <w:tc>
           <w:tcPr>
-            <w:tcW w:type="dxa" w:w="2450"/>
+            <w:tcW w:type="dxa" w:w="2600"/>
             <w:tcMar>
               <w:top w:w="80" w:type="dxa"/>
               <w:start w:w="120" w:type="dxa"/>
@@ -572,13 +578,13 @@
                 <w:b/>
                 <w:color w:val="1F4D78"/>
               </w:rPr>
-              <w:t>Popis</w:t>
+              <w:t>Rozhodnutí</w:t>
             </w:r>
           </w:p>
         </w:tc>
         <w:tc>
           <w:tcPr>
-            <w:tcW w:type="dxa" w:w="2050"/>
+            <w:tcW w:type="dxa" w:w="5160"/>
             <w:tcMar>
               <w:top w:w="80" w:type="dxa"/>
               <w:start w:w="120" w:type="dxa"/>
@@ -597,57 +603,7 @@
                 <w:b/>
                 <w:color w:val="1F4D78"/>
               </w:rPr>
-              <w:t>Výhody</w:t>
-            </w:r>
-          </w:p>
-        </w:tc>
-        <w:tc>
-          <w:tcPr>
-            <w:tcW w:type="dxa" w:w="2300"/>
-            <w:tcMar>
-              <w:top w:w="80" w:type="dxa"/>
-              <w:start w:w="120" w:type="dxa"/>
-              <w:bottom w:w="80" w:type="dxa"/>
-              <w:end w:w="120" w:type="dxa"/>
-            </w:tcMar>
-            <w:vAlign w:val="center"/>
-            <w:shd w:fill="F2F4F7"/>
-          </w:tcPr>
-          <w:p>
-            <w:pPr>
-              <w:jc w:val="left"/>
-            </w:pPr>
-            <w:r>
-              <w:rPr>
-                <w:b/>
-                <w:color w:val="1F4D78"/>
-              </w:rPr>
-              <w:t>Rizika</w:t>
-            </w:r>
-          </w:p>
-        </w:tc>
-        <w:tc>
-          <w:tcPr>
-            <w:tcW w:type="dxa" w:w="1660"/>
-            <w:tcMar>
-              <w:top w:w="80" w:type="dxa"/>
-              <w:start w:w="120" w:type="dxa"/>
-              <w:bottom w:w="80" w:type="dxa"/>
-              <w:end w:w="120" w:type="dxa"/>
-            </w:tcMar>
-            <w:vAlign w:val="center"/>
-            <w:shd w:fill="F2F4F7"/>
-          </w:tcPr>
-          <w:p>
-            <w:pPr>
-              <w:jc w:val="center"/>
-            </w:pPr>
-            <w:r>
-              <w:rPr>
-                <w:b/>
-                <w:color w:val="1F4D78"/>
-              </w:rPr>
-              <w:t>Verdikt</w:t>
+              <w:t>Důvod</w:t>
             </w:r>
           </w:p>
         </w:tc>
@@ -655,7 +611,7 @@
       <w:tr>
         <w:tc>
           <w:tcPr>
-            <w:tcW w:type="dxa" w:w="900"/>
+            <w:tcW w:type="dxa" w:w="1600"/>
             <w:tcMar>
               <w:top w:w="80" w:type="dxa"/>
               <w:start w:w="120" w:type="dxa"/>
@@ -670,13 +626,13 @@
               <w:jc w:val="center"/>
             </w:pPr>
             <w:r>
-              <w:t>A</w:t>
+              <w:t>Samostatný modul</w:t>
             </w:r>
           </w:p>
         </w:tc>
         <w:tc>
           <w:tcPr>
-            <w:tcW w:type="dxa" w:w="2450"/>
+            <w:tcW w:type="dxa" w:w="2600"/>
             <w:tcMar>
               <w:top w:w="80" w:type="dxa"/>
               <w:start w:w="120" w:type="dxa"/>
@@ -691,13 +647,13 @@
               <w:jc w:val="left"/>
             </w:pPr>
             <w:r>
-              <w:t>Jen rozšířit Tender-Flow o lepší task modul.</w:t>
+              <w:t>TODO bude vlastní feature modul v sidebaru.</w:t>
             </w:r>
           </w:p>
         </w:tc>
         <w:tc>
           <w:tcPr>
-            <w:tcW w:type="dxa" w:w="2050"/>
+            <w:tcW w:type="dxa" w:w="5160"/>
             <w:tcMar>
               <w:top w:w="80" w:type="dxa"/>
               <w:start w:w="120" w:type="dxa"/>
@@ -712,13 +668,36 @@
               <w:jc w:val="left"/>
             </w:pPr>
             <w:r>
-              <w:t>Nejrychlejší, navazuje na existující kód, minimum sync komplexity.</w:t>
+              <w:t>Uživatel potřebuje plnou správu, pohledy, filtry, detail a podúkoly.</w:t>
+            </w:r>
+          </w:p>
+        </w:tc>
+      </w:tr>
+      <w:tr>
+        <w:tc>
+          <w:tcPr>
+            <w:tcW w:type="dxa" w:w="1600"/>
+            <w:tcMar>
+              <w:top w:w="80" w:type="dxa"/>
+              <w:start w:w="120" w:type="dxa"/>
+              <w:bottom w:w="80" w:type="dxa"/>
+              <w:end w:w="120" w:type="dxa"/>
+            </w:tcMar>
+            <w:vAlign w:val="center"/>
+          </w:tcPr>
+          <w:p>
+            <w:pPr>
+              <w:spacing w:after="0" w:line="264" w:lineRule="auto"/>
+              <w:jc w:val="center"/>
+            </w:pPr>
+            <w:r>
+              <w:t>Personal scope</w:t>
             </w:r>
           </w:p>
         </w:tc>
         <w:tc>
           <w:tcPr>
-            <w:tcW w:type="dxa" w:w="2300"/>
+            <w:tcW w:type="dxa" w:w="2600"/>
             <w:tcMar>
               <w:top w:w="80" w:type="dxa"/>
               <w:start w:w="120" w:type="dxa"/>
@@ -733,13 +712,36 @@
               <w:jc w:val="left"/>
             </w:pPr>
             <w:r>
-              <w:t>Telefonní použití může být slabé, pokud zůstane jen web/desktop workflow.</w:t>
+              <w:t>Úkoly nejsou týmové ani organizační.</w:t>
             </w:r>
           </w:p>
         </w:tc>
         <w:tc>
           <w:tcPr>
-            <w:tcW w:type="dxa" w:w="1660"/>
+            <w:tcW w:type="dxa" w:w="5160"/>
+            <w:tcMar>
+              <w:top w:w="80" w:type="dxa"/>
+              <w:start w:w="120" w:type="dxa"/>
+              <w:bottom w:w="80" w:type="dxa"/>
+              <w:end w:w="120" w:type="dxa"/>
+            </w:tcMar>
+            <w:vAlign w:val="center"/>
+          </w:tcPr>
+          <w:p>
+            <w:pPr>
+              <w:spacing w:after="0" w:line="264" w:lineRule="auto"/>
+              <w:jc w:val="left"/>
+            </w:pPr>
+            <w:r>
+              <w:t>Snižuje bezpečnostní riziko a odpovídá osobnímu způsobu práce.</w:t>
+            </w:r>
+          </w:p>
+        </w:tc>
+      </w:tr>
+      <w:tr>
+        <w:tc>
+          <w:tcPr>
+            <w:tcW w:type="dxa" w:w="1600"/>
             <w:tcMar>
               <w:top w:w="80" w:type="dxa"/>
               <w:start w:w="120" w:type="dxa"/>
@@ -754,7 +756,49 @@
               <w:jc w:val="center"/>
             </w:pPr>
             <w:r>
-              <w:t>Dobré jako první krok.</w:t>
+              <w:t>Command Center props</w:t>
+            </w:r>
+          </w:p>
+        </w:tc>
+        <w:tc>
+          <w:tcPr>
+            <w:tcW w:type="dxa" w:w="2600"/>
+            <w:tcMar>
+              <w:top w:w="80" w:type="dxa"/>
+              <w:start w:w="120" w:type="dxa"/>
+              <w:bottom w:w="80" w:type="dxa"/>
+              <w:end w:w="120" w:type="dxa"/>
+            </w:tcMar>
+            <w:vAlign w:val="center"/>
+          </w:tcPr>
+          <w:p>
+            <w:pPr>
+              <w:spacing w:after="0" w:line="264" w:lineRule="auto"/>
+              <w:jc w:val="left"/>
+            </w:pPr>
+            <w:r>
+              <w:t>Otevřené relevantní úkoly se zobrazí v Command Center.</w:t>
+            </w:r>
+          </w:p>
+        </w:tc>
+        <w:tc>
+          <w:tcPr>
+            <w:tcW w:type="dxa" w:w="5160"/>
+            <w:tcMar>
+              <w:top w:w="80" w:type="dxa"/>
+              <w:start w:w="120" w:type="dxa"/>
+              <w:bottom w:w="80" w:type="dxa"/>
+              <w:end w:w="120" w:type="dxa"/>
+            </w:tcMar>
+            <w:vAlign w:val="center"/>
+          </w:tcPr>
+          <w:p>
+            <w:pPr>
+              <w:spacing w:after="0" w:line="264" w:lineRule="auto"/>
+              <w:jc w:val="left"/>
+            </w:pPr>
+            <w:r>
+              <w:t>Command Center má agregovat, co dnes vyžaduje akci.</w:t>
             </w:r>
           </w:p>
         </w:tc>
@@ -762,7 +806,7 @@
       <w:tr>
         <w:tc>
           <w:tcPr>
-            <w:tcW w:type="dxa" w:w="900"/>
+            <w:tcW w:type="dxa" w:w="1600"/>
             <w:tcMar>
               <w:top w:w="80" w:type="dxa"/>
               <w:start w:w="120" w:type="dxa"/>
@@ -777,13 +821,13 @@
               <w:jc w:val="center"/>
             </w:pPr>
             <w:r>
-              <w:t>B</w:t>
+              <w:t>Podúkoly</w:t>
             </w:r>
           </w:p>
         </w:tc>
         <w:tc>
           <w:tcPr>
-            <w:tcW w:type="dxa" w:w="2450"/>
+            <w:tcW w:type="dxa" w:w="2600"/>
             <w:tcMar>
               <w:top w:w="80" w:type="dxa"/>
               <w:start w:w="120" w:type="dxa"/>
@@ -798,13 +842,13 @@
               <w:jc w:val="left"/>
             </w:pPr>
             <w:r>
-              <w:t>Samostatná Todo aplikace nad stejným task core.</w:t>
+              <w:t>Podúkoly jsou součást modelu MVP, ne budoucí nice-to-have.</w:t>
             </w:r>
           </w:p>
         </w:tc>
         <w:tc>
           <w:tcPr>
-            <w:tcW w:type="dxa" w:w="2050"/>
+            <w:tcW w:type="dxa" w:w="5160"/>
             <w:tcMar>
               <w:top w:w="80" w:type="dxa"/>
               <w:start w:w="120" w:type="dxa"/>
@@ -819,13 +863,36 @@
               <w:jc w:val="left"/>
             </w:pPr>
             <w:r>
-              <w:t>Jedno backendové jádro, různé klienty, čistá cesta k mobilu.</w:t>
+              <w:t>Bez podúkolů modul nebude dostatečně silný pro reálné pracovní úkoly.</w:t>
+            </w:r>
+          </w:p>
+        </w:tc>
+      </w:tr>
+      <w:tr>
+        <w:tc>
+          <w:tcPr>
+            <w:tcW w:type="dxa" w:w="1600"/>
+            <w:tcMar>
+              <w:top w:w="80" w:type="dxa"/>
+              <w:start w:w="120" w:type="dxa"/>
+              <w:bottom w:w="80" w:type="dxa"/>
+              <w:end w:w="120" w:type="dxa"/>
+            </w:tcMar>
+            <w:vAlign w:val="center"/>
+          </w:tcPr>
+          <w:p>
+            <w:pPr>
+              <w:spacing w:after="0" w:line="264" w:lineRule="auto"/>
+              <w:jc w:val="center"/>
+            </w:pPr>
+            <w:r>
+              <w:t>Inspirace, ne kopie</w:t>
             </w:r>
           </w:p>
         </w:tc>
         <w:tc>
           <w:tcPr>
-            <w:tcW w:type="dxa" w:w="2300"/>
+            <w:tcW w:type="dxa" w:w="2600"/>
             <w:tcMar>
               <w:top w:w="80" w:type="dxa"/>
               <w:start w:w="120" w:type="dxa"/>
@@ -840,57 +907,13 @@
               <w:jc w:val="left"/>
             </w:pPr>
             <w:r>
-              <w:t>Vyžaduje pečlivý scope model, auth a sync kontrakty.</w:t>
+              <w:t>UX bere vzory z Todoist/Microsoft To Do, ale drží Tender-Flow kontext.</w:t>
             </w:r>
           </w:p>
         </w:tc>
         <w:tc>
           <w:tcPr>
-            <w:tcW w:type="dxa" w:w="1660"/>
-            <w:tcMar>
-              <w:top w:w="80" w:type="dxa"/>
-              <w:start w:w="120" w:type="dxa"/>
-              <w:bottom w:w="80" w:type="dxa"/>
-              <w:end w:w="120" w:type="dxa"/>
-            </w:tcMar>
-            <w:vAlign w:val="center"/>
-          </w:tcPr>
-          <w:p>
-            <w:pPr>
-              <w:spacing w:after="0" w:line="264" w:lineRule="auto"/>
-              <w:jc w:val="center"/>
-            </w:pPr>
-            <w:r>
-              <w:t>Doporučená hlavní cesta.</w:t>
-            </w:r>
-          </w:p>
-        </w:tc>
-      </w:tr>
-      <w:tr>
-        <w:tc>
-          <w:tcPr>
-            <w:tcW w:type="dxa" w:w="900"/>
-            <w:tcMar>
-              <w:top w:w="80" w:type="dxa"/>
-              <w:start w:w="120" w:type="dxa"/>
-              <w:bottom w:w="80" w:type="dxa"/>
-              <w:end w:w="120" w:type="dxa"/>
-            </w:tcMar>
-            <w:vAlign w:val="center"/>
-          </w:tcPr>
-          <w:p>
-            <w:pPr>
-              <w:spacing w:after="0" w:line="264" w:lineRule="auto"/>
-              <w:jc w:val="center"/>
-            </w:pPr>
-            <w:r>
-              <w:t>C</w:t>
-            </w:r>
-          </w:p>
-        </w:tc>
-        <w:tc>
-          <w:tcPr>
-            <w:tcW w:type="dxa" w:w="2450"/>
+            <w:tcW w:type="dxa" w:w="5160"/>
             <w:tcMar>
               <w:top w:w="80" w:type="dxa"/>
               <w:start w:w="120" w:type="dxa"/>
@@ -905,177 +928,7 @@
               <w:jc w:val="left"/>
             </w:pPr>
             <w:r>
-              <w:t>Napojit Tender-Flow jen na externí Todoist/Microsoft To Do/Apple Reminders.</w:t>
-            </w:r>
-          </w:p>
-        </w:tc>
-        <w:tc>
-          <w:tcPr>
-            <w:tcW w:type="dxa" w:w="2050"/>
-            <w:tcMar>
-              <w:top w:w="80" w:type="dxa"/>
-              <w:start w:w="120" w:type="dxa"/>
-              <w:bottom w:w="80" w:type="dxa"/>
-              <w:end w:w="120" w:type="dxa"/>
-            </w:tcMar>
-            <w:vAlign w:val="center"/>
-          </w:tcPr>
-          <w:p>
-            <w:pPr>
-              <w:spacing w:after="0" w:line="264" w:lineRule="auto"/>
-              <w:jc w:val="left"/>
-            </w:pPr>
-            <w:r>
-              <w:t>Rychlá adopce existujících návyků uživatele.</w:t>
-            </w:r>
-          </w:p>
-        </w:tc>
-        <w:tc>
-          <w:tcPr>
-            <w:tcW w:type="dxa" w:w="2300"/>
-            <w:tcMar>
-              <w:top w:w="80" w:type="dxa"/>
-              <w:start w:w="120" w:type="dxa"/>
-              <w:bottom w:w="80" w:type="dxa"/>
-              <w:end w:w="120" w:type="dxa"/>
-            </w:tcMar>
-            <w:vAlign w:val="center"/>
-          </w:tcPr>
-          <w:p>
-            <w:pPr>
-              <w:spacing w:after="0" w:line="264" w:lineRule="auto"/>
-              <w:jc w:val="left"/>
-            </w:pPr>
-            <w:r>
-              <w:t>Vendor lock-in, OAuth/token bezpečnost, konflikty a limity API.</w:t>
-            </w:r>
-          </w:p>
-        </w:tc>
-        <w:tc>
-          <w:tcPr>
-            <w:tcW w:type="dxa" w:w="1660"/>
-            <w:tcMar>
-              <w:top w:w="80" w:type="dxa"/>
-              <w:start w:w="120" w:type="dxa"/>
-              <w:bottom w:w="80" w:type="dxa"/>
-              <w:end w:w="120" w:type="dxa"/>
-            </w:tcMar>
-            <w:vAlign w:val="center"/>
-          </w:tcPr>
-          <w:p>
-            <w:pPr>
-              <w:spacing w:after="0" w:line="264" w:lineRule="auto"/>
-              <w:jc w:val="center"/>
-            </w:pPr>
-            <w:r>
-              <w:t>Až jako konektorová vrstva V2/V3.</w:t>
-            </w:r>
-          </w:p>
-        </w:tc>
-      </w:tr>
-      <w:tr>
-        <w:tc>
-          <w:tcPr>
-            <w:tcW w:type="dxa" w:w="900"/>
-            <w:tcMar>
-              <w:top w:w="80" w:type="dxa"/>
-              <w:start w:w="120" w:type="dxa"/>
-              <w:bottom w:w="80" w:type="dxa"/>
-              <w:end w:w="120" w:type="dxa"/>
-            </w:tcMar>
-            <w:vAlign w:val="center"/>
-          </w:tcPr>
-          <w:p>
-            <w:pPr>
-              <w:spacing w:after="0" w:line="264" w:lineRule="auto"/>
-              <w:jc w:val="center"/>
-            </w:pPr>
-            <w:r>
-              <w:t>D</w:t>
-            </w:r>
-          </w:p>
-        </w:tc>
-        <w:tc>
-          <w:tcPr>
-            <w:tcW w:type="dxa" w:w="2450"/>
-            <w:tcMar>
-              <w:top w:w="80" w:type="dxa"/>
-              <w:start w:w="120" w:type="dxa"/>
-              <w:bottom w:w="80" w:type="dxa"/>
-              <w:end w:w="120" w:type="dxa"/>
-            </w:tcMar>
-            <w:vAlign w:val="center"/>
-          </w:tcPr>
-          <w:p>
-            <w:pPr>
-              <w:spacing w:after="0" w:line="264" w:lineRule="auto"/>
-              <w:jc w:val="left"/>
-            </w:pPr>
-            <w:r>
-              <w:t>Úplně nová nativní mobilní aplikace od nuly.</w:t>
-            </w:r>
-          </w:p>
-        </w:tc>
-        <w:tc>
-          <w:tcPr>
-            <w:tcW w:type="dxa" w:w="2050"/>
-            <w:tcMar>
-              <w:top w:w="80" w:type="dxa"/>
-              <w:start w:w="120" w:type="dxa"/>
-              <w:bottom w:w="80" w:type="dxa"/>
-              <w:end w:w="120" w:type="dxa"/>
-            </w:tcMar>
-            <w:vAlign w:val="center"/>
-          </w:tcPr>
-          <w:p>
-            <w:pPr>
-              <w:spacing w:after="0" w:line="264" w:lineRule="auto"/>
-              <w:jc w:val="left"/>
-            </w:pPr>
-            <w:r>
-              <w:t>Nejlepší UX v telefonu.</w:t>
-            </w:r>
-          </w:p>
-        </w:tc>
-        <w:tc>
-          <w:tcPr>
-            <w:tcW w:type="dxa" w:w="2300"/>
-            <w:tcMar>
-              <w:top w:w="80" w:type="dxa"/>
-              <w:start w:w="120" w:type="dxa"/>
-              <w:bottom w:w="80" w:type="dxa"/>
-              <w:end w:w="120" w:type="dxa"/>
-            </w:tcMar>
-            <w:vAlign w:val="center"/>
-          </w:tcPr>
-          <w:p>
-            <w:pPr>
-              <w:spacing w:after="0" w:line="264" w:lineRule="auto"/>
-              <w:jc w:val="left"/>
-            </w:pPr>
-            <w:r>
-              <w:t>Nejvyšší cena, duplicita domény, riziko odtržení od Tender-Flow.</w:t>
-            </w:r>
-          </w:p>
-        </w:tc>
-        <w:tc>
-          <w:tcPr>
-            <w:tcW w:type="dxa" w:w="1660"/>
-            <w:tcMar>
-              <w:top w:w="80" w:type="dxa"/>
-              <w:start w:w="120" w:type="dxa"/>
-              <w:bottom w:w="80" w:type="dxa"/>
-              <w:end w:w="120" w:type="dxa"/>
-            </w:tcMar>
-            <w:vAlign w:val="center"/>
-          </w:tcPr>
-          <w:p>
-            <w:pPr>
-              <w:spacing w:after="0" w:line="264" w:lineRule="auto"/>
-              <w:jc w:val="center"/>
-            </w:pPr>
-            <w:r>
-              <w:t>Až po ověření PWA/standalone klienta.</w:t>
+              <w:t>Cílem je známý mentální model bez vendor lock-inu.</w:t>
             </w:r>
           </w:p>
         </w:tc>
@@ -1117,9 +970,8 @@
               <w:rPr>
                 <w:b/>
                 <w:color w:val="205F3C"/>
-                <w:sz w:val="22"/>
               </w:rPr>
-              <w:t>Rozhodnutí</w:t>
+              <w:t>Doporučení</w:t>
             </w:r>
           </w:p>
           <w:p>
@@ -1127,7 +979,7 @@
               <w:spacing w:after="0" w:line="264" w:lineRule="auto"/>
             </w:pPr>
             <w:r>
-              <w:t>Vybrat variantu B jako cílovou architekturu, ale začít variantou A: nejdřív zpevnit task modul v Tender-Flow, potom z něj udělat sdílený task core a až následně vytvořit samostatný klient optimalizovaný pro telefon.</w:t>
+              <w:t>První implementační slice má být: sidebar položka TODO, Inbox, Dnes, Nadcházející, detail úkolu, podúkoly a props otevřených úkolů do Command Center. Externí synchronizace a samostatná mobilní aplikace patří až do dalších fází.</w:t>
             </w:r>
           </w:p>
         </w:tc>
@@ -1139,7 +991,7 @@
         <w:pStyle w:val="Heading1"/>
       </w:pPr>
       <w:r>
-        <w:t>4. Doporučená produktová koncepce</w:t>
+        <w:t>4. UX koncept modulu</w:t>
       </w:r>
     </w:p>
     <w:p>
@@ -1147,61 +999,7 @@
         <w:pStyle w:val="Heading2"/>
       </w:pPr>
       <w:r>
-        <w:t>4.1 Jeden task core, více klientů</w:t>
-      </w:r>
-    </w:p>
-    <w:p>
-      <w:r>
-        <w:t>Základ má být společná doména úkolů. Tender-Flow, samostatná Todo aplikace, desktop a případné externí konektory nemají mít vlastní nezávislé modely. Mají používat jeden kontrakt pro task, jednu API vrstvu a jeden bezpečnostní model.</w:t>
-      </w:r>
-    </w:p>
-    <w:p>
-      <w:pPr>
-        <w:pStyle w:val="ListNumber"/>
-        <w:spacing w:after="160" w:line="280" w:lineRule="auto"/>
-      </w:pPr>
-      <w:r>
-        <w:t>Task core v Tender-Flow: správa dat, typy, validace, RLS, query/mutation hooks, základní UI.</w:t>
-      </w:r>
-    </w:p>
-    <w:p>
-      <w:pPr>
-        <w:pStyle w:val="ListNumber"/>
-        <w:spacing w:after="160" w:line="280" w:lineRule="auto"/>
-      </w:pPr>
-      <w:r>
-        <w:t>Tender-Flow klient: úkoly svázané s projektem, nabídkou, dokumentem, smlouvou a Command Center.</w:t>
-      </w:r>
-    </w:p>
-    <w:p>
-      <w:pPr>
-        <w:pStyle w:val="ListNumber"/>
-        <w:spacing w:after="160" w:line="280" w:lineRule="auto"/>
-      </w:pPr>
-      <w:r>
-        <w:t>Solo Todo klient: rychlý inbox, dnes, plán, priority, offline-first použití v telefonu.</w:t>
-      </w:r>
-    </w:p>
-    <w:p>
-      <w:pPr>
-        <w:pStyle w:val="ListNumber"/>
-        <w:spacing w:after="160" w:line="280" w:lineRule="auto"/>
-      </w:pPr>
-      <w:r>
-        <w:t>Sync/konektory: externí providery až po stabilizaci vlastního jádra.</w:t>
-      </w:r>
-    </w:p>
-    <w:p>
-      <w:pPr>
-        <w:pStyle w:val="Heading2"/>
-      </w:pPr>
-      <w:r>
-        <w:t>4.2 Osobní versus pracovní režim</w:t>
-      </w:r>
-    </w:p>
-    <w:p>
-      <w:r>
-        <w:t>Klíčové produktové pravidlo: osobní úkol a firemní úkol nesmí být jen rozdíl v UI. Musí být rozdíl v datovém rozsahu, oprávnění a auditovatelnosti.</w:t>
+        <w:t>4.1 Navigace a pohledy</w:t>
       </w:r>
     </w:p>
     <w:p>
@@ -1210,7 +1008,7 @@
         <w:spacing w:after="160" w:line="280" w:lineRule="auto"/>
       </w:pPr>
       <w:r>
-        <w:t>Personal scope: úkol patří konkrétnímu uživateli, typicky bez organization_id.</w:t>
+        <w:t>Inbox: rychlý záchyt úkolů bez termínu a bez vazby na projekt.</w:t>
       </w:r>
     </w:p>
     <w:p>
@@ -1219,7 +1017,7 @@
         <w:spacing w:after="160" w:line="280" w:lineRule="auto"/>
       </w:pPr>
       <w:r>
-        <w:t>Workspace/organization scope: úkol patří organizaci, může být přiřazen uživateli a viditelný podle role.</w:t>
+        <w:t>Dnes: úkoly s dnešním termínem a ručně připnuté úkoly pro dnešní práci.</w:t>
       </w:r>
     </w:p>
     <w:p>
@@ -1228,7 +1026,7 @@
         <w:spacing w:after="160" w:line="280" w:lineRule="auto"/>
       </w:pPr>
       <w:r>
-        <w:t>Tender context: volitelný odkaz na project_id a related_entity, aby se úkol zobrazil v kontextu tendru.</w:t>
+        <w:t>Nadcházející: časová osa podle due_at, podobně jako plán v Todoist/Microsoft To Do.</w:t>
       </w:r>
     </w:p>
     <w:p>
@@ -1237,7 +1035,69 @@
         <w:spacing w:after="160" w:line="280" w:lineRule="auto"/>
       </w:pPr>
       <w:r>
-        <w:t>Inbox: rychlý záchyt bez kontextu, později lze přiřadit projekt, termín, prioritu nebo organizaci.</w:t>
+        <w:t>Důležité: prioritní úkoly, hvězdička nebo priorita P1/P2.</w:t>
+      </w:r>
+    </w:p>
+    <w:p>
+      <w:pPr>
+        <w:pStyle w:val="ListBullet"/>
+        <w:spacing w:after="160" w:line="280" w:lineRule="auto"/>
+      </w:pPr>
+      <w:r>
+        <w:t>Hotovo: dokončené úkoly s možností znovuotevření.</w:t>
+      </w:r>
+    </w:p>
+    <w:p>
+      <w:pPr>
+        <w:pStyle w:val="ListBullet"/>
+        <w:spacing w:after="160" w:line="280" w:lineRule="auto"/>
+      </w:pPr>
+      <w:r>
+        <w:t>Kontext Tender-Flow: filtr podle project_id a related_entity, aniž by se změnilo personal vlastnictví.</w:t>
+      </w:r>
+    </w:p>
+    <w:p>
+      <w:pPr>
+        <w:pStyle w:val="Heading2"/>
+      </w:pPr>
+      <w:r>
+        <w:t>4.2 Detail úkolu</w:t>
+      </w:r>
+    </w:p>
+    <w:p>
+      <w:pPr>
+        <w:pStyle w:val="ListBullet"/>
+        <w:spacing w:after="160" w:line="280" w:lineRule="auto"/>
+      </w:pPr>
+      <w:r>
+        <w:t>Název, poznámka, termín, priorita, stav dokončení.</w:t>
+      </w:r>
+    </w:p>
+    <w:p>
+      <w:pPr>
+        <w:pStyle w:val="ListBullet"/>
+        <w:spacing w:after="160" w:line="280" w:lineRule="auto"/>
+      </w:pPr>
+      <w:r>
+        <w:t>Podúkoly jako checklist s možností přidat, přejmenovat, dokončit, smazat a změnit pořadí.</w:t>
+      </w:r>
+    </w:p>
+    <w:p>
+      <w:pPr>
+        <w:pStyle w:val="ListBullet"/>
+        <w:spacing w:after="160" w:line="280" w:lineRule="auto"/>
+      </w:pPr>
+      <w:r>
+        <w:t>Vazba na stavbu/projekt/dokument/smlouvu jako volitelný kontext.</w:t>
+      </w:r>
+    </w:p>
+    <w:p>
+      <w:pPr>
+        <w:pStyle w:val="ListBullet"/>
+        <w:spacing w:after="160" w:line="280" w:lineRule="auto"/>
+      </w:pPr>
+      <w:r>
+        <w:t>Auditové údaje pouze tam, kde pomáhají debugovat nebo řešit sync; běžný uživatel je nemá mít v hlavním UI.</w:t>
       </w:r>
     </w:p>
     <w:p>
@@ -1245,7 +1105,462 @@
         <w:pStyle w:val="Heading1"/>
       </w:pPr>
       <w:r>
-        <w:t>5. Cílová architektura</w:t>
+        <w:t>5. Datový model pro podúkoly</w:t>
+      </w:r>
+    </w:p>
+    <w:p>
+      <w:r>
+        <w:t>Podúkoly lze modelovat dvěma způsoby. Pro Tender-Flow dává největší smysl ponechat jeden typ Task a doplnit hierarchii přes parent_task_id. Tím se sjednotí dokončování, priorita, termíny, RLS i budoucí sync.</w:t>
+      </w:r>
+    </w:p>
+    <w:tbl>
+      <w:tblGrid>
+        <w:gridCol w:w="2200"/>
+        <w:gridCol w:w="7160"/>
+      </w:tblGrid>
+      <w:tblPr>
+        <w:tblStyle w:val="TableGrid"/>
+        <w:tblW w:type="dxa" w:w="9360"/>
+        <w:jc w:val="left"/>
+        <w:tblLook w:firstColumn="1" w:firstRow="1" w:lastColumn="0" w:lastRow="0" w:noHBand="0" w:noVBand="1" w:val="04A0"/>
+        <w:tblInd w:w="120" w:type="dxa"/>
+      </w:tblPr>
+      <w:tr>
+        <w:trPr>
+          <w:tblHeader w:val="true"/>
+        </w:trPr>
+        <w:tc>
+          <w:tcPr>
+            <w:tcW w:type="dxa" w:w="2200"/>
+            <w:tcMar>
+              <w:top w:w="80" w:type="dxa"/>
+              <w:start w:w="120" w:type="dxa"/>
+              <w:bottom w:w="80" w:type="dxa"/>
+              <w:end w:w="120" w:type="dxa"/>
+            </w:tcMar>
+            <w:vAlign w:val="center"/>
+            <w:shd w:fill="F2F4F7"/>
+          </w:tcPr>
+          <w:p>
+            <w:pPr>
+              <w:jc w:val="left"/>
+            </w:pPr>
+            <w:r>
+              <w:rPr>
+                <w:b/>
+                <w:color w:val="1F4D78"/>
+              </w:rPr>
+              <w:t>Pole / koncept</w:t>
+            </w:r>
+          </w:p>
+        </w:tc>
+        <w:tc>
+          <w:tcPr>
+            <w:tcW w:type="dxa" w:w="7160"/>
+            <w:tcMar>
+              <w:top w:w="80" w:type="dxa"/>
+              <w:start w:w="120" w:type="dxa"/>
+              <w:bottom w:w="80" w:type="dxa"/>
+              <w:end w:w="120" w:type="dxa"/>
+            </w:tcMar>
+            <w:vAlign w:val="center"/>
+            <w:shd w:fill="F2F4F7"/>
+          </w:tcPr>
+          <w:p>
+            <w:pPr>
+              <w:jc w:val="left"/>
+            </w:pPr>
+            <w:r>
+              <w:rPr>
+                <w:b/>
+                <w:color w:val="1F4D78"/>
+              </w:rPr>
+              <w:t>Doporučení</w:t>
+            </w:r>
+          </w:p>
+        </w:tc>
+      </w:tr>
+      <w:tr>
+        <w:tc>
+          <w:tcPr>
+            <w:tcW w:type="dxa" w:w="2200"/>
+            <w:tcMar>
+              <w:top w:w="80" w:type="dxa"/>
+              <w:start w:w="120" w:type="dxa"/>
+              <w:bottom w:w="80" w:type="dxa"/>
+              <w:end w:w="120" w:type="dxa"/>
+            </w:tcMar>
+            <w:vAlign w:val="center"/>
+          </w:tcPr>
+          <w:p>
+            <w:pPr>
+              <w:spacing w:after="0" w:line="264" w:lineRule="auto"/>
+              <w:jc w:val="left"/>
+            </w:pPr>
+            <w:r>
+              <w:t>parent_task_id</w:t>
+            </w:r>
+          </w:p>
+        </w:tc>
+        <w:tc>
+          <w:tcPr>
+            <w:tcW w:type="dxa" w:w="7160"/>
+            <w:tcMar>
+              <w:top w:w="80" w:type="dxa"/>
+              <w:start w:w="120" w:type="dxa"/>
+              <w:bottom w:w="80" w:type="dxa"/>
+              <w:end w:w="120" w:type="dxa"/>
+            </w:tcMar>
+            <w:vAlign w:val="center"/>
+          </w:tcPr>
+          <w:p>
+            <w:pPr>
+              <w:spacing w:after="0" w:line="264" w:lineRule="auto"/>
+              <w:jc w:val="left"/>
+            </w:pPr>
+            <w:r>
+              <w:t>Nullable FK na tasks.id. Root úkol má NULL, podúkol odkazuje na rodiče.</w:t>
+            </w:r>
+          </w:p>
+        </w:tc>
+      </w:tr>
+      <w:tr>
+        <w:tc>
+          <w:tcPr>
+            <w:tcW w:type="dxa" w:w="2200"/>
+            <w:tcMar>
+              <w:top w:w="80" w:type="dxa"/>
+              <w:start w:w="120" w:type="dxa"/>
+              <w:bottom w:w="80" w:type="dxa"/>
+              <w:end w:w="120" w:type="dxa"/>
+            </w:tcMar>
+            <w:vAlign w:val="center"/>
+          </w:tcPr>
+          <w:p>
+            <w:pPr>
+              <w:spacing w:after="0" w:line="264" w:lineRule="auto"/>
+              <w:jc w:val="left"/>
+            </w:pPr>
+            <w:r>
+              <w:t>sort_order</w:t>
+            </w:r>
+          </w:p>
+        </w:tc>
+        <w:tc>
+          <w:tcPr>
+            <w:tcW w:type="dxa" w:w="7160"/>
+            <w:tcMar>
+              <w:top w:w="80" w:type="dxa"/>
+              <w:start w:w="120" w:type="dxa"/>
+              <w:bottom w:w="80" w:type="dxa"/>
+              <w:end w:w="120" w:type="dxa"/>
+            </w:tcMar>
+            <w:vAlign w:val="center"/>
+          </w:tcPr>
+          <w:p>
+            <w:pPr>
+              <w:spacing w:after="0" w:line="264" w:lineRule="auto"/>
+              <w:jc w:val="left"/>
+            </w:pPr>
+            <w:r>
+              <w:t>Číselné pořadí podúkolů v rámci stejného rodiče. UI nesmí spoléhat jen na created_at.</w:t>
+            </w:r>
+          </w:p>
+        </w:tc>
+      </w:tr>
+      <w:tr>
+        <w:tc>
+          <w:tcPr>
+            <w:tcW w:type="dxa" w:w="2200"/>
+            <w:tcMar>
+              <w:top w:w="80" w:type="dxa"/>
+              <w:start w:w="120" w:type="dxa"/>
+              <w:bottom w:w="80" w:type="dxa"/>
+              <w:end w:w="120" w:type="dxa"/>
+            </w:tcMar>
+            <w:vAlign w:val="center"/>
+          </w:tcPr>
+          <w:p>
+            <w:pPr>
+              <w:spacing w:after="0" w:line="264" w:lineRule="auto"/>
+              <w:jc w:val="left"/>
+            </w:pPr>
+            <w:r>
+              <w:t>depth guard</w:t>
+            </w:r>
+          </w:p>
+        </w:tc>
+        <w:tc>
+          <w:tcPr>
+            <w:tcW w:type="dxa" w:w="7160"/>
+            <w:tcMar>
+              <w:top w:w="80" w:type="dxa"/>
+              <w:start w:w="120" w:type="dxa"/>
+              <w:bottom w:w="80" w:type="dxa"/>
+              <w:end w:w="120" w:type="dxa"/>
+            </w:tcMar>
+            <w:vAlign w:val="center"/>
+          </w:tcPr>
+          <w:p>
+            <w:pPr>
+              <w:spacing w:after="0" w:line="264" w:lineRule="auto"/>
+              <w:jc w:val="left"/>
+            </w:pPr>
+            <w:r>
+              <w:t>MVP doporučení: povolit jednu úroveň podúkolů. Víceúrovňový strom odložit, dokud nebude jasná potřeba.</w:t>
+            </w:r>
+          </w:p>
+        </w:tc>
+      </w:tr>
+      <w:tr>
+        <w:tc>
+          <w:tcPr>
+            <w:tcW w:type="dxa" w:w="2200"/>
+            <w:tcMar>
+              <w:top w:w="80" w:type="dxa"/>
+              <w:start w:w="120" w:type="dxa"/>
+              <w:bottom w:w="80" w:type="dxa"/>
+              <w:end w:w="120" w:type="dxa"/>
+            </w:tcMar>
+            <w:vAlign w:val="center"/>
+          </w:tcPr>
+          <w:p>
+            <w:pPr>
+              <w:spacing w:after="0" w:line="264" w:lineRule="auto"/>
+              <w:jc w:val="left"/>
+            </w:pPr>
+            <w:r>
+              <w:t>completion rollup</w:t>
+            </w:r>
+          </w:p>
+        </w:tc>
+        <w:tc>
+          <w:tcPr>
+            <w:tcW w:type="dxa" w:w="7160"/>
+            <w:tcMar>
+              <w:top w:w="80" w:type="dxa"/>
+              <w:start w:w="120" w:type="dxa"/>
+              <w:bottom w:w="80" w:type="dxa"/>
+              <w:end w:w="120" w:type="dxa"/>
+            </w:tcMar>
+            <w:vAlign w:val="center"/>
+          </w:tcPr>
+          <w:p>
+            <w:pPr>
+              <w:spacing w:after="0" w:line="264" w:lineRule="auto"/>
+              <w:jc w:val="left"/>
+            </w:pPr>
+            <w:r>
+              <w:t>Dokončení rodiče nemá automaticky mazat ani přepisovat podúkoly. UI může nabídnout dokončit vše.</w:t>
+            </w:r>
+          </w:p>
+        </w:tc>
+      </w:tr>
+      <w:tr>
+        <w:tc>
+          <w:tcPr>
+            <w:tcW w:type="dxa" w:w="2200"/>
+            <w:tcMar>
+              <w:top w:w="80" w:type="dxa"/>
+              <w:start w:w="120" w:type="dxa"/>
+              <w:bottom w:w="80" w:type="dxa"/>
+              <w:end w:w="120" w:type="dxa"/>
+            </w:tcMar>
+            <w:vAlign w:val="center"/>
+          </w:tcPr>
+          <w:p>
+            <w:pPr>
+              <w:spacing w:after="0" w:line="264" w:lineRule="auto"/>
+              <w:jc w:val="left"/>
+            </w:pPr>
+            <w:r>
+              <w:t>RLS</w:t>
+            </w:r>
+          </w:p>
+        </w:tc>
+        <w:tc>
+          <w:tcPr>
+            <w:tcW w:type="dxa" w:w="7160"/>
+            <w:tcMar>
+              <w:top w:w="80" w:type="dxa"/>
+              <w:start w:w="120" w:type="dxa"/>
+              <w:bottom w:w="80" w:type="dxa"/>
+              <w:end w:w="120" w:type="dxa"/>
+            </w:tcMar>
+            <w:vAlign w:val="center"/>
+          </w:tcPr>
+          <w:p>
+            <w:pPr>
+              <w:spacing w:after="0" w:line="264" w:lineRule="auto"/>
+              <w:jc w:val="left"/>
+            </w:pPr>
+            <w:r>
+              <w:t>Podúkol dědí bezpečnost přes created_by. Politika musí vynutit, že rodič i dítě patří stejnému uživateli.</w:t>
+            </w:r>
+          </w:p>
+        </w:tc>
+      </w:tr>
+      <w:tr>
+        <w:tc>
+          <w:tcPr>
+            <w:tcW w:type="dxa" w:w="2200"/>
+            <w:tcMar>
+              <w:top w:w="80" w:type="dxa"/>
+              <w:start w:w="120" w:type="dxa"/>
+              <w:bottom w:w="80" w:type="dxa"/>
+              <w:end w:w="120" w:type="dxa"/>
+            </w:tcMar>
+            <w:vAlign w:val="center"/>
+          </w:tcPr>
+          <w:p>
+            <w:pPr>
+              <w:spacing w:after="0" w:line="264" w:lineRule="auto"/>
+              <w:jc w:val="left"/>
+            </w:pPr>
+            <w:r>
+              <w:t>Indexy</w:t>
+            </w:r>
+          </w:p>
+        </w:tc>
+        <w:tc>
+          <w:tcPr>
+            <w:tcW w:type="dxa" w:w="7160"/>
+            <w:tcMar>
+              <w:top w:w="80" w:type="dxa"/>
+              <w:start w:w="120" w:type="dxa"/>
+              <w:bottom w:w="80" w:type="dxa"/>
+              <w:end w:w="120" w:type="dxa"/>
+            </w:tcMar>
+            <w:vAlign w:val="center"/>
+          </w:tcPr>
+          <w:p>
+            <w:pPr>
+              <w:spacing w:after="0" w:line="264" w:lineRule="auto"/>
+              <w:jc w:val="left"/>
+            </w:pPr>
+            <w:r>
+              <w:t>Index na created_by, parent_task_id, completed a due_at pro rychlé osobní pohledy a Command Center.</w:t>
+            </w:r>
+          </w:p>
+        </w:tc>
+      </w:tr>
+    </w:tbl>
+    <w:p/>
+    <w:tbl>
+      <w:tblGrid>
+        <w:gridCol w:w="9360"/>
+      </w:tblGrid>
+      <w:tblPr>
+        <w:tblStyle w:val="TableGrid"/>
+        <w:tblW w:type="dxa" w:w="9360"/>
+        <w:jc w:val="left"/>
+        <w:tblLook w:firstColumn="1" w:firstRow="1" w:lastColumn="0" w:lastRow="0" w:noHBand="0" w:noVBand="1" w:val="04A0"/>
+        <w:tblInd w:w="120" w:type="dxa"/>
+      </w:tblPr>
+      <w:tr>
+        <w:trPr>
+          <w:tblHeader w:val="true"/>
+        </w:trPr>
+        <w:tc>
+          <w:tcPr>
+            <w:tcW w:type="dxa" w:w="9360"/>
+            <w:tcMar>
+              <w:top w:w="80" w:type="dxa"/>
+              <w:start w:w="120" w:type="dxa"/>
+              <w:bottom w:w="80" w:type="dxa"/>
+              <w:end w:w="120" w:type="dxa"/>
+            </w:tcMar>
+            <w:vAlign w:val="center"/>
+            <w:shd w:fill="F4F6F9"/>
+          </w:tcPr>
+          <w:p>
+            <w:pPr>
+              <w:spacing w:after="60"/>
+            </w:pPr>
+            <w:r>
+              <w:rPr>
+                <w:b/>
+                <w:color w:val="962323"/>
+              </w:rPr>
+              <w:t>Bezpečný model podúkolů</w:t>
+            </w:r>
+          </w:p>
+          <w:p>
+            <w:pPr>
+              <w:spacing w:after="0" w:line="264" w:lineRule="auto"/>
+            </w:pPr>
+            <w:r>
+              <w:t>Nejdůležitější pravidlo: uživatel nesmí vytvořit podúkol pod cizím úkolem. Databáze i aplikační vrstva musí kontrolovat shodu created_by mezi parent_task_id a novým podúkolem.</w:t>
+            </w:r>
+          </w:p>
+        </w:tc>
+      </w:tr>
+    </w:tbl>
+    <w:p/>
+    <w:p>
+      <w:pPr>
+        <w:pStyle w:val="Heading1"/>
+      </w:pPr>
+      <w:r>
+        <w:t>6. Props do Command Center</w:t>
+      </w:r>
+    </w:p>
+    <w:p>
+      <w:r>
+        <w:t>Command Center má zobrazovat relevantní osobní úkoly ve stejné akční frontě jako derivované akce. TODO modul ale zůstává místem, kde uživatel úkoly kompletně spravuje.</w:t>
+      </w:r>
+    </w:p>
+    <w:p>
+      <w:pPr>
+        <w:pStyle w:val="ListBullet"/>
+        <w:spacing w:after="160" w:line="280" w:lineRule="auto"/>
+      </w:pPr>
+      <w:r>
+        <w:t>Root úkoly se v action queue zobrazí podle due_at, priority a stavu completed.</w:t>
+      </w:r>
+    </w:p>
+    <w:p>
+      <w:pPr>
+        <w:pStyle w:val="ListBullet"/>
+        <w:spacing w:after="160" w:line="280" w:lineRule="auto"/>
+      </w:pPr>
+      <w:r>
+        <w:t>Podúkoly se v Command Center standardně nezobrazují jako samostatné položky, aby fronta nebyla zahlcená.</w:t>
+      </w:r>
+    </w:p>
+    <w:p>
+      <w:pPr>
+        <w:pStyle w:val="ListBullet"/>
+        <w:spacing w:after="160" w:line="280" w:lineRule="auto"/>
+      </w:pPr>
+      <w:r>
+        <w:t>Výjimka: podúkol s vlastním due_at nebo P1 prioritou se může zobrazit jako samostatný signál pod rodičem.</w:t>
+      </w:r>
+    </w:p>
+    <w:p>
+      <w:pPr>
+        <w:pStyle w:val="ListBullet"/>
+        <w:spacing w:after="160" w:line="280" w:lineRule="auto"/>
+      </w:pPr>
+      <w:r>
+        <w:t>U každého úkolu v Command Center má být jasné, že jde o personal TODO položku, ne systémově derivovanou akci.</w:t>
+      </w:r>
+    </w:p>
+    <w:p>
+      <w:pPr>
+        <w:pStyle w:val="ListBullet"/>
+        <w:spacing w:after="160" w:line="280" w:lineRule="auto"/>
+      </w:pPr>
+      <w:r>
+        <w:t>Kliknutí z Command Center otevře detail úkolu v TODO modulu nebo modal, podle existujícího routing patternu.</w:t>
+      </w:r>
+    </w:p>
+    <w:p>
+      <w:pPr>
+        <w:pStyle w:val="Heading1"/>
+      </w:pPr>
+      <w:r>
+        <w:t>7. Cílová architektura</w:t>
       </w:r>
     </w:p>
     <w:tbl>
@@ -1359,7 +1674,7 @@
               <w:jc w:val="center"/>
             </w:pPr>
             <w:r>
-              <w:t>Data</w:t>
+              <w:t>Feature modul</w:t>
             </w:r>
           </w:p>
         </w:tc>
@@ -1380,7 +1695,7 @@
               <w:jc w:val="left"/>
             </w:pPr>
             <w:r>
-              <w:t>Supabase Postgres jako zdroj pravdy pro vlastní úkoly.</w:t>
+              <w:t>features/tasks jako doménový modul pro TODO.</w:t>
             </w:r>
           </w:p>
         </w:tc>
@@ -1401,7 +1716,7 @@
               <w:jc w:val="left"/>
             </w:pPr>
             <w:r>
-              <w:t>Rozšířit tasks o scope/workspace, assignee, source_app, revision/version a sync fields.</w:t>
+              <w:t>Doplnit routy, sidebar manifest, UI pohledy a detail. Nepřidávat nové soubory do legacy roots bez nutnosti.</w:t>
             </w:r>
           </w:p>
         </w:tc>
@@ -1424,7 +1739,7 @@
               <w:jc w:val="center"/>
             </w:pPr>
             <w:r>
-              <w:t>API/domain</w:t>
+              <w:t>Data/API</w:t>
             </w:r>
           </w:p>
         </w:tc>
@@ -1445,7 +1760,7 @@
               <w:jc w:val="left"/>
             </w:pPr>
             <w:r>
-              <w:t>Sdílené task služby a typy.</w:t>
+              <w:t>Supabase tasks jako zdroj pravdy.</w:t>
             </w:r>
           </w:p>
         </w:tc>
@@ -1466,7 +1781,7 @@
               <w:jc w:val="left"/>
             </w:pPr>
             <w:r>
-              <w:t>Udržet v features/tasks a infra provider vrstvě; nepřenášet server-only logiku do web UI.</w:t>
+              <w:t>Rozšířit migrací o parent_task_id a sort_order. Zachovat personal RLS.</w:t>
             </w:r>
           </w:p>
         </w:tc>
@@ -1489,7 +1804,7 @@
               <w:jc w:val="center"/>
             </w:pPr>
             <w:r>
-              <w:t>Tender-Flow UI</w:t>
+              <w:t>UI</w:t>
             </w:r>
           </w:p>
         </w:tc>
@@ -1510,7 +1825,7 @@
               <w:jc w:val="left"/>
             </w:pPr>
             <w:r>
-              <w:t>Kontextové úkoly, Command Center, Calendar.</w:t>
+              <w:t>Samostatná stránka TODO s pohledy Inbox/Dnes/Nadcházející/Hotovo.</w:t>
             </w:r>
           </w:p>
         </w:tc>
@@ -1531,7 +1846,7 @@
               <w:jc w:val="left"/>
             </w:pPr>
             <w:r>
-              <w:t>Zachovat existující integrace a postupně doplnit filtry, Inbox a Today.</w:t>
+              <w:t>Inspirovat se Todoist/Microsoft To Do: rychlé pořizování, klávesnice, čistý seznam, detail panel.</w:t>
             </w:r>
           </w:p>
         </w:tc>
@@ -1554,7 +1869,7 @@
               <w:jc w:val="center"/>
             </w:pPr>
             <w:r>
-              <w:t>Solo klient</w:t>
+              <w:t>Command Center</w:t>
             </w:r>
           </w:p>
         </w:tc>
@@ -1575,7 +1890,7 @@
               <w:jc w:val="left"/>
             </w:pPr>
             <w:r>
-              <w:t>Telefonní rychlý klient nad stejným API.</w:t>
+              <w:t>Konzument otevřených osobních úkolů.</w:t>
             </w:r>
           </w:p>
         </w:tc>
@@ -1596,7 +1911,7 @@
               <w:jc w:val="left"/>
             </w:pPr>
             <w:r>
-              <w:t>Začít jako PWA/responzivní web; nativní app až po ověření návyků.</w:t>
+              <w:t>Napojení přes existující actionQueueMerge a useCalendarData, bez přímého vlastnictví TODO logiky.</w:t>
             </w:r>
           </w:p>
         </w:tc>
@@ -1619,7 +1934,7 @@
               <w:jc w:val="center"/>
             </w:pPr>
             <w:r>
-              <w:t>Sync engine</w:t>
+              <w:t>Budoucí sync</w:t>
             </w:r>
           </w:p>
         </w:tc>
@@ -1640,7 +1955,7 @@
               <w:jc w:val="left"/>
             </w:pPr>
             <w:r>
-              <w:t>Idempotentní synchronizace mezi klienty a později externími providery.</w:t>
+              <w:t>Externí providery až po stabilizaci interního modulu.</w:t>
             </w:r>
           </w:p>
         </w:tc>
@@ -1661,7 +1976,7 @@
               <w:jc w:val="left"/>
             </w:pPr>
             <w:r>
-              <w:t>Použít server-side job/Edge Function pro externí OAuth a webhooks; klient nesmí držet provider tokeny.</w:t>
+              <w:t>OAuth tokeny pouze server-side; žádné refresh tokeny v browseru ani desktop rendereru.</w:t>
             </w:r>
           </w:p>
         </w:tc>
@@ -1679,7 +1994,7 @@
         <w:spacing w:after="160" w:line="280" w:lineRule="auto"/>
       </w:pPr>
       <w:r>
-        <w:t>Uživatel vytvoří úkol v telefonu, Tender-Flow nebo desktopu.</w:t>
+        <w:t>Uživatel vytvoří úkol v TODO modulu nebo quick-add vstupu.</w:t>
       </w:r>
     </w:p>
     <w:p>
@@ -1688,7 +2003,7 @@
         <w:spacing w:after="160" w:line="280" w:lineRule="auto"/>
       </w:pPr>
       <w:r>
-        <w:t>Klient zapíše změnu přes jednotnou mutation vrstvu do Supabase.</w:t>
+        <w:t>Pokud jde o podúkol, klient pošle parent_task_id a sort_order.</w:t>
       </w:r>
     </w:p>
     <w:p>
@@ -1697,7 +2012,7 @@
         <w:spacing w:after="160" w:line="280" w:lineRule="auto"/>
       </w:pPr>
       <w:r>
-        <w:t>RLS rozhodne, zda uživatel smí číst nebo měnit konkrétní úkol.</w:t>
+        <w:t>Supabase RLS a DB validace ověří, že úkol i rodič patří stejnému uživateli.</w:t>
       </w:r>
     </w:p>
     <w:p>
@@ -1706,7 +2021,7 @@
         <w:spacing w:after="160" w:line="280" w:lineRule="auto"/>
       </w:pPr>
       <w:r>
-        <w:t>React Query / realtime / pull refresh obnoví ostatní klienty.</w:t>
+        <w:t>React Query invaliduje osobní task query a Command Center signály.</w:t>
       </w:r>
     </w:p>
     <w:p>
@@ -1715,7 +2030,7 @@
         <w:spacing w:after="160" w:line="280" w:lineRule="auto"/>
       </w:pPr>
       <w:r>
-        <w:t>Pokud je úkol napojený na externí provider, sync engine provede idempotentní export/import a uloží sync_status.</w:t>
+        <w:t>Command Center přepočítá akční frontu a zobrazí otevřené relevantní úkoly.</w:t>
       </w:r>
     </w:p>
     <w:p>
@@ -1723,322 +2038,7 @@
         <w:pStyle w:val="Heading1"/>
       </w:pPr>
       <w:r>
-        <w:t>6. Synchronizace</w:t>
-      </w:r>
-    </w:p>
-    <w:p>
-      <w:pPr>
-        <w:pStyle w:val="Heading2"/>
-      </w:pPr>
-      <w:r>
-        <w:t>6.1 Vlastní klienty</w:t>
-      </w:r>
-    </w:p>
-    <w:p>
-      <w:r>
-        <w:t>Pro vlastní web, desktop a mobil/PWA klienty by neměla existovat složitá peer-to-peer synchronizace. Zdrojem pravdy má být Supabase. Klienti synchronizují přes pull/realtime a řeší offline frontu lokálně jen jako optimalizaci.</w:t>
-      </w:r>
-    </w:p>
-    <w:p>
-      <w:pPr>
-        <w:pStyle w:val="ListBullet"/>
-        <w:spacing w:after="160" w:line="280" w:lineRule="auto"/>
-      </w:pPr>
-      <w:r>
-        <w:t>Každá mutace musí být idempotentní nebo bezpečně opakovatelná.</w:t>
-      </w:r>
-    </w:p>
-    <w:p>
-      <w:pPr>
-        <w:pStyle w:val="ListBullet"/>
-        <w:spacing w:after="160" w:line="280" w:lineRule="auto"/>
-      </w:pPr>
-      <w:r>
-        <w:t>Task má mít updated_at a ideálně revision/version pro detekci konfliktů.</w:t>
-      </w:r>
-    </w:p>
-    <w:p>
-      <w:pPr>
-        <w:pStyle w:val="ListBullet"/>
-        <w:spacing w:after="160" w:line="280" w:lineRule="auto"/>
-      </w:pPr>
-      <w:r>
-        <w:t>Offline změny se ukládají do lokální fronty a po připojení se posílají v pořadí.</w:t>
-      </w:r>
-    </w:p>
-    <w:p>
-      <w:pPr>
-        <w:pStyle w:val="ListBullet"/>
-        <w:spacing w:after="160" w:line="280" w:lineRule="auto"/>
-      </w:pPr>
-      <w:r>
-        <w:t>Konflikt se řeší pravidlem: dokončení úkolu je silnější než změna poznámky, novější textová změna vyžaduje merge nebo explicitní volbu.</w:t>
-      </w:r>
-    </w:p>
-    <w:p>
-      <w:pPr>
-        <w:pStyle w:val="Heading2"/>
-      </w:pPr>
-      <w:r>
-        <w:t>6.2 Externí task managery</w:t>
-      </w:r>
-    </w:p>
-    <w:p>
-      <w:r>
-        <w:t>Externí integrace mají být druhá fáze. Existující sloupce external_provider a external_id jsou dobrý základ, ale samy o sobě neřeší OAuth, konflikty, webhooky ani mazání.</w:t>
-      </w:r>
-    </w:p>
-    <w:tbl>
-      <w:tblGrid>
-        <w:gridCol w:w="2200"/>
-        <w:gridCol w:w="7160"/>
-      </w:tblGrid>
-      <w:tblPr>
-        <w:tblStyle w:val="TableGrid"/>
-        <w:tblW w:type="dxa" w:w="9360"/>
-        <w:jc w:val="left"/>
-        <w:tblLook w:firstColumn="1" w:firstRow="1" w:lastColumn="0" w:lastRow="0" w:noHBand="0" w:noVBand="1" w:val="04A0"/>
-        <w:tblInd w:w="120" w:type="dxa"/>
-      </w:tblPr>
-      <w:tr>
-        <w:trPr>
-          <w:tblHeader w:val="true"/>
-        </w:trPr>
-        <w:tc>
-          <w:tcPr>
-            <w:tcW w:type="dxa" w:w="2200"/>
-            <w:tcMar>
-              <w:top w:w="80" w:type="dxa"/>
-              <w:start w:w="120" w:type="dxa"/>
-              <w:bottom w:w="80" w:type="dxa"/>
-              <w:end w:w="120" w:type="dxa"/>
-            </w:tcMar>
-            <w:vAlign w:val="center"/>
-            <w:shd w:fill="F2F4F7"/>
-          </w:tcPr>
-          <w:p>
-            <w:pPr>
-              <w:jc w:val="left"/>
-            </w:pPr>
-            <w:r>
-              <w:rPr>
-                <w:b/>
-                <w:color w:val="1F4D78"/>
-              </w:rPr>
-              <w:t>Téma</w:t>
-            </w:r>
-          </w:p>
-        </w:tc>
-        <w:tc>
-          <w:tcPr>
-            <w:tcW w:type="dxa" w:w="7160"/>
-            <w:tcMar>
-              <w:top w:w="80" w:type="dxa"/>
-              <w:start w:w="120" w:type="dxa"/>
-              <w:bottom w:w="80" w:type="dxa"/>
-              <w:end w:w="120" w:type="dxa"/>
-            </w:tcMar>
-            <w:vAlign w:val="center"/>
-            <w:shd w:fill="F2F4F7"/>
-          </w:tcPr>
-          <w:p>
-            <w:pPr>
-              <w:jc w:val="left"/>
-            </w:pPr>
-            <w:r>
-              <w:rPr>
-                <w:b/>
-                <w:color w:val="1F4D78"/>
-              </w:rPr>
-              <w:t>Doporučení</w:t>
-            </w:r>
-          </w:p>
-        </w:tc>
-      </w:tr>
-      <w:tr>
-        <w:tc>
-          <w:tcPr>
-            <w:tcW w:type="dxa" w:w="2200"/>
-            <w:tcMar>
-              <w:top w:w="80" w:type="dxa"/>
-              <w:start w:w="120" w:type="dxa"/>
-              <w:bottom w:w="80" w:type="dxa"/>
-              <w:end w:w="120" w:type="dxa"/>
-            </w:tcMar>
-            <w:vAlign w:val="center"/>
-          </w:tcPr>
-          <w:p>
-            <w:pPr>
-              <w:spacing w:after="0" w:line="264" w:lineRule="auto"/>
-              <w:jc w:val="left"/>
-            </w:pPr>
-            <w:r>
-              <w:t>OAuth tokeny</w:t>
-            </w:r>
-          </w:p>
-        </w:tc>
-        <w:tc>
-          <w:tcPr>
-            <w:tcW w:type="dxa" w:w="7160"/>
-            <w:tcMar>
-              <w:top w:w="80" w:type="dxa"/>
-              <w:start w:w="120" w:type="dxa"/>
-              <w:bottom w:w="80" w:type="dxa"/>
-              <w:end w:w="120" w:type="dxa"/>
-            </w:tcMar>
-            <w:vAlign w:val="center"/>
-          </w:tcPr>
-          <w:p>
-            <w:pPr>
-              <w:spacing w:after="0" w:line="264" w:lineRule="auto"/>
-              <w:jc w:val="left"/>
-            </w:pPr>
-            <w:r>
-              <w:t>Ukládat server-side, šifrovat, nikdy neposílat refresh token do browseru ani desktop rendereru.</w:t>
-            </w:r>
-          </w:p>
-        </w:tc>
-      </w:tr>
-      <w:tr>
-        <w:tc>
-          <w:tcPr>
-            <w:tcW w:type="dxa" w:w="2200"/>
-            <w:tcMar>
-              <w:top w:w="80" w:type="dxa"/>
-              <w:start w:w="120" w:type="dxa"/>
-              <w:bottom w:w="80" w:type="dxa"/>
-              <w:end w:w="120" w:type="dxa"/>
-            </w:tcMar>
-            <w:vAlign w:val="center"/>
-          </w:tcPr>
-          <w:p>
-            <w:pPr>
-              <w:spacing w:after="0" w:line="264" w:lineRule="auto"/>
-              <w:jc w:val="left"/>
-            </w:pPr>
-            <w:r>
-              <w:t>Směr synchronizace</w:t>
-            </w:r>
-          </w:p>
-        </w:tc>
-        <w:tc>
-          <w:tcPr>
-            <w:tcW w:type="dxa" w:w="7160"/>
-            <w:tcMar>
-              <w:top w:w="80" w:type="dxa"/>
-              <w:start w:w="120" w:type="dxa"/>
-              <w:bottom w:w="80" w:type="dxa"/>
-              <w:end w:w="120" w:type="dxa"/>
-            </w:tcMar>
-            <w:vAlign w:val="center"/>
-          </w:tcPr>
-          <w:p>
-            <w:pPr>
-              <w:spacing w:after="0" w:line="264" w:lineRule="auto"/>
-              <w:jc w:val="left"/>
-            </w:pPr>
-            <w:r>
-              <w:t>Nejdřív jednosměrný export z Tender-Flow do provideru; obousměrný sync až po metrikách a testech.</w:t>
-            </w:r>
-          </w:p>
-        </w:tc>
-      </w:tr>
-      <w:tr>
-        <w:tc>
-          <w:tcPr>
-            <w:tcW w:type="dxa" w:w="2200"/>
-            <w:tcMar>
-              <w:top w:w="80" w:type="dxa"/>
-              <w:start w:w="120" w:type="dxa"/>
-              <w:bottom w:w="80" w:type="dxa"/>
-              <w:end w:w="120" w:type="dxa"/>
-            </w:tcMar>
-            <w:vAlign w:val="center"/>
-          </w:tcPr>
-          <w:p>
-            <w:pPr>
-              <w:spacing w:after="0" w:line="264" w:lineRule="auto"/>
-              <w:jc w:val="left"/>
-            </w:pPr>
-            <w:r>
-              <w:t>Konflikty</w:t>
-            </w:r>
-          </w:p>
-        </w:tc>
-        <w:tc>
-          <w:tcPr>
-            <w:tcW w:type="dxa" w:w="7160"/>
-            <w:tcMar>
-              <w:top w:w="80" w:type="dxa"/>
-              <w:start w:w="120" w:type="dxa"/>
-              <w:bottom w:w="80" w:type="dxa"/>
-              <w:end w:w="120" w:type="dxa"/>
-            </w:tcMar>
-            <w:vAlign w:val="center"/>
-          </w:tcPr>
-          <w:p>
-            <w:pPr>
-              <w:spacing w:after="0" w:line="264" w:lineRule="auto"/>
-              <w:jc w:val="left"/>
-            </w:pPr>
-            <w:r>
-              <w:t>Udržovat provider etag/revision, last_synced_at a sync_error. Konflikt musí být viditelný v UI.</w:t>
-            </w:r>
-          </w:p>
-        </w:tc>
-      </w:tr>
-      <w:tr>
-        <w:tc>
-          <w:tcPr>
-            <w:tcW w:type="dxa" w:w="2200"/>
-            <w:tcMar>
-              <w:top w:w="80" w:type="dxa"/>
-              <w:start w:w="120" w:type="dxa"/>
-              <w:bottom w:w="80" w:type="dxa"/>
-              <w:end w:w="120" w:type="dxa"/>
-            </w:tcMar>
-            <w:vAlign w:val="center"/>
-          </w:tcPr>
-          <w:p>
-            <w:pPr>
-              <w:spacing w:after="0" w:line="264" w:lineRule="auto"/>
-              <w:jc w:val="left"/>
-            </w:pPr>
-            <w:r>
-              <w:t>Mazání</w:t>
-            </w:r>
-          </w:p>
-        </w:tc>
-        <w:tc>
-          <w:tcPr>
-            <w:tcW w:type="dxa" w:w="7160"/>
-            <w:tcMar>
-              <w:top w:w="80" w:type="dxa"/>
-              <w:start w:w="120" w:type="dxa"/>
-              <w:bottom w:w="80" w:type="dxa"/>
-              <w:end w:w="120" w:type="dxa"/>
-            </w:tcMar>
-            <w:vAlign w:val="center"/>
-          </w:tcPr>
-          <w:p>
-            <w:pPr>
-              <w:spacing w:after="0" w:line="264" w:lineRule="auto"/>
-              <w:jc w:val="left"/>
-            </w:pPr>
-            <w:r>
-              <w:t>Preferovat soft-delete/tombstone, aby se mazání dalo bezpečně propagovat a auditovat.</w:t>
-            </w:r>
-          </w:p>
-        </w:tc>
-      </w:tr>
-    </w:tbl>
-    <w:p/>
-    <w:p>
-      <w:pPr>
-        <w:pStyle w:val="Heading1"/>
-      </w:pPr>
-      <w:r>
-        <w:t>7. Bezpečnostní návrh</w:t>
+        <w:t>8. Bezpečnostní návrh</w:t>
       </w:r>
     </w:p>
     <w:tbl>
@@ -2076,9 +2076,8 @@
               <w:rPr>
                 <w:b/>
                 <w:color w:val="962323"/>
-                <w:sz w:val="22"/>
               </w:rPr>
-              <w:t>Bezpečnostní minimum před samostatnou aplikací</w:t>
+              <w:t>Bezpečnostní minimum</w:t>
             </w:r>
           </w:p>
           <w:p>
@@ -2086,7 +2085,7 @@
               <w:spacing w:after="0" w:line="264" w:lineRule="auto"/>
             </w:pPr>
             <w:r>
-              <w:t>Před tím, než se task core otevře samostatnému klientovi, musí být jasně uzavřené RLS politiky pro personal a organization scope, validace vstupů, rate limiting a způsob ukládání integračních tokenů. Jinak hrozí cross-tenant úniky a neoprávněné čtení pracovních úkolů mimo Tender-Flow.</w:t>
+              <w:t>Protože TODO je personal scope, bezpečnostní návrh musí být přísný a jednoduchý: žádné implicitní sdílení, žádné org-wide čtení, žádné podúkoly pod cizím rodičem a žádné obcházení RLS přes klientské filtry.</w:t>
             </w:r>
           </w:p>
         </w:tc>
@@ -2099,7 +2098,7 @@
         <w:spacing w:after="160" w:line="280" w:lineRule="auto"/>
       </w:pPr>
       <w:r>
-        <w:t>Tenant isolation: každý dotaz na tasks musí být chráněn RLS a testem, že uživatel nevidí cizí osobní ani organizační úkoly.</w:t>
+        <w:t>RLS: created_by = auth.uid() pro select/insert/update/delete root úkolů i podúkolů.</w:t>
       </w:r>
     </w:p>
     <w:p>
@@ -2108,7 +2107,7 @@
         <w:spacing w:after="160" w:line="280" w:lineRule="auto"/>
       </w:pPr>
       <w:r>
-        <w:t>Least privilege: samostatná Todo aplikace nemá dostat více oprávnění než potřebuje; citlivé Tender entity čte jen přes explicitní oprávnění.</w:t>
+        <w:t>Parent consistency: DB trigger nebo constraint-helper musí ověřit, že parent_task_id patří stejnému created_by.</w:t>
       </w:r>
     </w:p>
     <w:p>
@@ -2117,7 +2116,7 @@
         <w:spacing w:after="160" w:line="280" w:lineRule="auto"/>
       </w:pPr>
       <w:r>
-        <w:t>Token security: OAuth refresh tokeny pouze server-side, šifrovaně, s rotací a možností odpojení providera.</w:t>
+        <w:t>Tender context není oprávnění: project_id/related_entity je jen vazba, nikoli sdílení úkolu s projektem nebo organizací.</w:t>
       </w:r>
     </w:p>
     <w:p>
@@ -2126,7 +2125,7 @@
         <w:spacing w:after="160" w:line="280" w:lineRule="auto"/>
       </w:pPr>
       <w:r>
-        <w:t>Input validation: title/note délky už existují v DB; doplnit aplikační validace a ochranu proti nečekaným related_entity hodnotám.</w:t>
+        <w:t>Command Center musí používat stejné personal dotazy; nesmí mít širší service role přístup v rendereru.</w:t>
       </w:r>
     </w:p>
     <w:p>
@@ -2135,7 +2134,7 @@
         <w:spacing w:after="160" w:line="280" w:lineRule="auto"/>
       </w:pPr>
       <w:r>
-        <w:t>Auditability: u organization úkolů evidovat actor, assignee, scope změny a externí sync chyby.</w:t>
+        <w:t>Externí sync tokeny nepatří do klienta; budoucí integrace musí být server-side a auditovatelná.</w:t>
       </w:r>
     </w:p>
     <w:p>
@@ -2144,7 +2143,7 @@
         <w:spacing w:after="160" w:line="280" w:lineRule="auto"/>
       </w:pPr>
       <w:r>
-        <w:t>Privacy by design: osobní inbox nesmí automaticky zobrazovat firemním uživatelům nic, co uživatel nevložil do workspace scope.</w:t>
+        <w:t>Mazání podúkolů má být bezpečné: buď kaskáda jen v rámci stejného vlastníka, nebo soft-delete podle budoucího audit požadavku.</w:t>
       </w:r>
     </w:p>
     <w:p>
@@ -2152,7 +2151,7 @@
         <w:pStyle w:val="Heading1"/>
       </w:pPr>
       <w:r>
-        <w:t>8. Roadmapa</w:t>
+        <w:t>9. Roadmapa</w:t>
       </w:r>
     </w:p>
     <w:tbl>
@@ -2292,7 +2291,7 @@
               <w:jc w:val="center"/>
             </w:pPr>
             <w:r>
-              <w:t>0: Rozhodnutí</w:t>
+              <w:t>0: Upřesnění scope</w:t>
             </w:r>
           </w:p>
         </w:tc>
@@ -2313,7 +2312,7 @@
               <w:jc w:val="left"/>
             </w:pPr>
             <w:r>
-              <w:t>Potvrdit product stance a scope model.</w:t>
+              <w:t>Uzavřít personal TODO modul jako MVP.</w:t>
             </w:r>
           </w:p>
         </w:tc>
@@ -2334,7 +2333,7 @@
               <w:jc w:val="left"/>
             </w:pPr>
             <w:r>
-              <w:t>Tento dokument + seznam otevřených rozhodnutí.</w:t>
+              <w:t>Tento aktualizovaný dokument a seznam user stories.</w:t>
             </w:r>
           </w:p>
         </w:tc>
@@ -2355,7 +2354,7 @@
               <w:jc w:val="left"/>
             </w:pPr>
             <w:r>
-              <w:t>Shoda, že zdroj pravdy je shared task core.</w:t>
+              <w:t>Shoda: sidebar modul, personal scope, podúkoly, Command Center props.</w:t>
             </w:r>
           </w:p>
         </w:tc>
@@ -2378,7 +2377,7 @@
               <w:jc w:val="center"/>
             </w:pPr>
             <w:r>
-              <w:t>1: Zpevnit V1</w:t>
+              <w:t>1: Datový model</w:t>
             </w:r>
           </w:p>
         </w:tc>
@@ -2399,7 +2398,7 @@
               <w:jc w:val="left"/>
             </w:pPr>
             <w:r>
-              <w:t>Dokončit task UX v Tender-Flow.</w:t>
+              <w:t>Doplnit podúkoly do tasks.</w:t>
             </w:r>
           </w:p>
         </w:tc>
@@ -2420,7 +2419,7 @@
               <w:jc w:val="left"/>
             </w:pPr>
             <w:r>
-              <w:t>Inbox, Today, filtry, editace, dokončení, základní notifikace.</w:t>
+              <w:t>Migrace parent_task_id, sort_order, indexy, RLS/trigger validace.</w:t>
             </w:r>
           </w:p>
         </w:tc>
@@ -2441,7 +2440,7 @@
               <w:jc w:val="left"/>
             </w:pPr>
             <w:r>
-              <w:t>Unit testy, boundary checks, plný test run.</w:t>
+              <w:t>Negativní test: nejde vytvořit podúkol pod cizím úkolem.</w:t>
             </w:r>
           </w:p>
         </w:tc>
@@ -2464,7 +2463,7 @@
               <w:jc w:val="center"/>
             </w:pPr>
             <w:r>
-              <w:t>2: Scope model</w:t>
+              <w:t>2: TODO modul UI</w:t>
             </w:r>
           </w:p>
         </w:tc>
@@ -2485,7 +2484,7 @@
               <w:jc w:val="left"/>
             </w:pPr>
             <w:r>
-              <w:t>Oddělit personal/workspace/org tasky.</w:t>
+              <w:t>Postavit plnohodnotný sidebar modul.</w:t>
             </w:r>
           </w:p>
         </w:tc>
@@ -2506,7 +2505,7 @@
               <w:jc w:val="left"/>
             </w:pPr>
             <w:r>
-              <w:t>Migrace DB, RLS policy testy, typy a API kontrakt.</w:t>
+              <w:t>Inbox, Dnes, Nadcházející, Důležité, Hotovo, detail úkolu.</w:t>
             </w:r>
           </w:p>
         </w:tc>
@@ -2527,7 +2526,7 @@
               <w:jc w:val="left"/>
             </w:pPr>
             <w:r>
-              <w:t>Negativní RLS testy pro cross-user/cross-org přístup.</w:t>
+              <w:t>Component/integration testy a mobile viewport kontrola.</w:t>
             </w:r>
           </w:p>
         </w:tc>
@@ -2550,7 +2549,7 @@
               <w:jc w:val="center"/>
             </w:pPr>
             <w:r>
-              <w:t>3: Solo PWA</w:t>
+              <w:t>3: Podúkoly UX</w:t>
             </w:r>
           </w:p>
         </w:tc>
@@ -2571,7 +2570,7 @@
               <w:jc w:val="left"/>
             </w:pPr>
             <w:r>
-              <w:t>Telefonní klient bez nativní složitosti.</w:t>
+              <w:t>Dodat checklist workflow.</w:t>
             </w:r>
           </w:p>
         </w:tc>
@@ -2592,7 +2591,7 @@
               <w:jc w:val="left"/>
             </w:pPr>
             <w:r>
-              <w:t>Responzivní PWA s quick capture, offline frontou a loginem.</w:t>
+              <w:t>Přidání, editace, dokončení, reorder podúkolů.</w:t>
             </w:r>
           </w:p>
         </w:tc>
@@ -2613,7 +2612,7 @@
               <w:jc w:val="left"/>
             </w:pPr>
             <w:r>
-              <w:t>E2E testy mobile viewport + offline queue testy.</w:t>
+              <w:t>Unit testy modelu + UI test dokončení podúkolu.</w:t>
             </w:r>
           </w:p>
         </w:tc>
@@ -2636,7 +2635,7 @@
               <w:jc w:val="center"/>
             </w:pPr>
             <w:r>
-              <w:t>4: Sync engine</w:t>
+              <w:t>4: Command Center</w:t>
             </w:r>
           </w:p>
         </w:tc>
@@ -2657,7 +2656,7 @@
               <w:jc w:val="left"/>
             </w:pPr>
             <w:r>
-              <w:t>Externí providery jako volitelná vrstva.</w:t>
+              <w:t>Propis osobních úkolů do akční fronty.</w:t>
             </w:r>
           </w:p>
         </w:tc>
@@ -2678,7 +2677,7 @@
               <w:jc w:val="left"/>
             </w:pPr>
             <w:r>
-              <w:t>Server-side sync job, OAuth vault, sync_status UI.</w:t>
+              <w:t>Řazení podle due_at/priority, odkaz do detailu.</w:t>
             </w:r>
           </w:p>
         </w:tc>
@@ -2699,7 +2698,7 @@
               <w:jc w:val="left"/>
             </w:pPr>
             <w:r>
-              <w:t>Security review OAuth toku + konfliktové testy.</w:t>
+              <w:t>Action queue merge testy a regresní test kalendáře.</w:t>
             </w:r>
           </w:p>
         </w:tc>
@@ -2722,7 +2721,7 @@
               <w:jc w:val="center"/>
             </w:pPr>
             <w:r>
-              <w:t>5: Nativní app</w:t>
+              <w:t>5: Budoucí rozšíření</w:t>
             </w:r>
           </w:p>
         </w:tc>
@@ -2743,7 +2742,7 @@
               <w:jc w:val="left"/>
             </w:pPr>
             <w:r>
-              <w:t>Rozhodnout, zda PWA nestačí.</w:t>
+              <w:t>Vyhodnotit PWA nebo externí sync.</w:t>
             </w:r>
           </w:p>
         </w:tc>
@@ -2764,7 +2763,7 @@
               <w:jc w:val="left"/>
             </w:pPr>
             <w:r>
-              <w:t>Capacitor/React Native/Swift podle reálného využití.</w:t>
+              <w:t>Rozhodnutí podle reálného používání modulu.</w:t>
             </w:r>
           </w:p>
         </w:tc>
@@ -2785,7 +2784,7 @@
               <w:jc w:val="left"/>
             </w:pPr>
             <w:r>
-              <w:t>Produktová metrika: pravidelné používání v telefonu.</w:t>
+              <w:t>Bezpečnostní review OAuth/sync toku před implementací.</w:t>
             </w:r>
           </w:p>
         </w:tc>
@@ -2797,7 +2796,7 @@
         <w:pStyle w:val="Heading1"/>
       </w:pPr>
       <w:r>
-        <w:t>9. MVP rozsah</w:t>
+        <w:t>10. MVP rozsah</w:t>
       </w:r>
     </w:p>
     <w:p>
@@ -2805,7 +2804,7 @@
         <w:pStyle w:val="Heading2"/>
       </w:pPr>
       <w:r>
-        <w:t>9.1 MVP v Tender-Flow</w:t>
+        <w:t>10.1 Must-have</w:t>
       </w:r>
     </w:p>
     <w:p>
@@ -2814,7 +2813,7 @@
         <w:spacing w:after="160" w:line="280" w:lineRule="auto"/>
       </w:pPr>
       <w:r>
-        <w:t>Inbox pro rychlé úkoly bez projektu.</w:t>
+        <w:t>Sidebar položka TODO a routa/pohled modulu.</w:t>
       </w:r>
     </w:p>
     <w:p>
@@ -2823,7 +2822,7 @@
         <w:spacing w:after="160" w:line="280" w:lineRule="auto"/>
       </w:pPr>
       <w:r>
-        <w:t>Today/Upcoming pohled nad due_at.</w:t>
+        <w:t>Inbox, Dnes, Nadcházející, Důležité, Hotovo.</w:t>
       </w:r>
     </w:p>
     <w:p>
@@ -2832,7 +2831,7 @@
         <w:spacing w:after="160" w:line="280" w:lineRule="auto"/>
       </w:pPr>
       <w:r>
-        <w:t>Přiřazení tasku ke kontextu: project, bid, contract, document.</w:t>
+        <w:t>Rychlé přidání úkolu, editace detailu, dokončení, znovuotevření, smazání.</w:t>
       </w:r>
     </w:p>
     <w:p>
@@ -2841,7 +2840,7 @@
         <w:spacing w:after="160" w:line="280" w:lineRule="auto"/>
       </w:pPr>
       <w:r>
-        <w:t>Priorita 1-4, dokončení, znovuotevření, editace poznámky.</w:t>
+        <w:t>Podúkoly: přidat, přejmenovat, dokončit, smazat, změnit pořadí v rámci rodiče.</w:t>
       </w:r>
     </w:p>
     <w:p>
@@ -2850,15 +2849,7 @@
         <w:spacing w:after="160" w:line="280" w:lineRule="auto"/>
       </w:pPr>
       <w:r>
-        <w:t>Zobrazení tasků v Command Center a Calendaru bez duplicit.</w:t>
-      </w:r>
-    </w:p>
-    <w:p>
-      <w:pPr>
-        <w:pStyle w:val="Heading2"/>
-      </w:pPr>
-      <w:r>
-        <w:t>9.2 MVP samostatné Todo aplikace</w:t>
+        <w:t>Volitelná vazba na Tender-Flow kontext: project_id a related_entity.</w:t>
       </w:r>
     </w:p>
     <w:p>
@@ -2867,7 +2858,15 @@
         <w:spacing w:after="160" w:line="280" w:lineRule="auto"/>
       </w:pPr>
       <w:r>
-        <w:t>Rychlé přidání úkolu na telefonu do Inboxu.</w:t>
+        <w:t>Props otevřených osobních úkolů do Command Center a Calendar signálů.</w:t>
+      </w:r>
+    </w:p>
+    <w:p>
+      <w:pPr>
+        <w:pStyle w:val="Heading2"/>
+      </w:pPr>
+      <w:r>
+        <w:t>10.2 Explicitně mimo MVP</w:t>
       </w:r>
     </w:p>
     <w:p>
@@ -2876,7 +2875,7 @@
         <w:spacing w:after="160" w:line="280" w:lineRule="auto"/>
       </w:pPr>
       <w:r>
-        <w:t>Dnes, Nadcházející, Hotovo, Bez termínu.</w:t>
+        <w:t>Týmové nebo organizační sdílení úkolů.</w:t>
       </w:r>
     </w:p>
     <w:p>
@@ -2885,7 +2884,7 @@
         <w:spacing w:after="160" w:line="280" w:lineRule="auto"/>
       </w:pPr>
       <w:r>
-        <w:t>Offline fronta vytvoření/dokončení/editace.</w:t>
+        <w:t>Víceúrovňový strom podúkolů bez limitu.</w:t>
       </w:r>
     </w:p>
     <w:p>
@@ -2894,7 +2893,7 @@
         <w:spacing w:after="160" w:line="280" w:lineRule="auto"/>
       </w:pPr>
       <w:r>
-        <w:t>Jasný přepínač Personal / Tender-Flow workspace, pokud je uživatel v organizaci.</w:t>
+        <w:t>Externí obousměrný sync s Todoist/Microsoft To Do/Apple Reminders.</w:t>
       </w:r>
     </w:p>
     <w:p>
@@ -2903,7 +2902,16 @@
         <w:spacing w:after="160" w:line="280" w:lineRule="auto"/>
       </w:pPr>
       <w:r>
-        <w:t>Sdílené přihlášení přes stejný Supabase auth model.</w:t>
+        <w:t>Samostatná nativní mobilní aplikace.</w:t>
+      </w:r>
+    </w:p>
+    <w:p>
+      <w:pPr>
+        <w:pStyle w:val="ListBullet"/>
+        <w:spacing w:after="160" w:line="280" w:lineRule="auto"/>
+      </w:pPr>
+      <w:r>
+        <w:t>Automatické vytváření úkolů z každé systémové akce bez ruční kontroly.</w:t>
       </w:r>
     </w:p>
     <w:p>
@@ -2911,7 +2919,7 @@
         <w:pStyle w:val="Heading1"/>
       </w:pPr>
       <w:r>
-        <w:t>10. Testovací a kvalitativní plán</w:t>
+        <w:t>11. Testovací a kvalitativní plán</w:t>
       </w:r>
     </w:p>
     <w:tbl>
@@ -3020,7 +3028,7 @@
               <w:jc w:val="left"/>
             </w:pPr>
             <w:r>
-              <w:t>Mapování TaskRow -&gt; Task, validace vstupu, řazení action queue, konfliktové helpery.</w:t>
+              <w:t>Mapování TaskRow -&gt; Task, parent/subtask helpery, řazení podúkolů, action queue priorita.</w:t>
             </w:r>
           </w:p>
         </w:tc>
@@ -3064,7 +3072,7 @@
               <w:jc w:val="left"/>
             </w:pPr>
             <w:r>
-              <w:t>create/update/delete/list proti mockované Supabase vrstvě a React Query invalidace.</w:t>
+              <w:t>create/update/delete/list pro root úkoly i podúkoly proti mockované Supabase vrstvě.</w:t>
             </w:r>
           </w:p>
         </w:tc>
@@ -3108,7 +3116,7 @@
               <w:jc w:val="left"/>
             </w:pPr>
             <w:r>
-              <w:t>Uživatel A nečte ani nemění úkol uživatele B; organization role neuvidí mimo scope.</w:t>
+              <w:t>Uživatel A nečte, nemění a ani nepřidá podúkol pod úkol uživatele B.</w:t>
             </w:r>
           </w:p>
         </w:tc>
@@ -3131,7 +3139,7 @@
               <w:jc w:val="left"/>
             </w:pPr>
             <w:r>
-              <w:t>Sync</w:t>
+              <w:t>UI</w:t>
             </w:r>
           </w:p>
         </w:tc>
@@ -3152,7 +3160,7 @@
               <w:jc w:val="left"/>
             </w:pPr>
             <w:r>
-              <w:t>Idempotentní opakování mutací, external_id uniqueness, pending/error retry a konflikt.</w:t>
+              <w:t>Inbox/Dnes/Nadcházející/Hotovo, detail úkolu, checklist podúkolů, loading/disabled/error stavy.</w:t>
             </w:r>
           </w:p>
         </w:tc>
@@ -3175,7 +3183,7 @@
               <w:jc w:val="left"/>
             </w:pPr>
             <w:r>
-              <w:t>E2E</w:t>
+              <w:t>Command Center</w:t>
             </w:r>
           </w:p>
         </w:tc>
@@ -3196,7 +3204,7 @@
               <w:jc w:val="left"/>
             </w:pPr>
             <w:r>
-              <w:t>Mobile quick-add, offline vytvoření, návrat online, zobrazení v Tender-Flow Command Center.</w:t>
+              <w:t>Root úkoly se zobrazí správně, podúkoly nezahltí frontu, P1/due podúkol má jasné chování.</w:t>
             </w:r>
           </w:p>
         </w:tc>
@@ -3240,7 +3248,7 @@
               <w:jc w:val="left"/>
             </w:pPr>
             <w:r>
-              <w:t>npm run check:boundaries, npm run check:legacy-structure, npm run test:run a build.</w:t>
+              <w:t>npm run check:boundaries, npm run check:legacy-structure, npm run test:run a npm run build.</w:t>
             </w:r>
           </w:p>
         </w:tc>
@@ -3252,7 +3260,7 @@
         <w:pStyle w:val="Heading1"/>
       </w:pPr>
       <w:r>
-        <w:t>11. Otevřená rozhodnutí</w:t>
+        <w:t>12. Otevřená rozhodnutí</w:t>
       </w:r>
     </w:p>
     <w:p>
@@ -3261,7 +3269,7 @@
         <w:spacing w:after="160" w:line="280" w:lineRule="auto"/>
       </w:pPr>
       <w:r>
-        <w:t>Má být osobní Todo aplikace součást stejné Supabase instance, nebo oddělený projekt s federací? Doporučení: stejná instance, ale jasný scope model.</w:t>
+        <w:t>Má MVP povolit pouze jednu úroveň podúkolů? Doporučení: ano, kvůli jednoduchosti UI, RLS a Command Center props.</w:t>
       </w:r>
     </w:p>
     <w:p>
@@ -3270,7 +3278,7 @@
         <w:spacing w:after="160" w:line="280" w:lineRule="auto"/>
       </w:pPr>
       <w:r>
-        <w:t>Má organizace vidět osobní úkoly uživatele? Doporučení: nikdy implicitně; pouze explicitně převedené nebo vytvořené ve workspace scope.</w:t>
+        <w:t>Má dokončení všech podúkolů automaticky dokončit rodiče? Doporučení: ne automaticky; nabídnout akci nebo indikátor progressu.</w:t>
       </w:r>
     </w:p>
     <w:p>
@@ -3279,7 +3287,7 @@
         <w:spacing w:after="160" w:line="280" w:lineRule="auto"/>
       </w:pPr>
       <w:r>
-        <w:t>Má být první mobilní varianta PWA, nebo nativní app? Doporučení: PWA, dokud nejsou potvrzené každodenní mobilní workflow návyky.</w:t>
+        <w:t>Mají se podúkoly s vlastním termínem zobrazit v Dnes a Command Center? Doporučení: ano, ale vizuálně pod rodičem.</w:t>
       </w:r>
     </w:p>
     <w:p>
@@ -3288,7 +3296,7 @@
         <w:spacing w:after="160" w:line="280" w:lineRule="auto"/>
       </w:pPr>
       <w:r>
-        <w:t>Který externí provider jako první? Doporučení: žádný v MVP; později vybrat podle osobního reálného používání, ne podle technické atraktivity.</w:t>
+        <w:t>Má mít TODO vlastní štítky/labels jako Todoist? Doporučení: až po MVP, nejdřív priority a pohledy.</w:t>
       </w:r>
     </w:p>
     <w:p>
@@ -3297,7 +3305,7 @@
         <w:spacing w:after="160" w:line="280" w:lineRule="auto"/>
       </w:pPr>
       <w:r>
-        <w:t>Jak řešit notifikace? Doporučení: nejdřív interní reminders/due views, push až po stabilním používání.</w:t>
+        <w:t>Má být vazba na stavbu/projekt povinná? Doporučení: ne, personal Inbox musí fungovat bez kontextu.</w:t>
       </w:r>
     </w:p>
     <w:p>
@@ -3305,7 +3313,7 @@
         <w:pStyle w:val="Heading1"/>
       </w:pPr>
       <w:r>
-        <w:t>12. Praktický první krok</w:t>
+        <w:t>13. Praktický první krok</w:t>
       </w:r>
     </w:p>
     <w:tbl>
@@ -3343,7 +3351,6 @@
               <w:rPr>
                 <w:b/>
                 <w:color w:val="7A5A00"/>
-                <w:sz w:val="22"/>
               </w:rPr>
               <w:t>Nejbližší implementační krok</w:t>
             </w:r>
@@ -3353,7 +3360,7 @@
               <w:spacing w:after="0" w:line="264" w:lineRule="auto"/>
             </w:pPr>
             <w:r>
-              <w:t>Vytvořit malý produktový slice v Tender-Flow: Inbox + Today nad existující tasks tabulkou, doplnit testy pro API/hooky a ověřit, že uživateli stačí workflow pro každodenní zachytávání úkolů. Teprve po tom navrhnout solo PWA shell.</w:t>
+              <w:t>Začít datovým a UI slice: migrace pro podúkoly, personal RLS validace, sidebar registrace TODO modulu a první pohled Inbox + Dnes. Až poté napojit Command Center props, aby se nezamíchala doménová logika do agregátoru.</w:t>
             </w:r>
           </w:p>
         </w:tc>
@@ -3366,7 +3373,7 @@
         <w:spacing w:after="160" w:line="280" w:lineRule="auto"/>
       </w:pPr>
       <w:r>
-        <w:t>Sepsat konkrétní user stories pro Inbox, Today a task detail.</w:t>
+        <w:t>Sepsat user stories pro Inbox, Dnes, detail úkolu a podúkoly.</w:t>
       </w:r>
     </w:p>
     <w:p>
@@ -3375,7 +3382,7 @@
         <w:spacing w:after="160" w:line="280" w:lineRule="auto"/>
       </w:pPr>
       <w:r>
-        <w:t>Navrhnout DB rozšíření pro personal/workspace scope, ale nenasazovat ho bez RLS testů.</w:t>
+        <w:t>Navrhnout migraci parent_task_id, sort_order, indexy a bezpečnostní validaci rodiče.</w:t>
       </w:r>
     </w:p>
     <w:p>
@@ -3384,7 +3391,7 @@
         <w:spacing w:after="160" w:line="280" w:lineRule="auto"/>
       </w:pPr>
       <w:r>
-        <w:t>Doplnit testy existující tasks API a action queue merge.</w:t>
+        <w:t>Doplnit typy Task/TaskCreateInput/TaskUpdateInput o parentTaskId a sortOrder.</w:t>
       </w:r>
     </w:p>
     <w:p>
@@ -3393,7 +3400,7 @@
         <w:spacing w:after="160" w:line="280" w:lineRule="auto"/>
       </w:pPr>
       <w:r>
-        <w:t>Vyrobit první UI slice v souladu s feature boundary pravidly.</w:t>
+        <w:t>Postavit sidebar route a základní TODO modul podle feature boundary pravidel.</w:t>
       </w:r>
     </w:p>
     <w:p>
@@ -3402,7 +3409,7 @@
         <w:spacing w:after="160" w:line="280" w:lineRule="auto"/>
       </w:pPr>
       <w:r>
-        <w:t>Po používání 1-2 týdny rozhodnout, zda solo klient má být PWA nebo nativní aplikace.</w:t>
+        <w:t>Doplnit testy pro personal scope, podúkoly a props do Command Center.</w:t>
       </w:r>
     </w:p>
     <w:p>
@@ -3421,30 +3428,61 @@
     <w:p>
       <w:pPr>
         <w:pStyle w:val="ListBullet"/>
+        <w:spacing w:after="160" w:line="280" w:lineRule="auto"/>
       </w:pPr>
       <w:r>
-        <w:t>Je potvrzeno, že shared task core je zdroj pravdy.</w:t>
+        <w:t>Je potvrzeno, že TODO je personal scope, ne org/workspace modul.</w:t>
       </w:r>
     </w:p>
     <w:p>
       <w:pPr>
         <w:pStyle w:val="ListBullet"/>
+        <w:spacing w:after="160" w:line="280" w:lineRule="auto"/>
       </w:pPr>
       <w:r>
-        <w:t>Je rozhodnutý scope model: personal vs workspace vs organization.</w:t>
+        <w:t>Sidebar položka TODO je součástí návrhu navigace.</w:t>
       </w:r>
     </w:p>
     <w:p>
       <w:pPr>
         <w:pStyle w:val="ListBullet"/>
+        <w:spacing w:after="160" w:line="280" w:lineRule="auto"/>
       </w:pPr>
       <w:r>
-        <w:t>Existují RLS testy pro negativní scénáře.</w:t>
+        <w:t>Datový model má parent_task_id, sort_order a test bezpečné vazby rodič-dítě.</w:t>
       </w:r>
     </w:p>
     <w:p>
       <w:pPr>
         <w:pStyle w:val="ListBullet"/>
+        <w:spacing w:after="160" w:line="280" w:lineRule="auto"/>
+      </w:pPr>
+      <w:r>
+        <w:t>RLS brání vytvoření podúkolu pod cizím úkolem.</w:t>
+      </w:r>
+    </w:p>
+    <w:p>
+      <w:pPr>
+        <w:pStyle w:val="ListBullet"/>
+        <w:spacing w:after="160" w:line="280" w:lineRule="auto"/>
+      </w:pPr>
+      <w:r>
+        <w:t>Command Center je konzument úkolů, ne primární správce TODO modulu.</w:t>
+      </w:r>
+    </w:p>
+    <w:p>
+      <w:pPr>
+        <w:pStyle w:val="ListBullet"/>
+        <w:spacing w:after="160" w:line="280" w:lineRule="auto"/>
+      </w:pPr>
+      <w:r>
+        <w:t>Podúkoly mají jasné chování pro dokončení, řazení a zobrazení v Dnes.</w:t>
+      </w:r>
+    </w:p>
+    <w:p>
+      <w:pPr>
+        <w:pStyle w:val="ListBullet"/>
+        <w:spacing w:after="160" w:line="280" w:lineRule="auto"/>
       </w:pPr>
       <w:r>
         <w:t>UI nepřidává nové soubory do legacy freeze roots bez aktualizace snapshotu.</w:t>
@@ -3453,30 +3491,7 @@
     <w:p>
       <w:pPr>
         <w:pStyle w:val="ListBullet"/>
-      </w:pPr>
-      <w:r>
-        <w:t>Klient neukládá provider OAuth tokeny.</w:t>
-      </w:r>
-    </w:p>
-    <w:p>
-      <w:pPr>
-        <w:pStyle w:val="ListBullet"/>
-      </w:pPr>
-      <w:r>
-        <w:t>Každá nová task mutace invaliduje správné React Query klíče.</w:t>
-      </w:r>
-    </w:p>
-    <w:p>
-      <w:pPr>
-        <w:pStyle w:val="ListBullet"/>
-      </w:pPr>
-      <w:r>
-        <w:t>Mobile viewport má ověřené texty, tap targety a disabled/loading stavy.</w:t>
-      </w:r>
-    </w:p>
-    <w:p>
-      <w:pPr>
-        <w:pStyle w:val="ListBullet"/>
+        <w:spacing w:after="160" w:line="280" w:lineRule="auto"/>
       </w:pPr>
       <w:r>
         <w:t>Před PR projde test:run, check:boundaries, check:legacy-structure a build.</w:t>
@@ -3505,7 +3520,7 @@
         <w:color w:val="595959"/>
         <w:sz w:val="18"/>
       </w:rPr>
-      <w:t xml:space="preserve">Tender Flow | Todo strategie | strana </w:t>
+      <w:t xml:space="preserve">Tender Flow | TODO modul | strana </w:t>
     </w:r>
     <w:fldChar w:fldCharType="begin"/>
     <w:instrText xml:space="preserve">PAGE</w:instrText>
@@ -3878,7 +3893,7 @@
     <w:qFormat/>
     <w:rsid w:val="00FC693F"/>
     <w:pPr>
-      <w:spacing w:after="120" w:line="264" w:lineRule="auto"/>
+      <w:spacing w:before="0" w:after="120" w:line="264" w:lineRule="auto"/>
     </w:pPr>
     <w:rPr>
       <w:rFonts w:ascii="Calibri" w:hAnsi="Calibri" w:eastAsia="Calibri"/>
@@ -3941,7 +3956,7 @@
     <w:pPr>
       <w:keepNext/>
       <w:keepLines/>
-      <w:spacing w:before="320" w:after="160"/>
+      <w:spacing w:before="320" w:after="160" w:line="264" w:lineRule="auto"/>
       <w:outlineLvl w:val="0"/>
     </w:pPr>
     <w:rPr>
@@ -3965,7 +3980,7 @@
     <w:pPr>
       <w:keepNext/>
       <w:keepLines/>
-      <w:spacing w:before="240" w:after="120"/>
+      <w:spacing w:before="240" w:after="120" w:line="264" w:lineRule="auto"/>
       <w:outlineLvl w:val="1"/>
     </w:pPr>
     <w:rPr>
@@ -3989,7 +4004,7 @@
     <w:pPr>
       <w:keepNext/>
       <w:keepLines/>
-      <w:spacing w:before="160" w:after="80"/>
+      <w:spacing w:before="160" w:after="80" w:line="264" w:lineRule="auto"/>
       <w:outlineLvl w:val="2"/>
     </w:pPr>
     <w:rPr>
@@ -4231,7 +4246,7 @@
       <w:pBdr>
         <w:bottom w:val="single" w:sz="8" w:space="4" w:color="4F81BD" w:themeColor="accent1"/>
       </w:pBdr>
-      <w:spacing w:after="80" w:line="240" w:lineRule="auto"/>
+      <w:spacing w:after="80" w:line="264" w:lineRule="auto" w:before="0"/>
       <w:contextualSpacing/>
     </w:pPr>
     <w:rPr>
@@ -4270,7 +4285,7 @@
       <w:numPr>
         <w:ilvl w:val="1"/>
       </w:numPr>
-      <w:spacing w:after="320"/>
+      <w:spacing w:before="0" w:after="320" w:line="264" w:lineRule="auto"/>
     </w:pPr>
     <w:rPr>
       <w:rFonts w:asciiTheme="majorHAnsi" w:eastAsiaTheme="majorEastAsia" w:hAnsiTheme="majorHAnsi" w:cstheme="majorBidi" w:ascii="Calibri" w:hAnsi="Calibri" w:eastAsia="Calibri"/>

</xml_diff>